<commit_message>
Updates based on SCE feedback
1. Update the documentation for scorecard generation.
2. Add a description of vintages to the Notes tab of scorecards.
3. Adjust the significant figures used in the Envelope tab of scorecards.
4. Update the scorecard template based on the adjustments in items 2 and 3.
</commit_message>
<xml_diff>
--- a/ScorecardAutomation/DEER_Prototype_Scorecard_Auto_Generation.docx
+++ b/ScorecardAutomation/DEER_Prototype_Scorecard_Auto_Generation.docx
@@ -58,13 +58,10 @@
         <w:tab/>
       </w:r>
       <w:r>
-        <w:t>February 2</w:t>
-      </w:r>
-      <w:r>
-        <w:t>7</w:t>
-      </w:r>
-      <w:r>
-        <w:t>, 2026</w:t>
+        <w:t>May</w:t>
+      </w:r>
+      <w:r>
+        <w:t xml:space="preserve"> 6, 2026</w:t>
       </w:r>
     </w:p>
     <w:p>
@@ -132,6 +129,9 @@
       <w:r>
         <w:t>Automated Generation</w:t>
       </w:r>
+      <w:r>
+        <w:t xml:space="preserve"> Workflow</w:t>
+      </w:r>
     </w:p>
     <w:p>
       <w:pPr>
@@ -148,13 +148,14 @@
       <w:pPr>
         <w:pStyle w:val="Body"/>
       </w:pPr>
-      <w:proofErr w:type="gramStart"/>
-      <w:r>
-        <w:t>The CPUC</w:t>
-      </w:r>
-      <w:proofErr w:type="gramEnd"/>
-      <w:r>
-        <w:t xml:space="preserve"> established the DEER nonresidential prototype building energy models in a new EnergyPlus modeling framework in 2023. While </w:t>
+      <w:r>
+        <w:t>The CPUC established the DEER nonresidential prototype building energy models in a new</w:t>
+      </w:r>
+      <w:r>
+        <w:t>ly adopted</w:t>
+      </w:r>
+      <w:r>
+        <w:t xml:space="preserve"> EnergyPlus modeling framework in 2023. While </w:t>
       </w:r>
       <w:r>
         <w:t xml:space="preserve">this effort completely revamped </w:t>
@@ -169,7 +170,24 @@
         <w:t xml:space="preserve">DOE-2 </w:t>
       </w:r>
       <w:r>
-        <w:t xml:space="preserve">prototypes and other prototypes such as the CalBEM prototype models, </w:t>
+        <w:t xml:space="preserve">prototypes and other prototypes such as the </w:t>
+      </w:r>
+      <w:proofErr w:type="spellStart"/>
+      <w:r>
+        <w:t>CalBEM</w:t>
+      </w:r>
+      <w:proofErr w:type="spellEnd"/>
+      <w:r>
+        <w:rPr>
+          <w:rStyle w:val="FootnoteReference"/>
+        </w:rPr>
+        <w:footnoteReference w:id="2"/>
+      </w:r>
+      <w:r>
+        <w:t xml:space="preserve"> </w:t>
+      </w:r>
+      <w:r>
+        <w:t xml:space="preserve">prototype models, </w:t>
       </w:r>
       <w:r>
         <w:t xml:space="preserve">there is no </w:t>
@@ -190,7 +208,15 @@
         <w:t xml:space="preserve">DEER prototype </w:t>
       </w:r>
       <w:r>
-        <w:t>models and comparing against recent efforts to characterize the building stock such as the CalBEM prototypes.</w:t>
+        <w:t xml:space="preserve">models and comparing against recent efforts to characterize the building stock such as the </w:t>
+      </w:r>
+      <w:proofErr w:type="spellStart"/>
+      <w:r>
+        <w:t>CalBEM</w:t>
+      </w:r>
+      <w:proofErr w:type="spellEnd"/>
+      <w:r>
+        <w:t xml:space="preserve"> prototypes.</w:t>
       </w:r>
     </w:p>
     <w:p>
@@ -219,10 +245,115 @@
         <w:t xml:space="preserve">an automated process to create </w:t>
       </w:r>
       <w:r>
-        <w:t>prototype scorecards. This work was requested by the CPUC and measure developers to support measure review and development and is timed to align with PY28 and the release of the CalBEM scorecards.</w:t>
-      </w:r>
-      <w:r>
-        <w:t xml:space="preserve"> Parallel release of the DEER scorecards will enable easy comparison between the two sets of prototypes.</w:t>
+        <w:t xml:space="preserve">prototype scorecards. </w:t>
+      </w:r>
+      <w:r>
+        <w:t>A scorecard is a structured summary of a prototype model that captures the key input parameters and outputs needed to understand and evaluate the prototype.</w:t>
+      </w:r>
+      <w:r>
+        <w:t xml:space="preserve"> </w:t>
+      </w:r>
+      <w:r>
+        <w:t>These scorecards are expected to include geometry, envelope properties, thermostat settings, HVAC systems, ventilation, lighting, equipment, schedules, and energy usage results</w:t>
+      </w:r>
+      <w:r>
+        <w:t xml:space="preserve">. </w:t>
+      </w:r>
+      <w:r>
+        <w:t xml:space="preserve">By organizing this information in a standardized format, scorecards improve transparency of model inputs and outputs and provide a consistent basis for reviewing measure impacts. </w:t>
+      </w:r>
+      <w:r>
+        <w:t xml:space="preserve">This work was requested by the CPUC and measure developers to support measure review and development and is timed to align with PY28 and the release of the </w:t>
+      </w:r>
+      <w:proofErr w:type="spellStart"/>
+      <w:r>
+        <w:t>CalBEM</w:t>
+      </w:r>
+      <w:proofErr w:type="spellEnd"/>
+      <w:r>
+        <w:t xml:space="preserve"> scorecards</w:t>
+      </w:r>
+      <w:r>
+        <w:t xml:space="preserve"> (</w:t>
+      </w:r>
+      <w:hyperlink r:id="rId14" w:history="1">
+        <w:r>
+          <w:rPr>
+            <w:rStyle w:val="Hyperlink"/>
+            <w:color w:val="auto"/>
+          </w:rPr>
+          <w:t>NOR-Codes-</w:t>
+        </w:r>
+        <w:proofErr w:type="spellStart"/>
+        <w:r>
+          <w:rPr>
+            <w:rStyle w:val="Hyperlink"/>
+            <w:color w:val="auto"/>
+          </w:rPr>
+          <w:t>Stds</w:t>
+        </w:r>
+        <w:proofErr w:type="spellEnd"/>
+        <w:r>
+          <w:rPr>
+            <w:rStyle w:val="Hyperlink"/>
+            <w:color w:val="auto"/>
+          </w:rPr>
+          <w:t>/</w:t>
+        </w:r>
+        <w:proofErr w:type="spellStart"/>
+        <w:r>
+          <w:rPr>
+            <w:rStyle w:val="Hyperlink"/>
+            <w:color w:val="auto"/>
+          </w:rPr>
+          <w:t>CalBEM</w:t>
+        </w:r>
+        <w:proofErr w:type="spellEnd"/>
+        <w:r>
+          <w:rPr>
+            <w:rStyle w:val="Hyperlink"/>
+            <w:color w:val="auto"/>
+          </w:rPr>
+          <w:t>-Prototypes: California Prototypes Project</w:t>
+        </w:r>
+      </w:hyperlink>
+      <w:r>
+        <w:t>)</w:t>
+      </w:r>
+      <w:r>
+        <w:t>.</w:t>
+      </w:r>
+      <w:r>
+        <w:t xml:space="preserve"> Parallel release of the DEER scorecards will enable easy comparison between the </w:t>
+      </w:r>
+      <w:r>
+        <w:t xml:space="preserve">DEER and </w:t>
+      </w:r>
+      <w:proofErr w:type="spellStart"/>
+      <w:r>
+        <w:t>CalBEM</w:t>
+      </w:r>
+      <w:proofErr w:type="spellEnd"/>
+      <w:r>
+        <w:t xml:space="preserve"> </w:t>
+      </w:r>
+      <w:r>
+        <w:t>two sets</w:t>
+      </w:r>
+      <w:r>
+        <w:t>, as well as other prototypes</w:t>
+      </w:r>
+      <w:r>
+        <w:t xml:space="preserve"> such as the DOE prototypes</w:t>
+      </w:r>
+      <w:r>
+        <w:rPr>
+          <w:rStyle w:val="FootnoteReference"/>
+        </w:rPr>
+        <w:footnoteReference w:id="3"/>
+      </w:r>
+      <w:r>
+        <w:t>.</w:t>
       </w:r>
       <w:r>
         <w:t xml:space="preserve"> Developing and releasing an automated process for generating scorecards will allow stakeholders to update the scorecards in the future as the DEER repository continues to evolve with new measures, bug fixes and improvements. </w:t>
@@ -248,15 +379,63 @@
         <w:t>ial DEER prototype models</w:t>
       </w:r>
       <w:r>
+        <w:t xml:space="preserve"> as shown by </w:t>
+      </w:r>
+      <w:r>
+        <w:fldChar w:fldCharType="begin"/>
+      </w:r>
+      <w:r>
+        <w:instrText xml:space="preserve"> REF _Ref222919737 \h </w:instrText>
+      </w:r>
+      <w:r>
+        <w:instrText xml:space="preserve"> \* MERGEFORMAT </w:instrText>
+      </w:r>
+      <w:r>
+        <w:fldChar w:fldCharType="separate"/>
+      </w:r>
+      <w:r>
+        <w:t xml:space="preserve">Figure </w:t>
+      </w:r>
+      <w:r>
+        <w:rPr>
+          <w:noProof/>
+        </w:rPr>
+        <w:t>3</w:t>
+      </w:r>
+      <w:r>
+        <w:fldChar w:fldCharType="end"/>
+      </w:r>
+      <w:r>
         <w:t>. The project team ran each building type for two vintages, 16 climate zones and five main HVAC systems</w:t>
       </w:r>
       <w:r>
-        <w:t xml:space="preserve">. The prototype version is the DEER repository as of </w:t>
+        <w:t xml:space="preserve"> (Table A1)</w:t>
+      </w:r>
+      <w:r>
+        <w:t>. The prototype version is the DEER repository</w:t>
+      </w:r>
+      <w:r>
+        <w:rPr>
+          <w:rStyle w:val="FootnoteReference"/>
+        </w:rPr>
+        <w:footnoteReference w:id="4"/>
+      </w:r>
+      <w:r>
+        <w:t xml:space="preserve"> as of </w:t>
       </w:r>
       <w:r>
         <w:t>2/19/2026</w:t>
       </w:r>
       <w:r>
+        <w:t xml:space="preserve"> </w:t>
+      </w:r>
+      <w:r>
+        <w:t>and</w:t>
+      </w:r>
+      <w:r>
+        <w:t xml:space="preserve"> the prototypes are built for EnergyPlus v22.2.0</w:t>
+      </w:r>
+      <w:r>
         <w:t xml:space="preserve">. The scorecard format and </w:t>
       </w:r>
       <w:r>
@@ -277,7 +456,15 @@
         <w:t xml:space="preserve"> </w:t>
       </w:r>
       <w:r>
-        <w:t xml:space="preserve">sample CalBEM prototypes provided on 12/9/2025. </w:t>
+        <w:t xml:space="preserve">sample </w:t>
+      </w:r>
+      <w:proofErr w:type="spellStart"/>
+      <w:r>
+        <w:t>CalBEM</w:t>
+      </w:r>
+      <w:proofErr w:type="spellEnd"/>
+      <w:r>
+        <w:t xml:space="preserve"> prototypes provided on 12/9/2025. </w:t>
       </w:r>
       <w:r>
         <w:t>The project team made additional adjustments to the format and data fields to improve clarity and automation.</w:t>
@@ -288,6 +475,7 @@
         <w:pStyle w:val="Heading2"/>
       </w:pPr>
       <w:r>
+        <w:lastRenderedPageBreak/>
         <w:t>Methodology</w:t>
       </w:r>
     </w:p>
@@ -297,6 +485,9 @@
       </w:pPr>
       <w:r>
         <w:t>Overview of Scorecard Automated Generation</w:t>
+      </w:r>
+      <w:r>
+        <w:t xml:space="preserve"> Workflow</w:t>
       </w:r>
     </w:p>
     <w:p>
@@ -510,7 +701,6 @@
           <w:rFonts w:eastAsia="Times New Roman"/>
           <w:color w:val="auto"/>
         </w:rPr>
-        <w:lastRenderedPageBreak/>
         <w:t>P</w:t>
       </w:r>
       <w:r>
@@ -716,6 +906,9 @@
         <w:t>1</w:t>
       </w:r>
       <w:r>
+        <w:rPr>
+          <w:noProof/>
+        </w:rPr>
         <w:fldChar w:fldCharType="end"/>
       </w:r>
       <w:bookmarkEnd w:id="0"/>
@@ -776,8 +969,45 @@
       <w:r>
         <w:t xml:space="preserve">. </w:t>
       </w:r>
-      <w:r>
-        <w:t xml:space="preserve">A Python workflow then automatically extracts and sorts the generated models and runs EnergyPlus (v22.2) to produce the required outputs. For example, the </w:t>
+      <w:proofErr w:type="spellStart"/>
+      <w:r>
+        <w:t>Modelkit</w:t>
+      </w:r>
+      <w:proofErr w:type="spellEnd"/>
+      <w:r>
+        <w:rPr>
+          <w:rStyle w:val="FootnoteReference"/>
+        </w:rPr>
+        <w:footnoteReference w:id="5"/>
+      </w:r>
+      <w:r>
+        <w:t xml:space="preserve">, formerly called Params, is a free, open-source, cross-platform framework for parametric building energy modeling. </w:t>
+      </w:r>
+      <w:r>
+        <w:t xml:space="preserve">It integrates templates and scripting: templates combine static content with dynamic inputs, while scripting automates the modeling process. In this workflow, </w:t>
+      </w:r>
+      <w:proofErr w:type="spellStart"/>
+      <w:r>
+        <w:t>Modelkit</w:t>
+      </w:r>
+      <w:proofErr w:type="spellEnd"/>
+      <w:r>
+        <w:t xml:space="preserve"> creates DEER prototype variants across building types, vintages, climate zones, and main HVAC systems in a scalable modeling environment</w:t>
+      </w:r>
+      <w:r>
+        <w:t>.</w:t>
+      </w:r>
+      <w:r>
+        <w:t xml:space="preserve"> </w:t>
+      </w:r>
+      <w:r>
+        <w:t>A Python workflow then automatically extracts and sorts the generated models and runs EnergyPlus (v22.2</w:t>
+      </w:r>
+      <w:r>
+        <w:t>.0</w:t>
+      </w:r>
+      <w:r>
+        <w:t xml:space="preserve">) to produce the required outputs. For example, the </w:t>
       </w:r>
       <w:r>
         <w:rPr>
@@ -812,7 +1042,13 @@
       </w:r>
       <w:proofErr w:type="gramEnd"/>
       <w:r>
-        <w:t xml:space="preserve"> in the Python script to link the corresponding weather file to each climate zone (CZ) number for EnergyPlus simulations, as shown in </w:t>
+        <w:t xml:space="preserve"> in the Python script to link the corresponding </w:t>
+      </w:r>
+      <w:r>
+        <w:t xml:space="preserve">CZ2022 </w:t>
+      </w:r>
+      <w:r>
+        <w:t xml:space="preserve">weather file to each climate zone (CZ) number for EnergyPlus simulations, as shown in </w:t>
       </w:r>
       <w:r>
         <w:fldChar w:fldCharType="begin"/>
@@ -848,6 +1084,7 @@
         <w:rPr>
           <w:noProof/>
         </w:rPr>
+        <w:lastRenderedPageBreak/>
         <w:drawing>
           <wp:inline distT="0" distB="0" distL="0" distR="0" wp14:anchorId="0CA97E04" wp14:editId="31EE9873">
             <wp:extent cx="2600077" cy="2169804"/>
@@ -909,6 +1146,9 @@
         <w:t>2</w:t>
       </w:r>
       <w:r>
+        <w:rPr>
+          <w:noProof/>
+        </w:rPr>
         <w:fldChar w:fldCharType="end"/>
       </w:r>
       <w:bookmarkEnd w:id="1"/>
@@ -959,11 +1199,15 @@
         <w:t xml:space="preserve">, </w:t>
       </w:r>
       <w:r>
-        <w:t xml:space="preserve">to account for differences in building energy model data formats. The team organizes these extraction functions by data category and stores them in a Python </w:t>
-      </w:r>
-      <w:r>
-        <w:lastRenderedPageBreak/>
-        <w:t>script library to support modular data extraction and easier code management. These functions automatically parse EnergyPlus input (.</w:t>
+        <w:t xml:space="preserve">to account for differences in building energy model data formats. The team organizes these extraction functions by data category and stores them in a Python script library to support modular data extraction and easier code management. These functions automatically parse </w:t>
+      </w:r>
+      <w:proofErr w:type="spellStart"/>
+      <w:r>
+        <w:t>EnergyPlus</w:t>
+      </w:r>
+      <w:proofErr w:type="spellEnd"/>
+      <w:r>
+        <w:t xml:space="preserve"> input (.</w:t>
       </w:r>
       <w:proofErr w:type="spellStart"/>
       <w:r>
@@ -1031,6 +1275,7 @@
         <w:rPr>
           <w:noProof/>
         </w:rPr>
+        <w:lastRenderedPageBreak/>
         <w:drawing>
           <wp:inline distT="0" distB="0" distL="0" distR="0" wp14:anchorId="7AE940BD" wp14:editId="5885D84D">
             <wp:extent cx="2424900" cy="4198289"/>
@@ -1105,6 +1350,9 @@
         <w:t>3</w:t>
       </w:r>
       <w:r>
+        <w:rPr>
+          <w:noProof/>
+        </w:rPr>
         <w:fldChar w:fldCharType="end"/>
       </w:r>
       <w:bookmarkEnd w:id="2"/>
@@ -1146,7 +1394,24 @@
         <w:pStyle w:val="Body"/>
       </w:pPr>
       <w:r>
-        <w:t xml:space="preserve">The team groups internal EP model zones into defined zone type categories based on the original DEER prototype root files. The team uses natural language </w:t>
+        <w:t xml:space="preserve">The team groups internal </w:t>
+      </w:r>
+      <w:proofErr w:type="spellStart"/>
+      <w:r>
+        <w:t>E</w:t>
+      </w:r>
+      <w:r>
+        <w:t>nergy</w:t>
+      </w:r>
+      <w:r>
+        <w:t>P</w:t>
+      </w:r>
+      <w:r>
+        <w:t>lus</w:t>
+      </w:r>
+      <w:proofErr w:type="spellEnd"/>
+      <w:r>
+        <w:t xml:space="preserve"> model zones into defined zone type categories based on the original DEER prototype root files. The team uses natural language </w:t>
       </w:r>
       <w:proofErr w:type="gramStart"/>
       <w:r>
@@ -1154,7 +1419,25 @@
       </w:r>
       <w:proofErr w:type="gramEnd"/>
       <w:r>
-        <w:t xml:space="preserve"> names to improve readability. Python rule-based post-processing scripts automate this classification and aggregation step. After the team assigns zone types, the team aggregates key parameters by zone type. These parameters include lighting power density and plug load density. This supports consistent comparisons across zone types. The team also uses schedule identifier labels to group zone-level schedules. This makes schedule types easier to interpret</w:t>
+        <w:t xml:space="preserve"> names to improve readability. Python rule-based post-processing scripts automate this classification and aggregation step. After the team assigns zone types, the team aggregates key parameters by zone type. These parameters include </w:t>
+      </w:r>
+      <w:r>
+        <w:t xml:space="preserve">outdoor air flow rate, </w:t>
+      </w:r>
+      <w:r>
+        <w:t>lighting power density</w:t>
+      </w:r>
+      <w:r>
+        <w:t>,</w:t>
+      </w:r>
+      <w:r>
+        <w:t xml:space="preserve"> plug load density</w:t>
+      </w:r>
+      <w:r>
+        <w:t>, and gas power density</w:t>
+      </w:r>
+      <w:r>
+        <w:t>. This supports consistent comparisons across zone types. The team also uses schedule identifier labels to group zone-level schedules. This makes schedule types easier to interpret</w:t>
       </w:r>
       <w:r>
         <w:t xml:space="preserve">. Some buildings include HVAC systems beyond the main configuration. </w:t>
@@ -1168,10 +1451,22 @@
       </w:r>
       <w:proofErr w:type="spellEnd"/>
       <w:r>
-        <w:t xml:space="preserve">, the boiler and chiller system is the main heating and cooling system, but it also has a furnace and direct expansion air conditioning systems serving the computer room and dining room. </w:t>
-      </w:r>
-      <w:r>
-        <w:t>The team adds these systems to ensure the HVAC system information is complete. Dictionary-based rules identify and include these supplemental HVAC systems automatically.</w:t>
+        <w:t>, the boiler and chiller system is the main heating and cooling system, but it also has a furnace and direct expansion air conditioning systems serving the computer room and dining room</w:t>
+      </w:r>
+      <w:r>
+        <w:t xml:space="preserve">. </w:t>
+      </w:r>
+      <w:r>
+        <w:t>The team adds these systems</w:t>
+      </w:r>
+      <w:r>
+        <w:t xml:space="preserve"> to ensure the HVAC system information is complete</w:t>
+      </w:r>
+      <w:r>
+        <w:t>.</w:t>
+      </w:r>
+      <w:r>
+        <w:t xml:space="preserve"> Dictionary-based rules identify and include these supplemental HVAC systems automatically.</w:t>
       </w:r>
     </w:p>
     <w:p>
@@ -1193,11 +1488,7 @@
       </w:r>
       <w:proofErr w:type="spellEnd"/>
       <w:r>
-        <w:t xml:space="preserve"> file format. The workflow uses the dictionary to identify additional HVAC systems, assign zone categories, and label the schedule identifier for each zone in the EP </w:t>
-      </w:r>
-      <w:r>
-        <w:lastRenderedPageBreak/>
-        <w:t xml:space="preserve">model. The Python workflow automatically reads and applies </w:t>
+        <w:t xml:space="preserve"> file format. The workflow uses the dictionary to identify additional HVAC systems, assign zone categories, and label the schedule identifier for each zone in the EP model. The Python workflow automatically reads and applies </w:t>
       </w:r>
       <w:proofErr w:type="gramStart"/>
       <w:r>
@@ -1229,6 +1520,7 @@
         <w:pStyle w:val="Heading3"/>
       </w:pPr>
       <w:r>
+        <w:lastRenderedPageBreak/>
         <w:t>Spreadsheet Scorecard Generation</w:t>
       </w:r>
     </w:p>
@@ -1313,9 +1605,20 @@
       <w:r>
         <w:t xml:space="preserve">, which sorts inputs and executes </w:t>
       </w:r>
-      <w:r>
-        <w:t>EP</w:t>
-      </w:r>
+      <w:proofErr w:type="spellStart"/>
+      <w:r>
+        <w:t>E</w:t>
+      </w:r>
+      <w:r>
+        <w:t>nergy</w:t>
+      </w:r>
+      <w:r>
+        <w:t>P</w:t>
+      </w:r>
+      <w:r>
+        <w:t>lus</w:t>
+      </w:r>
+      <w:proofErr w:type="spellEnd"/>
       <w:r>
         <w:t xml:space="preserve"> models</w:t>
       </w:r>
@@ -1438,7 +1741,7 @@
           <w:iCs/>
           <w:sz w:val="21"/>
         </w:rPr>
-        <w:t>DEER-Prototypes-EnergyPlus-Working/</w:t>
+        <w:t>DEER-Prototypes-</w:t>
       </w:r>
       <w:proofErr w:type="spellStart"/>
       <w:r>
@@ -1449,33 +1752,9 @@
           <w:iCs/>
           <w:sz w:val="21"/>
         </w:rPr>
-        <w:t>ScorecardAutomation</w:t>
+        <w:t>EnergyPlus</w:t>
       </w:r>
       <w:proofErr w:type="spellEnd"/>
-      <w:r>
-        <w:t xml:space="preserve"> folder. After generating the DEER prototypes using the </w:t>
-      </w:r>
-      <w:proofErr w:type="spellStart"/>
-      <w:r>
-        <w:t>ModelKit</w:t>
-      </w:r>
-      <w:proofErr w:type="spellEnd"/>
-      <w:r>
-        <w:t xml:space="preserve"> workflow, the user will go to the </w:t>
-      </w:r>
-      <w:proofErr w:type="spellStart"/>
-      <w:r>
-        <w:rPr>
-          <w:rStyle w:val="HTMLCode"/>
-          <w:rFonts w:asciiTheme="minorHAnsi" w:eastAsiaTheme="minorHAnsi" w:hAnsiTheme="minorHAnsi" w:cstheme="minorHAnsi"/>
-          <w:sz w:val="21"/>
-        </w:rPr>
-        <w:t>ScorecardAutomation</w:t>
-      </w:r>
-      <w:proofErr w:type="spellEnd"/>
-      <w:r>
-        <w:t xml:space="preserve"> folder and run three Python scripts: </w:t>
-      </w:r>
       <w:r>
         <w:rPr>
           <w:rStyle w:val="HTMLCode"/>
@@ -1484,11 +1763,9 @@
           <w:iCs/>
           <w:sz w:val="21"/>
         </w:rPr>
-        <w:t>Run1_Pre_Data_Extraction.py</w:t>
-      </w:r>
-      <w:r>
-        <w:t xml:space="preserve">, </w:t>
-      </w:r>
+        <w:t>-Working/</w:t>
+      </w:r>
+      <w:proofErr w:type="spellStart"/>
       <w:r>
         <w:rPr>
           <w:rStyle w:val="HTMLCode"/>
@@ -1497,10 +1774,32 @@
           <w:iCs/>
           <w:sz w:val="21"/>
         </w:rPr>
-        <w:t>Run2_Data_Extraction_Processing.py</w:t>
-      </w:r>
-      <w:r>
-        <w:t xml:space="preserve">, and </w:t>
+        <w:t>ScorecardAutomation</w:t>
+      </w:r>
+      <w:proofErr w:type="spellEnd"/>
+      <w:r>
+        <w:t xml:space="preserve"> folder. After generating the DEER prototypes using the </w:t>
+      </w:r>
+      <w:proofErr w:type="spellStart"/>
+      <w:r>
+        <w:t>ModelKit</w:t>
+      </w:r>
+      <w:proofErr w:type="spellEnd"/>
+      <w:r>
+        <w:t xml:space="preserve"> workflow, the user will go to the </w:t>
+      </w:r>
+      <w:proofErr w:type="spellStart"/>
+      <w:r>
+        <w:rPr>
+          <w:rStyle w:val="HTMLCode"/>
+          <w:rFonts w:asciiTheme="minorHAnsi" w:eastAsiaTheme="minorHAnsi" w:hAnsiTheme="minorHAnsi" w:cstheme="minorHAnsi"/>
+          <w:sz w:val="21"/>
+        </w:rPr>
+        <w:t>ScorecardAutomation</w:t>
+      </w:r>
+      <w:proofErr w:type="spellEnd"/>
+      <w:r>
+        <w:t xml:space="preserve"> folder and run three Python scripts: </w:t>
       </w:r>
       <w:r>
         <w:rPr>
@@ -1510,10 +1809,10 @@
           <w:iCs/>
           <w:sz w:val="21"/>
         </w:rPr>
-        <w:t>Run3_Scorecard_Generation.py</w:t>
-      </w:r>
-      <w:r>
-        <w:t xml:space="preserve">. Before running the scripts, the user must update the required paths, including the DEER prototype folder path, the EP installation path, and the weather file path. Then the user runs the scripts in order: Run1, Run2, and Run3. Run1 will take the longest because it includes the EnergyPlus simulations. The supporting modules locate in </w:t>
+        <w:t>Run1_Pre_Data_Extraction.py</w:t>
+      </w:r>
+      <w:r>
+        <w:t xml:space="preserve">, </w:t>
       </w:r>
       <w:r>
         <w:rPr>
@@ -1523,9 +1822,11 @@
           <w:iCs/>
           <w:sz w:val="21"/>
         </w:rPr>
-        <w:t>DEER-Prototypes-EnergyPlus-Working /</w:t>
-      </w:r>
-      <w:proofErr w:type="spellStart"/>
+        <w:t>Run2_Data_Extraction_Processing.py</w:t>
+      </w:r>
+      <w:r>
+        <w:t xml:space="preserve">, and </w:t>
+      </w:r>
       <w:r>
         <w:rPr>
           <w:rStyle w:val="HTMLCode"/>
@@ -1534,9 +1835,28 @@
           <w:iCs/>
           <w:sz w:val="21"/>
         </w:rPr>
-        <w:t>ScorecardAutomation</w:t>
-      </w:r>
-      <w:proofErr w:type="spellEnd"/>
+        <w:t>Run3_Scorecard_Generation.py</w:t>
+      </w:r>
+      <w:r>
+        <w:t xml:space="preserve">. Before running the scripts, the user must update the required paths, including the DEER prototype folder path, the EP installation path, and the weather file path. Then the user runs the scripts in order: Run1, Run2, and Run3. Run1 will take the longest because it includes the EnergyPlus simulations. The supporting modules </w:t>
+      </w:r>
+      <w:proofErr w:type="gramStart"/>
+      <w:r>
+        <w:t xml:space="preserve">are </w:t>
+      </w:r>
+      <w:r>
+        <w:t>locate</w:t>
+      </w:r>
+      <w:r>
+        <w:t>d</w:t>
+      </w:r>
+      <w:r>
+        <w:t xml:space="preserve"> in</w:t>
+      </w:r>
+      <w:proofErr w:type="gramEnd"/>
+      <w:r>
+        <w:t xml:space="preserve"> </w:t>
+      </w:r>
       <w:r>
         <w:rPr>
           <w:rStyle w:val="HTMLCode"/>
@@ -1545,7 +1865,7 @@
           <w:iCs/>
           <w:sz w:val="21"/>
         </w:rPr>
-        <w:t>/</w:t>
+        <w:t>DEER-Prototypes-</w:t>
       </w:r>
       <w:proofErr w:type="spellStart"/>
       <w:r>
@@ -1556,6 +1876,50 @@
           <w:iCs/>
           <w:sz w:val="21"/>
         </w:rPr>
+        <w:t>EnergyPlus</w:t>
+      </w:r>
+      <w:proofErr w:type="spellEnd"/>
+      <w:r>
+        <w:rPr>
+          <w:rStyle w:val="HTMLCode"/>
+          <w:rFonts w:asciiTheme="minorHAnsi" w:eastAsiaTheme="minorHAnsi" w:hAnsiTheme="minorHAnsi" w:cstheme="minorHAnsi"/>
+          <w:i/>
+          <w:iCs/>
+          <w:sz w:val="21"/>
+        </w:rPr>
+        <w:t>-Working /</w:t>
+      </w:r>
+      <w:proofErr w:type="spellStart"/>
+      <w:r>
+        <w:rPr>
+          <w:rStyle w:val="HTMLCode"/>
+          <w:rFonts w:asciiTheme="minorHAnsi" w:eastAsiaTheme="minorHAnsi" w:hAnsiTheme="minorHAnsi" w:cstheme="minorHAnsi"/>
+          <w:i/>
+          <w:iCs/>
+          <w:sz w:val="21"/>
+        </w:rPr>
+        <w:t>ScorecardAutomation</w:t>
+      </w:r>
+      <w:proofErr w:type="spellEnd"/>
+      <w:r>
+        <w:rPr>
+          <w:rStyle w:val="HTMLCode"/>
+          <w:rFonts w:asciiTheme="minorHAnsi" w:eastAsiaTheme="minorHAnsi" w:hAnsiTheme="minorHAnsi" w:cstheme="minorHAnsi"/>
+          <w:i/>
+          <w:iCs/>
+          <w:sz w:val="21"/>
+        </w:rPr>
+        <w:t>/</w:t>
+      </w:r>
+      <w:proofErr w:type="spellStart"/>
+      <w:r>
+        <w:rPr>
+          <w:rStyle w:val="HTMLCode"/>
+          <w:rFonts w:asciiTheme="minorHAnsi" w:eastAsiaTheme="minorHAnsi" w:hAnsiTheme="minorHAnsi" w:cstheme="minorHAnsi"/>
+          <w:i/>
+          <w:iCs/>
+          <w:sz w:val="21"/>
+        </w:rPr>
         <w:t>src</w:t>
       </w:r>
       <w:proofErr w:type="spellEnd"/>
@@ -1622,7 +1986,34 @@
         <w:t xml:space="preserve"> </w:t>
       </w:r>
       <w:r>
-        <w:t>shows how the run scripts relate to the supporting scripts and templates. The expected outputs for each step are described in the following subsections.</w:t>
+        <w:t>shows how the run scripts relate to the supporting scripts and templates. The expected outputs for each step are described in the following subsections</w:t>
+      </w:r>
+      <w:r>
+        <w:t xml:space="preserve">, and the source files for extracted data are summarized in </w:t>
+      </w:r>
+      <w:r>
+        <w:fldChar w:fldCharType="begin"/>
+      </w:r>
+      <w:r>
+        <w:instrText xml:space="preserve"> REF _Ref223086581 \h </w:instrText>
+      </w:r>
+      <w:r>
+        <w:fldChar w:fldCharType="separate"/>
+      </w:r>
+      <w:r>
+        <w:t xml:space="preserve">Table A. </w:t>
+      </w:r>
+      <w:r>
+        <w:rPr>
+          <w:noProof/>
+        </w:rPr>
+        <w:t>1</w:t>
+      </w:r>
+      <w:r>
+        <w:fldChar w:fldCharType="end"/>
+      </w:r>
+      <w:r>
+        <w:t>.</w:t>
       </w:r>
     </w:p>
     <w:p>
@@ -1708,6 +2099,9 @@
         <w:t>4</w:t>
       </w:r>
       <w:r>
+        <w:rPr>
+          <w:noProof/>
+        </w:rPr>
         <w:fldChar w:fldCharType="end"/>
       </w:r>
       <w:bookmarkEnd w:id="3"/>
@@ -1939,6 +2333,9 @@
         <w:t>1</w:t>
       </w:r>
       <w:r>
+        <w:rPr>
+          <w:noProof/>
+        </w:rPr>
         <w:fldChar w:fldCharType="end"/>
       </w:r>
       <w:bookmarkEnd w:id="4"/>
@@ -2136,6 +2533,9 @@
         <w:t>2</w:t>
       </w:r>
       <w:r>
+        <w:rPr>
+          <w:noProof/>
+        </w:rPr>
         <w:fldChar w:fldCharType="end"/>
       </w:r>
       <w:bookmarkEnd w:id="5"/>
@@ -2270,15 +2670,19 @@
               <w:cnfStyle w:val="000000010000" w:firstRow="0" w:lastRow="0" w:firstColumn="0" w:lastColumn="0" w:oddVBand="0" w:evenVBand="0" w:oddHBand="0" w:evenHBand="1" w:firstRowFirstColumn="0" w:firstRowLastColumn="0" w:lastRowFirstColumn="0" w:lastRowLastColumn="0"/>
             </w:pPr>
             <w:r>
-              <w:t xml:space="preserve">EP </w:t>
-            </w:r>
-            <w:proofErr w:type="gramStart"/>
-            <w:r>
-              <w:t>folder exists</w:t>
-            </w:r>
-            <w:proofErr w:type="gramEnd"/>
-            <w:r>
-              <w:t xml:space="preserve"> and contains </w:t>
+              <w:t>E</w:t>
+            </w:r>
+            <w:r>
+              <w:t>nergy</w:t>
+            </w:r>
+            <w:r>
+              <w:t>P</w:t>
+            </w:r>
+            <w:r>
+              <w:t>lus</w:t>
+            </w:r>
+            <w:r>
+              <w:t xml:space="preserve"> folder exists and contains </w:t>
             </w:r>
             <w:r>
               <w:rPr>
@@ -2594,7 +2998,23 @@
           <w:i/>
           <w:iCs/>
         </w:rPr>
-        <w:t>DEER-Prototypes-EnergyPlus-Working\</w:t>
+        <w:t>DEER-Prototypes-</w:t>
+      </w:r>
+      <w:proofErr w:type="spellStart"/>
+      <w:r>
+        <w:rPr>
+          <w:i/>
+          <w:iCs/>
+        </w:rPr>
+        <w:t>EnergyPlus</w:t>
+      </w:r>
+      <w:proofErr w:type="spellEnd"/>
+      <w:r>
+        <w:rPr>
+          <w:i/>
+          <w:iCs/>
+        </w:rPr>
+        <w:t>-Working\</w:t>
       </w:r>
       <w:proofErr w:type="spellStart"/>
       <w:r>
@@ -3186,6 +3606,9 @@
         <w:t>5</w:t>
       </w:r>
       <w:r>
+        <w:rPr>
+          <w:noProof/>
+        </w:rPr>
         <w:fldChar w:fldCharType="end"/>
       </w:r>
       <w:bookmarkEnd w:id="6"/>
@@ -3781,6 +4204,9 @@
         <w:t>6</w:t>
       </w:r>
       <w:r>
+        <w:rPr>
+          <w:noProof/>
+        </w:rPr>
         <w:fldChar w:fldCharType="end"/>
       </w:r>
       <w:bookmarkEnd w:id="7"/>
@@ -3993,6 +4419,9 @@
         <w:t>7</w:t>
       </w:r>
       <w:r>
+        <w:rPr>
+          <w:noProof/>
+        </w:rPr>
         <w:fldChar w:fldCharType="end"/>
       </w:r>
       <w:bookmarkEnd w:id="8"/>
@@ -4145,6 +4574,9 @@
         <w:t>8</w:t>
       </w:r>
       <w:r>
+        <w:rPr>
+          <w:noProof/>
+        </w:rPr>
         <w:fldChar w:fldCharType="end"/>
       </w:r>
       <w:bookmarkEnd w:id="9"/>
@@ -4433,6 +4865,9 @@
         <w:t>9</w:t>
       </w:r>
       <w:r>
+        <w:rPr>
+          <w:noProof/>
+        </w:rPr>
         <w:fldChar w:fldCharType="end"/>
       </w:r>
       <w:bookmarkEnd w:id="10"/>
@@ -4540,6 +4975,9 @@
         <w:t>10</w:t>
       </w:r>
       <w:r>
+        <w:rPr>
+          <w:noProof/>
+        </w:rPr>
         <w:fldChar w:fldCharType="end"/>
       </w:r>
       <w:bookmarkEnd w:id="11"/>
@@ -4780,6 +5218,9 @@
         <w:t>11</w:t>
       </w:r>
       <w:r>
+        <w:rPr>
+          <w:noProof/>
+        </w:rPr>
         <w:fldChar w:fldCharType="end"/>
       </w:r>
       <w:bookmarkEnd w:id="12"/>
@@ -4789,6 +5230,81 @@
     </w:p>
     <w:p>
       <w:pPr>
+        <w:pStyle w:val="Heading2"/>
+      </w:pPr>
+      <w:r>
+        <w:t>Next Steps</w:t>
+      </w:r>
+    </w:p>
+    <w:p>
+      <w:pPr>
+        <w:pStyle w:val="Body"/>
+      </w:pPr>
+      <w:r>
+        <w:t>The team recommended next steps that build on the DEER scorecards to identify specific changes that will improve the accuracy and reliability of the DEER prototypes and establish a pathway towards implementing these changes.</w:t>
+      </w:r>
+    </w:p>
+    <w:p>
+      <w:pPr>
+        <w:pStyle w:val="Body"/>
+        <w:numPr>
+          <w:ilvl w:val="0"/>
+          <w:numId w:val="35"/>
+        </w:numPr>
+      </w:pPr>
+      <w:r>
+        <w:t xml:space="preserve">Compare the DEER scorecards to the </w:t>
+      </w:r>
+      <w:proofErr w:type="spellStart"/>
+      <w:r>
+        <w:t>CalBEM</w:t>
+      </w:r>
+      <w:proofErr w:type="spellEnd"/>
+      <w:r>
+        <w:t xml:space="preserve"> scorecards and document the ways that </w:t>
+      </w:r>
+      <w:r>
+        <w:t xml:space="preserve">they differ structurally (e.g. building type, HVAC type and vintage selection), by model assumptions (e.g. gains </w:t>
+      </w:r>
+      <w:r>
+        <w:lastRenderedPageBreak/>
+        <w:t>and schedules), and by model results. Document any deficiencies found in the DEER prototypes and identify the impact on results.</w:t>
+      </w:r>
+    </w:p>
+    <w:p>
+      <w:pPr>
+        <w:pStyle w:val="Body"/>
+        <w:numPr>
+          <w:ilvl w:val="0"/>
+          <w:numId w:val="35"/>
+        </w:numPr>
+      </w:pPr>
+      <w:r>
+        <w:t xml:space="preserve">Compare DEER measure savings against savings calculated with the </w:t>
+      </w:r>
+      <w:proofErr w:type="spellStart"/>
+      <w:r>
+        <w:t>CalBEM</w:t>
+      </w:r>
+      <w:proofErr w:type="spellEnd"/>
+      <w:r>
+        <w:t xml:space="preserve"> models, for sample measures.</w:t>
+      </w:r>
+    </w:p>
+    <w:p>
+      <w:pPr>
+        <w:pStyle w:val="Body"/>
+        <w:numPr>
+          <w:ilvl w:val="0"/>
+          <w:numId w:val="35"/>
+        </w:numPr>
+      </w:pPr>
+      <w:r>
+        <w:t>Review the possible pathways towards implementing technical improvements to the DEER prototypes to address structure, inputs and assumptions, and functionality of the modeling framework. Identify the challenges and limitations for each pathway.</w:t>
+      </w:r>
+    </w:p>
+    <w:p>
+      <w:pPr>
         <w:pStyle w:val="AppendixHeading2"/>
         <w:ind w:left="720" w:hanging="360"/>
       </w:pPr>
@@ -4820,6 +5336,9 @@
         <w:t>1</w:t>
       </w:r>
       <w:r>
+        <w:rPr>
+          <w:noProof/>
+        </w:rPr>
         <w:fldChar w:fldCharType="end"/>
       </w:r>
       <w:bookmarkEnd w:id="13"/>
@@ -4956,7 +5475,6 @@
                 <w:sz w:val="20"/>
                 <w:szCs w:val="22"/>
               </w:rPr>
-              <w:lastRenderedPageBreak/>
               <w:t>Building Category</w:t>
             </w:r>
           </w:p>
@@ -5014,12 +5532,22 @@
             <w:pPr>
               <w:pStyle w:val="TableBody"/>
               <w:cnfStyle w:val="000000100000" w:firstRow="0" w:lastRow="0" w:firstColumn="0" w:lastColumn="0" w:oddVBand="0" w:evenVBand="0" w:oddHBand="1" w:evenHBand="0" w:firstRowFirstColumn="0" w:firstRowLastColumn="0" w:lastRowFirstColumn="0" w:lastRowLastColumn="0"/>
+              <w:rPr>
+                <w:vertAlign w:val="superscript"/>
+              </w:rPr>
             </w:pPr>
-            <w:proofErr w:type="spellStart"/>
-            <w:r>
-              <w:t>idf</w:t>
-            </w:r>
-            <w:proofErr w:type="spellEnd"/>
+            <w:r>
+              <w:t>I</w:t>
+            </w:r>
+            <w:r>
+              <w:t>df</w:t>
+            </w:r>
+            <w:r>
+              <w:rPr>
+                <w:vertAlign w:val="superscript"/>
+              </w:rPr>
+              <w:t>1</w:t>
+            </w:r>
           </w:p>
         </w:tc>
       </w:tr>
@@ -5060,9 +5588,21 @@
             <w:pPr>
               <w:pStyle w:val="TableBody"/>
               <w:cnfStyle w:val="000000010000" w:firstRow="0" w:lastRow="0" w:firstColumn="0" w:lastColumn="0" w:oddVBand="0" w:evenVBand="0" w:oddHBand="0" w:evenHBand="1" w:firstRowFirstColumn="0" w:firstRowLastColumn="0" w:lastRowFirstColumn="0" w:lastRowLastColumn="0"/>
+              <w:rPr>
+                <w:vertAlign w:val="superscript"/>
+              </w:rPr>
             </w:pPr>
             <w:r>
-              <w:t>html</w:t>
+              <w:t>H</w:t>
+            </w:r>
+            <w:r>
+              <w:t>tml</w:t>
+            </w:r>
+            <w:r>
+              <w:rPr>
+                <w:vertAlign w:val="superscript"/>
+              </w:rPr>
+              <w:t>2</w:t>
             </w:r>
           </w:p>
         </w:tc>
@@ -5104,12 +5644,22 @@
             <w:pPr>
               <w:pStyle w:val="TableBody"/>
               <w:cnfStyle w:val="000000100000" w:firstRow="0" w:lastRow="0" w:firstColumn="0" w:lastColumn="0" w:oddVBand="0" w:evenVBand="0" w:oddHBand="1" w:evenHBand="0" w:firstRowFirstColumn="0" w:firstRowLastColumn="0" w:lastRowFirstColumn="0" w:lastRowLastColumn="0"/>
+              <w:rPr>
+                <w:vertAlign w:val="superscript"/>
+              </w:rPr>
             </w:pPr>
-            <w:proofErr w:type="spellStart"/>
-            <w:r>
-              <w:t>eio</w:t>
-            </w:r>
-            <w:proofErr w:type="spellEnd"/>
+            <w:r>
+              <w:t>E</w:t>
+            </w:r>
+            <w:r>
+              <w:t>io</w:t>
+            </w:r>
+            <w:r>
+              <w:rPr>
+                <w:vertAlign w:val="superscript"/>
+              </w:rPr>
+              <w:t>3</w:t>
+            </w:r>
           </w:p>
         </w:tc>
       </w:tr>
@@ -5162,7 +5712,10 @@
             </w:pPr>
             <w:proofErr w:type="spellStart"/>
             <w:r>
-              <w:t>idf</w:t>
+              <w:t>I</w:t>
+            </w:r>
+            <w:r>
+              <w:t>df</w:t>
             </w:r>
             <w:proofErr w:type="spellEnd"/>
           </w:p>
@@ -5208,7 +5761,10 @@
             </w:pPr>
             <w:proofErr w:type="spellStart"/>
             <w:r>
-              <w:t>idf</w:t>
+              <w:t>I</w:t>
+            </w:r>
+            <w:r>
+              <w:t>df</w:t>
             </w:r>
             <w:proofErr w:type="spellEnd"/>
           </w:p>
@@ -5254,7 +5810,10 @@
             </w:pPr>
             <w:proofErr w:type="spellStart"/>
             <w:r>
-              <w:t>idf</w:t>
+              <w:t>I</w:t>
+            </w:r>
+            <w:r>
+              <w:t>df</w:t>
             </w:r>
             <w:proofErr w:type="spellEnd"/>
           </w:p>
@@ -5300,7 +5859,10 @@
             </w:pPr>
             <w:proofErr w:type="spellStart"/>
             <w:r>
-              <w:t>idf</w:t>
+              <w:t>I</w:t>
+            </w:r>
+            <w:r>
+              <w:t>df</w:t>
             </w:r>
             <w:proofErr w:type="spellEnd"/>
           </w:p>
@@ -5345,7 +5907,10 @@
               <w:cnfStyle w:val="000000010000" w:firstRow="0" w:lastRow="0" w:firstColumn="0" w:lastColumn="0" w:oddVBand="0" w:evenVBand="0" w:oddHBand="0" w:evenHBand="1" w:firstRowFirstColumn="0" w:firstRowLastColumn="0" w:lastRowFirstColumn="0" w:lastRowLastColumn="0"/>
             </w:pPr>
             <w:r>
-              <w:t>html</w:t>
+              <w:t>H</w:t>
+            </w:r>
+            <w:r>
+              <w:t>tml</w:t>
             </w:r>
           </w:p>
         </w:tc>
@@ -5389,7 +5954,10 @@
               <w:cnfStyle w:val="000000100000" w:firstRow="0" w:lastRow="0" w:firstColumn="0" w:lastColumn="0" w:oddVBand="0" w:evenVBand="0" w:oddHBand="1" w:evenHBand="0" w:firstRowFirstColumn="0" w:firstRowLastColumn="0" w:lastRowFirstColumn="0" w:lastRowLastColumn="0"/>
             </w:pPr>
             <w:r>
-              <w:t>html</w:t>
+              <w:t>H</w:t>
+            </w:r>
+            <w:r>
+              <w:t>tml</w:t>
             </w:r>
           </w:p>
         </w:tc>
@@ -5433,7 +6001,10 @@
               <w:cnfStyle w:val="000000010000" w:firstRow="0" w:lastRow="0" w:firstColumn="0" w:lastColumn="0" w:oddVBand="0" w:evenVBand="0" w:oddHBand="0" w:evenHBand="1" w:firstRowFirstColumn="0" w:firstRowLastColumn="0" w:lastRowFirstColumn="0" w:lastRowLastColumn="0"/>
             </w:pPr>
             <w:r>
-              <w:t>html</w:t>
+              <w:t>H</w:t>
+            </w:r>
+            <w:r>
+              <w:t>tml</w:t>
             </w:r>
           </w:p>
         </w:tc>
@@ -5477,7 +6048,10 @@
               <w:cnfStyle w:val="000000100000" w:firstRow="0" w:lastRow="0" w:firstColumn="0" w:lastColumn="0" w:oddVBand="0" w:evenVBand="0" w:oddHBand="1" w:evenHBand="0" w:firstRowFirstColumn="0" w:firstRowLastColumn="0" w:lastRowFirstColumn="0" w:lastRowLastColumn="0"/>
             </w:pPr>
             <w:r>
-              <w:t>html</w:t>
+              <w:t>H</w:t>
+            </w:r>
+            <w:r>
+              <w:t>tml</w:t>
             </w:r>
           </w:p>
         </w:tc>
@@ -5521,7 +6095,10 @@
               <w:cnfStyle w:val="000000010000" w:firstRow="0" w:lastRow="0" w:firstColumn="0" w:lastColumn="0" w:oddVBand="0" w:evenVBand="0" w:oddHBand="0" w:evenHBand="1" w:firstRowFirstColumn="0" w:firstRowLastColumn="0" w:lastRowFirstColumn="0" w:lastRowLastColumn="0"/>
             </w:pPr>
             <w:r>
-              <w:t>html</w:t>
+              <w:t>H</w:t>
+            </w:r>
+            <w:r>
+              <w:t>tml</w:t>
             </w:r>
           </w:p>
         </w:tc>
@@ -5566,7 +6143,10 @@
             </w:pPr>
             <w:proofErr w:type="spellStart"/>
             <w:r>
-              <w:t>idf</w:t>
+              <w:t>I</w:t>
+            </w:r>
+            <w:r>
+              <w:t>df</w:t>
             </w:r>
             <w:proofErr w:type="spellEnd"/>
           </w:p>
@@ -5609,10 +6189,118 @@
             <w:pPr>
               <w:pStyle w:val="TableBody"/>
               <w:cnfStyle w:val="000000010000" w:firstRow="0" w:lastRow="0" w:firstColumn="0" w:lastColumn="0" w:oddVBand="0" w:evenVBand="0" w:oddHBand="0" w:evenHBand="1" w:firstRowFirstColumn="0" w:firstRowLastColumn="0" w:lastRowFirstColumn="0" w:lastRowLastColumn="0"/>
+              <w:rPr>
+                <w:vertAlign w:val="superscript"/>
+              </w:rPr>
+            </w:pPr>
+            <w:r>
+              <w:t>P</w:t>
+            </w:r>
+            <w:r>
+              <w:t>xt</w:t>
+            </w:r>
+            <w:r>
+              <w:rPr>
+                <w:vertAlign w:val="superscript"/>
+              </w:rPr>
+              <w:t>4</w:t>
+            </w:r>
+          </w:p>
+        </w:tc>
+      </w:tr>
+      <w:tr>
+        <w:trPr>
+          <w:cnfStyle w:val="000000100000" w:firstRow="0" w:lastRow="0" w:firstColumn="0" w:lastColumn="0" w:oddVBand="0" w:evenVBand="0" w:oddHBand="1" w:evenHBand="0" w:firstRowFirstColumn="0" w:firstRowLastColumn="0" w:lastRowFirstColumn="0" w:lastRowLastColumn="0"/>
+          <w:trHeight w:val="300"/>
+        </w:trPr>
+        <w:tc>
+          <w:tcPr>
+            <w:cnfStyle w:val="001000000000" w:firstRow="0" w:lastRow="0" w:firstColumn="1" w:lastColumn="0" w:oddVBand="0" w:evenVBand="0" w:oddHBand="0" w:evenHBand="0" w:firstRowFirstColumn="0" w:firstRowLastColumn="0" w:lastRowFirstColumn="0" w:lastRowLastColumn="0"/>
+            <w:tcW w:w="4495" w:type="dxa"/>
+            <w:hideMark/>
+          </w:tcPr>
+          <w:p>
+            <w:pPr>
+              <w:pStyle w:val="TableBody"/>
+              <w:rPr>
+                <w:sz w:val="20"/>
+                <w:szCs w:val="22"/>
+              </w:rPr>
+            </w:pPr>
+            <w:r>
+              <w:rPr>
+                <w:sz w:val="20"/>
+                <w:szCs w:val="22"/>
+              </w:rPr>
+              <w:t>HVAC Identifier</w:t>
+            </w:r>
+          </w:p>
+        </w:tc>
+        <w:tc>
+          <w:tcPr>
+            <w:tcW w:w="4860" w:type="dxa"/>
+            <w:hideMark/>
+          </w:tcPr>
+          <w:p>
+            <w:pPr>
+              <w:pStyle w:val="TableBody"/>
+              <w:cnfStyle w:val="000000100000" w:firstRow="0" w:lastRow="0" w:firstColumn="0" w:lastColumn="0" w:oddVBand="0" w:evenVBand="0" w:oddHBand="1" w:evenHBand="0" w:firstRowFirstColumn="0" w:firstRowLastColumn="0" w:lastRowFirstColumn="0" w:lastRowLastColumn="0"/>
             </w:pPr>
             <w:proofErr w:type="spellStart"/>
             <w:r>
-              <w:t>pxt</w:t>
+              <w:t>P</w:t>
+            </w:r>
+            <w:r>
+              <w:t>xt</w:t>
+            </w:r>
+            <w:proofErr w:type="spellEnd"/>
+          </w:p>
+        </w:tc>
+      </w:tr>
+      <w:tr>
+        <w:trPr>
+          <w:cnfStyle w:val="000000010000" w:firstRow="0" w:lastRow="0" w:firstColumn="0" w:lastColumn="0" w:oddVBand="0" w:evenVBand="0" w:oddHBand="0" w:evenHBand="1" w:firstRowFirstColumn="0" w:firstRowLastColumn="0" w:lastRowFirstColumn="0" w:lastRowLastColumn="0"/>
+          <w:trHeight w:val="300"/>
+        </w:trPr>
+        <w:tc>
+          <w:tcPr>
+            <w:cnfStyle w:val="001000000000" w:firstRow="0" w:lastRow="0" w:firstColumn="1" w:lastColumn="0" w:oddVBand="0" w:evenVBand="0" w:oddHBand="0" w:evenHBand="0" w:firstRowFirstColumn="0" w:firstRowLastColumn="0" w:lastRowFirstColumn="0" w:lastRowLastColumn="0"/>
+            <w:tcW w:w="4495" w:type="dxa"/>
+            <w:hideMark/>
+          </w:tcPr>
+          <w:p>
+            <w:pPr>
+              <w:pStyle w:val="TableBody"/>
+              <w:rPr>
+                <w:sz w:val="20"/>
+                <w:szCs w:val="22"/>
+              </w:rPr>
+            </w:pPr>
+            <w:r>
+              <w:rPr>
+                <w:sz w:val="20"/>
+                <w:szCs w:val="22"/>
+              </w:rPr>
+              <w:t>Construction Layers</w:t>
+            </w:r>
+          </w:p>
+        </w:tc>
+        <w:tc>
+          <w:tcPr>
+            <w:tcW w:w="4860" w:type="dxa"/>
+            <w:hideMark/>
+          </w:tcPr>
+          <w:p>
+            <w:pPr>
+              <w:pStyle w:val="TableBody"/>
+              <w:cnfStyle w:val="000000010000" w:firstRow="0" w:lastRow="0" w:firstColumn="0" w:lastColumn="0" w:oddVBand="0" w:evenVBand="0" w:oddHBand="0" w:evenHBand="1" w:firstRowFirstColumn="0" w:firstRowLastColumn="0" w:lastRowFirstColumn="0" w:lastRowLastColumn="0"/>
+            </w:pPr>
+            <w:proofErr w:type="spellStart"/>
+            <w:r>
+              <w:t>I</w:t>
+            </w:r>
+            <w:r>
+              <w:t>df</w:t>
             </w:r>
             <w:proofErr w:type="spellEnd"/>
           </w:p>
@@ -5642,7 +6330,145 @@
                 <w:sz w:val="20"/>
                 <w:szCs w:val="22"/>
               </w:rPr>
-              <w:t>HVAC Identifier</w:t>
+              <w:t>Roof/Wall U-Value</w:t>
+            </w:r>
+          </w:p>
+        </w:tc>
+        <w:tc>
+          <w:tcPr>
+            <w:tcW w:w="4860" w:type="dxa"/>
+            <w:hideMark/>
+          </w:tcPr>
+          <w:p>
+            <w:pPr>
+              <w:pStyle w:val="TableBody"/>
+              <w:cnfStyle w:val="000000100000" w:firstRow="0" w:lastRow="0" w:firstColumn="0" w:lastColumn="0" w:oddVBand="0" w:evenVBand="0" w:oddHBand="1" w:evenHBand="0" w:firstRowFirstColumn="0" w:firstRowLastColumn="0" w:lastRowFirstColumn="0" w:lastRowLastColumn="0"/>
+            </w:pPr>
+            <w:r>
+              <w:t>H</w:t>
+            </w:r>
+            <w:r>
+              <w:t>tml</w:t>
+            </w:r>
+          </w:p>
+        </w:tc>
+      </w:tr>
+      <w:tr>
+        <w:trPr>
+          <w:cnfStyle w:val="000000010000" w:firstRow="0" w:lastRow="0" w:firstColumn="0" w:lastColumn="0" w:oddVBand="0" w:evenVBand="0" w:oddHBand="0" w:evenHBand="1" w:firstRowFirstColumn="0" w:firstRowLastColumn="0" w:lastRowFirstColumn="0" w:lastRowLastColumn="0"/>
+          <w:trHeight w:val="300"/>
+        </w:trPr>
+        <w:tc>
+          <w:tcPr>
+            <w:cnfStyle w:val="001000000000" w:firstRow="0" w:lastRow="0" w:firstColumn="1" w:lastColumn="0" w:oddVBand="0" w:evenVBand="0" w:oddHBand="0" w:evenHBand="0" w:firstRowFirstColumn="0" w:firstRowLastColumn="0" w:lastRowFirstColumn="0" w:lastRowLastColumn="0"/>
+            <w:tcW w:w="4495" w:type="dxa"/>
+            <w:hideMark/>
+          </w:tcPr>
+          <w:p>
+            <w:pPr>
+              <w:pStyle w:val="TableBody"/>
+              <w:rPr>
+                <w:sz w:val="20"/>
+                <w:szCs w:val="22"/>
+              </w:rPr>
+            </w:pPr>
+            <w:r>
+              <w:rPr>
+                <w:sz w:val="20"/>
+                <w:szCs w:val="22"/>
+              </w:rPr>
+              <w:t>Window U-Value / SHGC / VT</w:t>
+            </w:r>
+          </w:p>
+        </w:tc>
+        <w:tc>
+          <w:tcPr>
+            <w:tcW w:w="4860" w:type="dxa"/>
+            <w:hideMark/>
+          </w:tcPr>
+          <w:p>
+            <w:pPr>
+              <w:pStyle w:val="TableBody"/>
+              <w:cnfStyle w:val="000000010000" w:firstRow="0" w:lastRow="0" w:firstColumn="0" w:lastColumn="0" w:oddVBand="0" w:evenVBand="0" w:oddHBand="0" w:evenHBand="1" w:firstRowFirstColumn="0" w:firstRowLastColumn="0" w:lastRowFirstColumn="0" w:lastRowLastColumn="0"/>
+            </w:pPr>
+            <w:proofErr w:type="spellStart"/>
+            <w:r>
+              <w:t>I</w:t>
+            </w:r>
+            <w:r>
+              <w:t>df</w:t>
+            </w:r>
+            <w:proofErr w:type="spellEnd"/>
+          </w:p>
+        </w:tc>
+      </w:tr>
+      <w:tr>
+        <w:trPr>
+          <w:cnfStyle w:val="000000100000" w:firstRow="0" w:lastRow="0" w:firstColumn="0" w:lastColumn="0" w:oddVBand="0" w:evenVBand="0" w:oddHBand="1" w:evenHBand="0" w:firstRowFirstColumn="0" w:firstRowLastColumn="0" w:lastRowFirstColumn="0" w:lastRowLastColumn="0"/>
+          <w:trHeight w:val="300"/>
+        </w:trPr>
+        <w:tc>
+          <w:tcPr>
+            <w:cnfStyle w:val="001000000000" w:firstRow="0" w:lastRow="0" w:firstColumn="1" w:lastColumn="0" w:oddVBand="0" w:evenVBand="0" w:oddHBand="0" w:evenHBand="0" w:firstRowFirstColumn="0" w:firstRowLastColumn="0" w:lastRowFirstColumn="0" w:lastRowLastColumn="0"/>
+            <w:tcW w:w="4495" w:type="dxa"/>
+            <w:hideMark/>
+          </w:tcPr>
+          <w:p>
+            <w:pPr>
+              <w:pStyle w:val="TableBody"/>
+              <w:rPr>
+                <w:sz w:val="20"/>
+                <w:szCs w:val="22"/>
+              </w:rPr>
+            </w:pPr>
+            <w:r>
+              <w:rPr>
+                <w:sz w:val="20"/>
+                <w:szCs w:val="22"/>
+              </w:rPr>
+              <w:t>HVAC Parameters</w:t>
+            </w:r>
+            <w:r>
+              <w:rPr>
+                <w:sz w:val="20"/>
+                <w:szCs w:val="22"/>
+              </w:rPr>
+              <w:t xml:space="preserve"> (</w:t>
+            </w:r>
+            <w:r>
+              <w:rPr>
+                <w:sz w:val="20"/>
+                <w:szCs w:val="22"/>
+              </w:rPr>
+              <w:t>including</w:t>
+            </w:r>
+            <w:r>
+              <w:rPr>
+                <w:sz w:val="20"/>
+                <w:szCs w:val="22"/>
+              </w:rPr>
+              <w:t xml:space="preserve"> </w:t>
+            </w:r>
+            <w:r>
+              <w:rPr>
+                <w:sz w:val="20"/>
+                <w:szCs w:val="22"/>
+              </w:rPr>
+              <w:t xml:space="preserve">system type, </w:t>
+            </w:r>
+            <w:r>
+              <w:rPr>
+                <w:sz w:val="20"/>
+                <w:szCs w:val="22"/>
+              </w:rPr>
+              <w:t xml:space="preserve">air distribution system type, </w:t>
+            </w:r>
+            <w:r>
+              <w:rPr>
+                <w:sz w:val="20"/>
+                <w:szCs w:val="22"/>
+              </w:rPr>
+              <w:t>cooling efficiency and heating efficiency)</w:t>
             </w:r>
           </w:p>
         </w:tc>
@@ -5658,7 +6484,10 @@
             </w:pPr>
             <w:proofErr w:type="spellStart"/>
             <w:r>
-              <w:t>pxt</w:t>
+              <w:t>I</w:t>
+            </w:r>
+            <w:r>
+              <w:t>df</w:t>
             </w:r>
             <w:proofErr w:type="spellEnd"/>
           </w:p>
@@ -5688,7 +6517,7 @@
                 <w:sz w:val="20"/>
                 <w:szCs w:val="22"/>
               </w:rPr>
-              <w:t>Construction Layers</w:t>
+              <w:t>Fan Parameters</w:t>
             </w:r>
           </w:p>
         </w:tc>
@@ -5705,6 +6534,108 @@
             <w:proofErr w:type="spellStart"/>
             <w:r>
               <w:t>idf</w:t>
+            </w:r>
+            <w:proofErr w:type="spellEnd"/>
+            <w:r>
+              <w:t xml:space="preserve"> + html</w:t>
+            </w:r>
+          </w:p>
+        </w:tc>
+      </w:tr>
+      <w:tr>
+        <w:trPr>
+          <w:cnfStyle w:val="000000100000" w:firstRow="0" w:lastRow="0" w:firstColumn="0" w:lastColumn="0" w:oddVBand="0" w:evenVBand="0" w:oddHBand="1" w:evenHBand="0" w:firstRowFirstColumn="0" w:firstRowLastColumn="0" w:lastRowFirstColumn="0" w:lastRowLastColumn="0"/>
+          <w:trHeight w:val="300"/>
+        </w:trPr>
+        <w:tc>
+          <w:tcPr>
+            <w:cnfStyle w:val="001000000000" w:firstRow="0" w:lastRow="0" w:firstColumn="1" w:lastColumn="0" w:oddVBand="0" w:evenVBand="0" w:oddHBand="0" w:evenHBand="0" w:firstRowFirstColumn="0" w:firstRowLastColumn="0" w:lastRowFirstColumn="0" w:lastRowLastColumn="0"/>
+            <w:tcW w:w="4495" w:type="dxa"/>
+            <w:hideMark/>
+          </w:tcPr>
+          <w:p>
+            <w:pPr>
+              <w:pStyle w:val="TableBody"/>
+              <w:rPr>
+                <w:sz w:val="20"/>
+                <w:szCs w:val="22"/>
+              </w:rPr>
+            </w:pPr>
+            <w:r>
+              <w:rPr>
+                <w:sz w:val="20"/>
+                <w:szCs w:val="22"/>
+              </w:rPr>
+              <w:lastRenderedPageBreak/>
+              <w:t>Gas Equipment</w:t>
+            </w:r>
+          </w:p>
+        </w:tc>
+        <w:tc>
+          <w:tcPr>
+            <w:tcW w:w="4860" w:type="dxa"/>
+            <w:hideMark/>
+          </w:tcPr>
+          <w:p>
+            <w:pPr>
+              <w:pStyle w:val="TableBody"/>
+              <w:cnfStyle w:val="000000100000" w:firstRow="0" w:lastRow="0" w:firstColumn="0" w:lastColumn="0" w:oddVBand="0" w:evenVBand="0" w:oddHBand="1" w:evenHBand="0" w:firstRowFirstColumn="0" w:firstRowLastColumn="0" w:lastRowFirstColumn="0" w:lastRowLastColumn="0"/>
+            </w:pPr>
+            <w:proofErr w:type="spellStart"/>
+            <w:r>
+              <w:t>I</w:t>
+            </w:r>
+            <w:r>
+              <w:t>df</w:t>
+            </w:r>
+            <w:proofErr w:type="spellEnd"/>
+          </w:p>
+        </w:tc>
+      </w:tr>
+      <w:tr>
+        <w:trPr>
+          <w:cnfStyle w:val="000000010000" w:firstRow="0" w:lastRow="0" w:firstColumn="0" w:lastColumn="0" w:oddVBand="0" w:evenVBand="0" w:oddHBand="0" w:evenHBand="1" w:firstRowFirstColumn="0" w:firstRowLastColumn="0" w:lastRowFirstColumn="0" w:lastRowLastColumn="0"/>
+          <w:trHeight w:val="300"/>
+        </w:trPr>
+        <w:tc>
+          <w:tcPr>
+            <w:cnfStyle w:val="001000000000" w:firstRow="0" w:lastRow="0" w:firstColumn="1" w:lastColumn="0" w:oddVBand="0" w:evenVBand="0" w:oddHBand="0" w:evenHBand="0" w:firstRowFirstColumn="0" w:firstRowLastColumn="0" w:lastRowFirstColumn="0" w:lastRowLastColumn="0"/>
+            <w:tcW w:w="4495" w:type="dxa"/>
+            <w:hideMark/>
+          </w:tcPr>
+          <w:p>
+            <w:pPr>
+              <w:pStyle w:val="TableBody"/>
+              <w:rPr>
+                <w:sz w:val="20"/>
+                <w:szCs w:val="22"/>
+              </w:rPr>
+            </w:pPr>
+            <w:r>
+              <w:rPr>
+                <w:sz w:val="20"/>
+                <w:szCs w:val="22"/>
+              </w:rPr>
+              <w:t>Refrigeration System</w:t>
+            </w:r>
+          </w:p>
+        </w:tc>
+        <w:tc>
+          <w:tcPr>
+            <w:tcW w:w="4860" w:type="dxa"/>
+            <w:hideMark/>
+          </w:tcPr>
+          <w:p>
+            <w:pPr>
+              <w:pStyle w:val="TableBody"/>
+              <w:cnfStyle w:val="000000010000" w:firstRow="0" w:lastRow="0" w:firstColumn="0" w:lastColumn="0" w:oddVBand="0" w:evenVBand="0" w:oddHBand="0" w:evenHBand="1" w:firstRowFirstColumn="0" w:firstRowLastColumn="0" w:lastRowFirstColumn="0" w:lastRowLastColumn="0"/>
+            </w:pPr>
+            <w:proofErr w:type="spellStart"/>
+            <w:r>
+              <w:t>I</w:t>
+            </w:r>
+            <w:r>
+              <w:t>df</w:t>
             </w:r>
             <w:proofErr w:type="spellEnd"/>
           </w:p>
@@ -5734,97 +6665,7 @@
                 <w:sz w:val="20"/>
                 <w:szCs w:val="22"/>
               </w:rPr>
-              <w:t>Roof/Wall U-Value</w:t>
-            </w:r>
-          </w:p>
-        </w:tc>
-        <w:tc>
-          <w:tcPr>
-            <w:tcW w:w="4860" w:type="dxa"/>
-            <w:hideMark/>
-          </w:tcPr>
-          <w:p>
-            <w:pPr>
-              <w:pStyle w:val="TableBody"/>
-              <w:cnfStyle w:val="000000100000" w:firstRow="0" w:lastRow="0" w:firstColumn="0" w:lastColumn="0" w:oddVBand="0" w:evenVBand="0" w:oddHBand="1" w:evenHBand="0" w:firstRowFirstColumn="0" w:firstRowLastColumn="0" w:lastRowFirstColumn="0" w:lastRowLastColumn="0"/>
-            </w:pPr>
-            <w:r>
-              <w:t>html</w:t>
-            </w:r>
-          </w:p>
-        </w:tc>
-      </w:tr>
-      <w:tr>
-        <w:trPr>
-          <w:cnfStyle w:val="000000010000" w:firstRow="0" w:lastRow="0" w:firstColumn="0" w:lastColumn="0" w:oddVBand="0" w:evenVBand="0" w:oddHBand="0" w:evenHBand="1" w:firstRowFirstColumn="0" w:firstRowLastColumn="0" w:lastRowFirstColumn="0" w:lastRowLastColumn="0"/>
-          <w:trHeight w:val="300"/>
-        </w:trPr>
-        <w:tc>
-          <w:tcPr>
-            <w:cnfStyle w:val="001000000000" w:firstRow="0" w:lastRow="0" w:firstColumn="1" w:lastColumn="0" w:oddVBand="0" w:evenVBand="0" w:oddHBand="0" w:evenHBand="0" w:firstRowFirstColumn="0" w:firstRowLastColumn="0" w:lastRowFirstColumn="0" w:lastRowLastColumn="0"/>
-            <w:tcW w:w="4495" w:type="dxa"/>
-            <w:hideMark/>
-          </w:tcPr>
-          <w:p>
-            <w:pPr>
-              <w:pStyle w:val="TableBody"/>
-              <w:rPr>
-                <w:sz w:val="20"/>
-                <w:szCs w:val="22"/>
-              </w:rPr>
-            </w:pPr>
-            <w:r>
-              <w:rPr>
-                <w:sz w:val="20"/>
-                <w:szCs w:val="22"/>
-              </w:rPr>
-              <w:t>Window U-Value / SHGC / VT</w:t>
-            </w:r>
-          </w:p>
-        </w:tc>
-        <w:tc>
-          <w:tcPr>
-            <w:tcW w:w="4860" w:type="dxa"/>
-            <w:hideMark/>
-          </w:tcPr>
-          <w:p>
-            <w:pPr>
-              <w:pStyle w:val="TableBody"/>
-              <w:cnfStyle w:val="000000010000" w:firstRow="0" w:lastRow="0" w:firstColumn="0" w:lastColumn="0" w:oddVBand="0" w:evenVBand="0" w:oddHBand="0" w:evenHBand="1" w:firstRowFirstColumn="0" w:firstRowLastColumn="0" w:lastRowFirstColumn="0" w:lastRowLastColumn="0"/>
-            </w:pPr>
-            <w:proofErr w:type="spellStart"/>
-            <w:r>
-              <w:t>idf</w:t>
-            </w:r>
-            <w:proofErr w:type="spellEnd"/>
-          </w:p>
-        </w:tc>
-      </w:tr>
-      <w:tr>
-        <w:trPr>
-          <w:cnfStyle w:val="000000100000" w:firstRow="0" w:lastRow="0" w:firstColumn="0" w:lastColumn="0" w:oddVBand="0" w:evenVBand="0" w:oddHBand="1" w:evenHBand="0" w:firstRowFirstColumn="0" w:firstRowLastColumn="0" w:lastRowFirstColumn="0" w:lastRowLastColumn="0"/>
-          <w:trHeight w:val="300"/>
-        </w:trPr>
-        <w:tc>
-          <w:tcPr>
-            <w:cnfStyle w:val="001000000000" w:firstRow="0" w:lastRow="0" w:firstColumn="1" w:lastColumn="0" w:oddVBand="0" w:evenVBand="0" w:oddHBand="0" w:evenHBand="0" w:firstRowFirstColumn="0" w:firstRowLastColumn="0" w:lastRowFirstColumn="0" w:lastRowLastColumn="0"/>
-            <w:tcW w:w="4495" w:type="dxa"/>
-            <w:hideMark/>
-          </w:tcPr>
-          <w:p>
-            <w:pPr>
-              <w:pStyle w:val="TableBody"/>
-              <w:rPr>
-                <w:sz w:val="20"/>
-                <w:szCs w:val="22"/>
-              </w:rPr>
-            </w:pPr>
-            <w:r>
-              <w:rPr>
-                <w:sz w:val="20"/>
-                <w:szCs w:val="22"/>
-              </w:rPr>
-              <w:t>HVAC Parameters</w:t>
+              <w:t>Thermostat Setpoints</w:t>
             </w:r>
           </w:p>
         </w:tc>
@@ -5840,7 +6681,10 @@
             </w:pPr>
             <w:proofErr w:type="spellStart"/>
             <w:r>
-              <w:t>idf</w:t>
+              <w:t>I</w:t>
+            </w:r>
+            <w:r>
+              <w:t>df</w:t>
             </w:r>
             <w:proofErr w:type="spellEnd"/>
           </w:p>
@@ -5870,7 +6714,28 @@
                 <w:sz w:val="20"/>
                 <w:szCs w:val="22"/>
               </w:rPr>
-              <w:t>Fan Parameters</w:t>
+              <w:t>Water Heater Properties</w:t>
+            </w:r>
+            <w:r>
+              <w:rPr>
+                <w:sz w:val="20"/>
+                <w:szCs w:val="22"/>
+              </w:rPr>
+              <w:t xml:space="preserve"> (</w:t>
+            </w:r>
+            <w:r>
+              <w:rPr>
+                <w:sz w:val="20"/>
+                <w:szCs w:val="22"/>
+              </w:rPr>
+              <w:t xml:space="preserve">including </w:t>
+            </w:r>
+            <w:r>
+              <w:rPr>
+                <w:sz w:val="20"/>
+                <w:szCs w:val="22"/>
+              </w:rPr>
+              <w:t>fuel type, system efficiency, capacity, tank volume and tank losses)</w:t>
             </w:r>
           </w:p>
         </w:tc>
@@ -5919,7 +6784,7 @@
                 <w:sz w:val="20"/>
                 <w:szCs w:val="22"/>
               </w:rPr>
-              <w:t>Gas Equipment</w:t>
+              <w:t>DHW Peak Flow by Zone</w:t>
             </w:r>
           </w:p>
         </w:tc>
@@ -5935,7 +6800,10 @@
             </w:pPr>
             <w:proofErr w:type="spellStart"/>
             <w:r>
-              <w:t>idf</w:t>
+              <w:t>I</w:t>
+            </w:r>
+            <w:r>
+              <w:t>df</w:t>
             </w:r>
             <w:proofErr w:type="spellEnd"/>
           </w:p>
@@ -5965,7 +6833,7 @@
                 <w:sz w:val="20"/>
                 <w:szCs w:val="22"/>
               </w:rPr>
-              <w:t>Refrigeration System</w:t>
+              <w:t>Total End Uses</w:t>
             </w:r>
           </w:p>
         </w:tc>
@@ -5979,11 +6847,12 @@
               <w:pStyle w:val="TableBody"/>
               <w:cnfStyle w:val="000000010000" w:firstRow="0" w:lastRow="0" w:firstColumn="0" w:lastColumn="0" w:oddVBand="0" w:evenVBand="0" w:oddHBand="0" w:evenHBand="1" w:firstRowFirstColumn="0" w:firstRowLastColumn="0" w:lastRowFirstColumn="0" w:lastRowLastColumn="0"/>
             </w:pPr>
-            <w:proofErr w:type="spellStart"/>
-            <w:r>
-              <w:t>idf</w:t>
-            </w:r>
-            <w:proofErr w:type="spellEnd"/>
+            <w:r>
+              <w:t>H</w:t>
+            </w:r>
+            <w:r>
+              <w:t>tml</w:t>
+            </w:r>
           </w:p>
         </w:tc>
       </w:tr>
@@ -6011,7 +6880,7 @@
                 <w:sz w:val="20"/>
                 <w:szCs w:val="22"/>
               </w:rPr>
-              <w:t>Thermostat Setpoints</w:t>
+              <w:t>End Use Breakdown</w:t>
             </w:r>
           </w:p>
         </w:tc>
@@ -6025,11 +6894,12 @@
               <w:pStyle w:val="TableBody"/>
               <w:cnfStyle w:val="000000100000" w:firstRow="0" w:lastRow="0" w:firstColumn="0" w:lastColumn="0" w:oddVBand="0" w:evenVBand="0" w:oddHBand="1" w:evenHBand="0" w:firstRowFirstColumn="0" w:firstRowLastColumn="0" w:lastRowFirstColumn="0" w:lastRowLastColumn="0"/>
             </w:pPr>
-            <w:proofErr w:type="spellStart"/>
-            <w:r>
-              <w:t>idf</w:t>
-            </w:r>
-            <w:proofErr w:type="spellEnd"/>
+            <w:r>
+              <w:t>H</w:t>
+            </w:r>
+            <w:r>
+              <w:t>tml</w:t>
+            </w:r>
           </w:p>
         </w:tc>
       </w:tr>
@@ -6057,7 +6927,7 @@
                 <w:sz w:val="20"/>
                 <w:szCs w:val="22"/>
               </w:rPr>
-              <w:t>Water Heater Properties</w:t>
+              <w:t>Annual Electricity / Gas</w:t>
             </w:r>
           </w:p>
         </w:tc>
@@ -6071,13 +6941,11 @@
               <w:pStyle w:val="TableBody"/>
               <w:cnfStyle w:val="000000010000" w:firstRow="0" w:lastRow="0" w:firstColumn="0" w:lastColumn="0" w:oddVBand="0" w:evenVBand="0" w:oddHBand="0" w:evenHBand="1" w:firstRowFirstColumn="0" w:firstRowLastColumn="0" w:lastRowFirstColumn="0" w:lastRowLastColumn="0"/>
             </w:pPr>
-            <w:proofErr w:type="spellStart"/>
-            <w:r>
-              <w:t>idf</w:t>
-            </w:r>
-            <w:proofErr w:type="spellEnd"/>
-            <w:r>
-              <w:t xml:space="preserve"> + html</w:t>
+            <w:r>
+              <w:t>H</w:t>
+            </w:r>
+            <w:r>
+              <w:t>tml</w:t>
             </w:r>
           </w:p>
         </w:tc>
@@ -6106,7 +6974,7 @@
                 <w:sz w:val="20"/>
                 <w:szCs w:val="22"/>
               </w:rPr>
-              <w:t>DHW Peak Flow by Zone</w:t>
+              <w:t>Schedule Profiles</w:t>
             </w:r>
           </w:p>
         </w:tc>
@@ -6122,6 +6990,14 @@
             </w:pPr>
             <w:proofErr w:type="spellStart"/>
             <w:r>
+              <w:t>eio</w:t>
+            </w:r>
+            <w:proofErr w:type="spellEnd"/>
+            <w:r>
+              <w:t xml:space="preserve"> + </w:t>
+            </w:r>
+            <w:proofErr w:type="spellStart"/>
+            <w:r>
               <w:t>idf</w:t>
             </w:r>
             <w:proofErr w:type="spellEnd"/>
@@ -6136,181 +7012,155 @@
         <w:tc>
           <w:tcPr>
             <w:cnfStyle w:val="001000000000" w:firstRow="0" w:lastRow="0" w:firstColumn="1" w:lastColumn="0" w:oddVBand="0" w:evenVBand="0" w:oddHBand="0" w:evenHBand="0" w:firstRowFirstColumn="0" w:firstRowLastColumn="0" w:lastRowFirstColumn="0" w:lastRowLastColumn="0"/>
-            <w:tcW w:w="4495" w:type="dxa"/>
-            <w:hideMark/>
+            <w:tcW w:w="9355" w:type="dxa"/>
+            <w:gridSpan w:val="2"/>
+            <w:tcBorders>
+              <w:top w:val="none" w:sz="0" w:space="0" w:color="auto"/>
+              <w:left w:val="none" w:sz="0" w:space="0" w:color="auto"/>
+              <w:bottom w:val="nil"/>
+              <w:right w:val="none" w:sz="0" w:space="0" w:color="auto"/>
+            </w:tcBorders>
+            <w:shd w:val="clear" w:color="auto" w:fill="auto"/>
           </w:tcPr>
           <w:p>
             <w:pPr>
               <w:pStyle w:val="TableBody"/>
               <w:rPr>
-                <w:sz w:val="20"/>
-                <w:szCs w:val="22"/>
+                <w:b w:val="0"/>
+                <w:bCs/>
               </w:rPr>
             </w:pPr>
             <w:r>
               <w:rPr>
-                <w:sz w:val="20"/>
-                <w:szCs w:val="22"/>
-              </w:rPr>
-              <w:t>Total End Uses</w:t>
+                <w:bCs/>
+                <w:vertAlign w:val="superscript"/>
+              </w:rPr>
+              <w:t>1</w:t>
+            </w:r>
+            <w:r>
+              <w:rPr>
+                <w:bCs/>
+              </w:rPr>
+              <w:t>Idf: EnergyPlus Input Data File for DEER nonresidential prototypes</w:t>
             </w:r>
           </w:p>
-        </w:tc>
-        <w:tc>
-          <w:tcPr>
-            <w:tcW w:w="4860" w:type="dxa"/>
-            <w:hideMark/>
-          </w:tcPr>
           <w:p>
             <w:pPr>
               <w:pStyle w:val="TableBody"/>
-              <w:cnfStyle w:val="000000010000" w:firstRow="0" w:lastRow="0" w:firstColumn="0" w:lastColumn="0" w:oddVBand="0" w:evenVBand="0" w:oddHBand="0" w:evenHBand="1" w:firstRowFirstColumn="0" w:firstRowLastColumn="0" w:lastRowFirstColumn="0" w:lastRowLastColumn="0"/>
+              <w:rPr>
+                <w:b w:val="0"/>
+                <w:bCs/>
+              </w:rPr>
             </w:pPr>
             <w:r>
-              <w:t>html</w:t>
+              <w:rPr>
+                <w:bCs/>
+                <w:vertAlign w:val="superscript"/>
+              </w:rPr>
+              <w:t>2</w:t>
+            </w:r>
+            <w:r>
+              <w:rPr>
+                <w:bCs/>
+              </w:rPr>
+              <w:t>Html: result file produced by EnergyPlus simulation</w:t>
             </w:r>
           </w:p>
-        </w:tc>
-      </w:tr>
-      <w:tr>
-        <w:trPr>
-          <w:cnfStyle w:val="000000100000" w:firstRow="0" w:lastRow="0" w:firstColumn="0" w:lastColumn="0" w:oddVBand="0" w:evenVBand="0" w:oddHBand="1" w:evenHBand="0" w:firstRowFirstColumn="0" w:firstRowLastColumn="0" w:lastRowFirstColumn="0" w:lastRowLastColumn="0"/>
-          <w:trHeight w:val="300"/>
-        </w:trPr>
-        <w:tc>
-          <w:tcPr>
-            <w:cnfStyle w:val="001000000000" w:firstRow="0" w:lastRow="0" w:firstColumn="1" w:lastColumn="0" w:oddVBand="0" w:evenVBand="0" w:oddHBand="0" w:evenHBand="0" w:firstRowFirstColumn="0" w:firstRowLastColumn="0" w:lastRowFirstColumn="0" w:lastRowLastColumn="0"/>
-            <w:tcW w:w="4495" w:type="dxa"/>
-            <w:hideMark/>
-          </w:tcPr>
           <w:p>
             <w:pPr>
               <w:pStyle w:val="TableBody"/>
               <w:rPr>
-                <w:sz w:val="20"/>
-                <w:szCs w:val="22"/>
+                <w:b w:val="0"/>
+                <w:bCs/>
               </w:rPr>
             </w:pPr>
             <w:r>
               <w:rPr>
-                <w:sz w:val="20"/>
-                <w:szCs w:val="22"/>
-              </w:rPr>
-              <w:t>End Use Breakdown</w:t>
+                <w:bCs/>
+                <w:vertAlign w:val="superscript"/>
+              </w:rPr>
+              <w:t>3</w:t>
+            </w:r>
+            <w:r>
+              <w:rPr>
+                <w:bCs/>
+              </w:rPr>
+              <w:t>Eio: EnergyPlus Invariant Output file generated after EnergyPlus simulation</w:t>
             </w:r>
           </w:p>
-        </w:tc>
-        <w:tc>
-          <w:tcPr>
-            <w:tcW w:w="4860" w:type="dxa"/>
-            <w:hideMark/>
-          </w:tcPr>
           <w:p>
             <w:pPr>
               <w:pStyle w:val="TableBody"/>
-              <w:cnfStyle w:val="000000100000" w:firstRow="0" w:lastRow="0" w:firstColumn="0" w:lastColumn="0" w:oddVBand="0" w:evenVBand="0" w:oddHBand="1" w:evenHBand="0" w:firstRowFirstColumn="0" w:firstRowLastColumn="0" w:lastRowFirstColumn="0" w:lastRowLastColumn="0"/>
             </w:pPr>
             <w:r>
-              <w:t>html</w:t>
-            </w:r>
-          </w:p>
-        </w:tc>
-      </w:tr>
-      <w:tr>
-        <w:trPr>
-          <w:cnfStyle w:val="000000010000" w:firstRow="0" w:lastRow="0" w:firstColumn="0" w:lastColumn="0" w:oddVBand="0" w:evenVBand="0" w:oddHBand="0" w:evenHBand="1" w:firstRowFirstColumn="0" w:firstRowLastColumn="0" w:lastRowFirstColumn="0" w:lastRowLastColumn="0"/>
-          <w:trHeight w:val="300"/>
-        </w:trPr>
-        <w:tc>
-          <w:tcPr>
-            <w:cnfStyle w:val="001000000000" w:firstRow="0" w:lastRow="0" w:firstColumn="1" w:lastColumn="0" w:oddVBand="0" w:evenVBand="0" w:oddHBand="0" w:evenHBand="0" w:firstRowFirstColumn="0" w:firstRowLastColumn="0" w:lastRowFirstColumn="0" w:lastRowLastColumn="0"/>
-            <w:tcW w:w="4495" w:type="dxa"/>
-            <w:hideMark/>
-          </w:tcPr>
-          <w:p>
-            <w:pPr>
-              <w:pStyle w:val="TableBody"/>
-              <w:rPr>
-                <w:sz w:val="20"/>
-                <w:szCs w:val="22"/>
-              </w:rPr>
-            </w:pPr>
-            <w:r>
-              <w:rPr>
-                <w:sz w:val="20"/>
-                <w:szCs w:val="22"/>
-              </w:rPr>
-              <w:t>Annual Electricity / Gas</w:t>
-            </w:r>
-          </w:p>
-        </w:tc>
-        <w:tc>
-          <w:tcPr>
-            <w:tcW w:w="4860" w:type="dxa"/>
-            <w:hideMark/>
-          </w:tcPr>
-          <w:p>
-            <w:pPr>
-              <w:pStyle w:val="TableBody"/>
-              <w:cnfStyle w:val="000000010000" w:firstRow="0" w:lastRow="0" w:firstColumn="0" w:lastColumn="0" w:oddVBand="0" w:evenVBand="0" w:oddHBand="0" w:evenHBand="1" w:firstRowFirstColumn="0" w:firstRowLastColumn="0" w:lastRowFirstColumn="0" w:lastRowLastColumn="0"/>
-            </w:pPr>
-            <w:r>
-              <w:t>html</w:t>
-            </w:r>
-          </w:p>
-        </w:tc>
-      </w:tr>
-      <w:tr>
-        <w:trPr>
-          <w:cnfStyle w:val="000000100000" w:firstRow="0" w:lastRow="0" w:firstColumn="0" w:lastColumn="0" w:oddVBand="0" w:evenVBand="0" w:oddHBand="1" w:evenHBand="0" w:firstRowFirstColumn="0" w:firstRowLastColumn="0" w:lastRowFirstColumn="0" w:lastRowLastColumn="0"/>
-          <w:trHeight w:val="300"/>
-        </w:trPr>
-        <w:tc>
-          <w:tcPr>
-            <w:cnfStyle w:val="001000000000" w:firstRow="0" w:lastRow="0" w:firstColumn="1" w:lastColumn="0" w:oddVBand="0" w:evenVBand="0" w:oddHBand="0" w:evenHBand="0" w:firstRowFirstColumn="0" w:firstRowLastColumn="0" w:lastRowFirstColumn="0" w:lastRowLastColumn="0"/>
-            <w:tcW w:w="4495" w:type="dxa"/>
-            <w:hideMark/>
-          </w:tcPr>
-          <w:p>
-            <w:pPr>
-              <w:pStyle w:val="TableBody"/>
-              <w:rPr>
-                <w:sz w:val="20"/>
-                <w:szCs w:val="22"/>
-              </w:rPr>
-            </w:pPr>
-            <w:r>
-              <w:rPr>
-                <w:sz w:val="20"/>
-                <w:szCs w:val="22"/>
-              </w:rPr>
-              <w:t>Schedule Profiles</w:t>
-            </w:r>
-          </w:p>
-        </w:tc>
-        <w:tc>
-          <w:tcPr>
-            <w:tcW w:w="4860" w:type="dxa"/>
-            <w:hideMark/>
-          </w:tcPr>
-          <w:p>
-            <w:pPr>
-              <w:pStyle w:val="TableBody"/>
-              <w:cnfStyle w:val="000000100000" w:firstRow="0" w:lastRow="0" w:firstColumn="0" w:lastColumn="0" w:oddVBand="0" w:evenVBand="0" w:oddHBand="1" w:evenHBand="0" w:firstRowFirstColumn="0" w:firstRowLastColumn="0" w:lastRowFirstColumn="0" w:lastRowLastColumn="0"/>
-            </w:pPr>
+              <w:rPr>
+                <w:bCs/>
+                <w:vertAlign w:val="superscript"/>
+              </w:rPr>
+              <w:t>4</w:t>
+            </w:r>
+            <w:r>
+              <w:rPr>
+                <w:bCs/>
+              </w:rPr>
+              <w:t xml:space="preserve">Pxt: prototype root template in </w:t>
+            </w:r>
+            <w:r>
+              <w:rPr>
+                <w:b w:val="0"/>
+                <w:bCs/>
+              </w:rPr>
+              <w:t xml:space="preserve">the </w:t>
+            </w:r>
+            <w:r>
+              <w:rPr>
+                <w:bCs/>
+              </w:rPr>
+              <w:t>DEER-Prototypes-EnergyPlus repository</w:t>
+            </w:r>
+            <w:r>
+              <w:rPr>
+                <w:b w:val="0"/>
+                <w:bCs/>
+              </w:rPr>
+              <w:t>, located at</w:t>
+            </w:r>
+            <w:r>
+              <w:rPr>
+                <w:bCs/>
+              </w:rPr>
+              <w:t xml:space="preserve"> DEER-Prototypes-</w:t>
+            </w:r>
             <w:proofErr w:type="spellStart"/>
             <w:r>
-              <w:t>eio</w:t>
+              <w:rPr>
+                <w:bCs/>
+              </w:rPr>
+              <w:t>EnergyPlus</w:t>
             </w:r>
             <w:proofErr w:type="spellEnd"/>
             <w:r>
-              <w:t xml:space="preserve"> + </w:t>
+              <w:rPr>
+                <w:bCs/>
+              </w:rPr>
+              <w:t xml:space="preserve">/prototypes/&lt;DEER </w:t>
             </w:r>
             <w:proofErr w:type="spellStart"/>
-            <w:r>
-              <w:t>idf</w:t>
+            <w:proofErr w:type="gramStart"/>
+            <w:r>
+              <w:rPr>
+                <w:bCs/>
+              </w:rPr>
+              <w:t>non residential</w:t>
             </w:r>
             <w:proofErr w:type="spellEnd"/>
+            <w:proofErr w:type="gramEnd"/>
+            <w:r>
+              <w:rPr>
+                <w:bCs/>
+              </w:rPr>
+              <w:t xml:space="preserve"> prototype abbreviation&gt;/templates/root.pxt</w:t>
+            </w:r>
           </w:p>
         </w:tc>
       </w:tr>
@@ -6322,26 +7172,10 @@
     </w:p>
     <w:p>
       <w:pPr>
-        <w:pStyle w:val="Body"/>
-      </w:pPr>
-    </w:p>
-    <w:p>
-      <w:pPr>
-        <w:pStyle w:val="Body"/>
-      </w:pPr>
-    </w:p>
-    <w:p>
-      <w:pPr>
-        <w:pStyle w:val="Body"/>
-      </w:pPr>
-    </w:p>
-    <w:p>
-      <w:pPr>
         <w:pStyle w:val="Caption"/>
       </w:pPr>
       <w:bookmarkStart w:id="14" w:name="_Ref223086583"/>
       <w:r>
-        <w:lastRenderedPageBreak/>
         <w:t xml:space="preserve">Table A. </w:t>
       </w:r>
       <w:r>
@@ -6360,6 +7194,9 @@
         <w:t>2</w:t>
       </w:r>
       <w:r>
+        <w:rPr>
+          <w:noProof/>
+        </w:rPr>
         <w:fldChar w:fldCharType="end"/>
       </w:r>
       <w:bookmarkEnd w:id="14"/>
@@ -6375,8 +7212,8 @@
       </w:tblPr>
       <w:tblGrid>
         <w:gridCol w:w="2150"/>
-        <w:gridCol w:w="1471"/>
-        <w:gridCol w:w="2669"/>
+        <w:gridCol w:w="1715"/>
+        <w:gridCol w:w="2425"/>
         <w:gridCol w:w="3690"/>
       </w:tblGrid>
       <w:tr>
@@ -6407,7 +7244,7 @@
         </w:tc>
         <w:tc>
           <w:tcPr>
-            <w:tcW w:w="1471" w:type="dxa"/>
+            <w:tcW w:w="1715" w:type="dxa"/>
             <w:hideMark/>
           </w:tcPr>
           <w:p>
@@ -6428,7 +7265,7 @@
         </w:tc>
         <w:tc>
           <w:tcPr>
-            <w:tcW w:w="2669" w:type="dxa"/>
+            <w:tcW w:w="2425" w:type="dxa"/>
             <w:hideMark/>
           </w:tcPr>
           <w:p>
@@ -6511,7 +7348,7 @@
         </w:tc>
         <w:tc>
           <w:tcPr>
-            <w:tcW w:w="1471" w:type="dxa"/>
+            <w:tcW w:w="1715" w:type="dxa"/>
             <w:hideMark/>
           </w:tcPr>
           <w:p>
@@ -6526,7 +7363,7 @@
         </w:tc>
         <w:tc>
           <w:tcPr>
-            <w:tcW w:w="2669" w:type="dxa"/>
+            <w:tcW w:w="2425" w:type="dxa"/>
             <w:hideMark/>
           </w:tcPr>
           <w:p>
@@ -6614,7 +7451,7 @@
         </w:tc>
         <w:tc>
           <w:tcPr>
-            <w:tcW w:w="1471" w:type="dxa"/>
+            <w:tcW w:w="1715" w:type="dxa"/>
             <w:hideMark/>
           </w:tcPr>
           <w:p>
@@ -6629,7 +7466,7 @@
         </w:tc>
         <w:tc>
           <w:tcPr>
-            <w:tcW w:w="2669" w:type="dxa"/>
+            <w:tcW w:w="2425" w:type="dxa"/>
             <w:hideMark/>
           </w:tcPr>
           <w:p>
@@ -6639,6 +7476,162 @@
             </w:pPr>
             <w:r>
               <w:t>ft</w:t>
+            </w:r>
+          </w:p>
+        </w:tc>
+        <w:tc>
+          <w:tcPr>
+            <w:tcW w:w="3690" w:type="dxa"/>
+            <w:vMerge/>
+            <w:hideMark/>
+          </w:tcPr>
+          <w:p>
+            <w:pPr>
+              <w:pStyle w:val="TableBody"/>
+              <w:cnfStyle w:val="000000010000" w:firstRow="0" w:lastRow="0" w:firstColumn="0" w:lastColumn="0" w:oddVBand="0" w:evenVBand="0" w:oddHBand="0" w:evenHBand="1" w:firstRowFirstColumn="0" w:firstRowLastColumn="0" w:lastRowFirstColumn="0" w:lastRowLastColumn="0"/>
+            </w:pPr>
+          </w:p>
+        </w:tc>
+      </w:tr>
+      <w:tr>
+        <w:trPr>
+          <w:cnfStyle w:val="000000100000" w:firstRow="0" w:lastRow="0" w:firstColumn="0" w:lastColumn="0" w:oddVBand="0" w:evenVBand="0" w:oddHBand="1" w:evenHBand="0" w:firstRowFirstColumn="0" w:firstRowLastColumn="0" w:lastRowFirstColumn="0" w:lastRowLastColumn="0"/>
+          <w:trHeight w:val="300"/>
+        </w:trPr>
+        <w:tc>
+          <w:tcPr>
+            <w:cnfStyle w:val="001000000000" w:firstRow="0" w:lastRow="0" w:firstColumn="1" w:lastColumn="0" w:oddVBand="0" w:evenVBand="0" w:oddHBand="0" w:evenHBand="0" w:firstRowFirstColumn="0" w:firstRowLastColumn="0" w:lastRowFirstColumn="0" w:lastRowLastColumn="0"/>
+            <w:tcW w:w="2150" w:type="dxa"/>
+          </w:tcPr>
+          <w:p>
+            <w:pPr>
+              <w:pStyle w:val="TableBody"/>
+              <w:rPr>
+                <w:szCs w:val="22"/>
+              </w:rPr>
+            </w:pPr>
+            <w:r>
+              <w:rPr>
+                <w:szCs w:val="22"/>
+              </w:rPr>
+              <w:t>People density</w:t>
+            </w:r>
+          </w:p>
+        </w:tc>
+        <w:tc>
+          <w:tcPr>
+            <w:tcW w:w="1715" w:type="dxa"/>
+          </w:tcPr>
+          <w:p>
+            <w:pPr>
+              <w:pStyle w:val="TableBody"/>
+              <w:cnfStyle w:val="000000100000" w:firstRow="0" w:lastRow="0" w:firstColumn="0" w:lastColumn="0" w:oddVBand="0" w:evenVBand="0" w:oddHBand="1" w:evenHBand="0" w:firstRowFirstColumn="0" w:firstRowLastColumn="0" w:lastRowFirstColumn="0" w:lastRowLastColumn="0"/>
+            </w:pPr>
+            <w:r>
+              <w:t>ft</w:t>
+            </w:r>
+            <w:r>
+              <w:rPr>
+                <w:vertAlign w:val="superscript"/>
+              </w:rPr>
+              <w:t xml:space="preserve">2 </w:t>
+            </w:r>
+            <w:r>
+              <w:t>per person</w:t>
+            </w:r>
+          </w:p>
+        </w:tc>
+        <w:tc>
+          <w:tcPr>
+            <w:tcW w:w="2425" w:type="dxa"/>
+          </w:tcPr>
+          <w:p>
+            <w:pPr>
+              <w:pStyle w:val="TableBody"/>
+              <w:cnfStyle w:val="000000100000" w:firstRow="0" w:lastRow="0" w:firstColumn="0" w:lastColumn="0" w:oddVBand="0" w:evenVBand="0" w:oddHBand="1" w:evenHBand="0" w:firstRowFirstColumn="0" w:firstRowLastColumn="0" w:lastRowFirstColumn="0" w:lastRowLastColumn="0"/>
+            </w:pPr>
+            <w:r>
+              <w:t>p</w:t>
+            </w:r>
+            <w:r>
+              <w:t>ersons/1000 ft</w:t>
+            </w:r>
+            <w:r>
+              <w:rPr>
+                <w:vertAlign w:val="superscript"/>
+              </w:rPr>
+              <w:t>2</w:t>
+            </w:r>
+          </w:p>
+        </w:tc>
+        <w:tc>
+          <w:tcPr>
+            <w:tcW w:w="3690" w:type="dxa"/>
+            <w:vMerge/>
+          </w:tcPr>
+          <w:p>
+            <w:pPr>
+              <w:pStyle w:val="TableBody"/>
+              <w:cnfStyle w:val="000000100000" w:firstRow="0" w:lastRow="0" w:firstColumn="0" w:lastColumn="0" w:oddVBand="0" w:evenVBand="0" w:oddHBand="1" w:evenHBand="0" w:firstRowFirstColumn="0" w:firstRowLastColumn="0" w:lastRowFirstColumn="0" w:lastRowLastColumn="0"/>
+            </w:pPr>
+          </w:p>
+        </w:tc>
+      </w:tr>
+      <w:tr>
+        <w:trPr>
+          <w:cnfStyle w:val="000000010000" w:firstRow="0" w:lastRow="0" w:firstColumn="0" w:lastColumn="0" w:oddVBand="0" w:evenVBand="0" w:oddHBand="0" w:evenHBand="1" w:firstRowFirstColumn="0" w:firstRowLastColumn="0" w:lastRowFirstColumn="0" w:lastRowLastColumn="0"/>
+          <w:trHeight w:val="300"/>
+        </w:trPr>
+        <w:tc>
+          <w:tcPr>
+            <w:cnfStyle w:val="001000000000" w:firstRow="0" w:lastRow="0" w:firstColumn="1" w:lastColumn="0" w:oddVBand="0" w:evenVBand="0" w:oddHBand="0" w:evenHBand="0" w:firstRowFirstColumn="0" w:firstRowLastColumn="0" w:lastRowFirstColumn="0" w:lastRowLastColumn="0"/>
+            <w:tcW w:w="2150" w:type="dxa"/>
+            <w:hideMark/>
+          </w:tcPr>
+          <w:p>
+            <w:pPr>
+              <w:pStyle w:val="TableBody"/>
+              <w:rPr>
+                <w:sz w:val="20"/>
+                <w:szCs w:val="22"/>
+              </w:rPr>
+            </w:pPr>
+            <w:r>
+              <w:rPr>
+                <w:sz w:val="20"/>
+                <w:szCs w:val="22"/>
+              </w:rPr>
+              <w:t>OA flow per person</w:t>
+            </w:r>
+          </w:p>
+        </w:tc>
+        <w:tc>
+          <w:tcPr>
+            <w:tcW w:w="1715" w:type="dxa"/>
+            <w:hideMark/>
+          </w:tcPr>
+          <w:p>
+            <w:pPr>
+              <w:pStyle w:val="TableBody"/>
+              <w:cnfStyle w:val="000000010000" w:firstRow="0" w:lastRow="0" w:firstColumn="0" w:lastColumn="0" w:oddVBand="0" w:evenVBand="0" w:oddHBand="0" w:evenHBand="1" w:firstRowFirstColumn="0" w:firstRowLastColumn="0" w:lastRowFirstColumn="0" w:lastRowLastColumn="0"/>
+            </w:pPr>
+            <w:r>
+              <w:t>m³/s-person</w:t>
+            </w:r>
+          </w:p>
+        </w:tc>
+        <w:tc>
+          <w:tcPr>
+            <w:tcW w:w="2425" w:type="dxa"/>
+            <w:hideMark/>
+          </w:tcPr>
+          <w:p>
+            <w:pPr>
+              <w:pStyle w:val="TableBody"/>
+              <w:cnfStyle w:val="000000010000" w:firstRow="0" w:lastRow="0" w:firstColumn="0" w:lastColumn="0" w:oddVBand="0" w:evenVBand="0" w:oddHBand="0" w:evenHBand="1" w:firstRowFirstColumn="0" w:firstRowLastColumn="0" w:lastRowFirstColumn="0" w:lastRowLastColumn="0"/>
+            </w:pPr>
+            <w:r>
+              <w:t>cfm/person</w:t>
             </w:r>
           </w:p>
         </w:tc>
@@ -6680,13 +7673,13 @@
                 <w:sz w:val="20"/>
                 <w:szCs w:val="22"/>
               </w:rPr>
-              <w:t>OA flow per person</w:t>
+              <w:t>OA flow per floor area</w:t>
             </w:r>
           </w:p>
         </w:tc>
         <w:tc>
           <w:tcPr>
-            <w:tcW w:w="1471" w:type="dxa"/>
+            <w:tcW w:w="1715" w:type="dxa"/>
             <w:hideMark/>
           </w:tcPr>
           <w:p>
@@ -6695,13 +7688,13 @@
               <w:cnfStyle w:val="000000100000" w:firstRow="0" w:lastRow="0" w:firstColumn="0" w:lastColumn="0" w:oddVBand="0" w:evenVBand="0" w:oddHBand="1" w:evenHBand="0" w:firstRowFirstColumn="0" w:firstRowLastColumn="0" w:lastRowFirstColumn="0" w:lastRowLastColumn="0"/>
             </w:pPr>
             <w:r>
-              <w:t>m³/s-person</w:t>
+              <w:t>m³/s·m²</w:t>
             </w:r>
           </w:p>
         </w:tc>
         <w:tc>
           <w:tcPr>
-            <w:tcW w:w="2669" w:type="dxa"/>
+            <w:tcW w:w="2425" w:type="dxa"/>
             <w:hideMark/>
           </w:tcPr>
           <w:p>
@@ -6710,7 +7703,7 @@
               <w:cnfStyle w:val="000000100000" w:firstRow="0" w:lastRow="0" w:firstColumn="0" w:lastColumn="0" w:oddVBand="0" w:evenVBand="0" w:oddHBand="1" w:evenHBand="0" w:firstRowFirstColumn="0" w:firstRowLastColumn="0" w:lastRowFirstColumn="0" w:lastRowLastColumn="0"/>
             </w:pPr>
             <w:r>
-              <w:t>cfm/person</w:t>
+              <w:t>cfm/ft²</w:t>
             </w:r>
           </w:p>
         </w:tc>
@@ -6752,13 +7745,13 @@
                 <w:sz w:val="20"/>
                 <w:szCs w:val="22"/>
               </w:rPr>
-              <w:t>OA flow per floor area</w:t>
+              <w:t>Infiltration rate</w:t>
             </w:r>
           </w:p>
         </w:tc>
         <w:tc>
           <w:tcPr>
-            <w:tcW w:w="1471" w:type="dxa"/>
+            <w:tcW w:w="1715" w:type="dxa"/>
             <w:hideMark/>
           </w:tcPr>
           <w:p>
@@ -6773,7 +7766,7 @@
         </w:tc>
         <w:tc>
           <w:tcPr>
-            <w:tcW w:w="2669" w:type="dxa"/>
+            <w:tcW w:w="2425" w:type="dxa"/>
             <w:hideMark/>
           </w:tcPr>
           <w:p>
@@ -6824,13 +7817,13 @@
                 <w:sz w:val="20"/>
                 <w:szCs w:val="22"/>
               </w:rPr>
-              <w:t>Infiltration rate</w:t>
+              <w:t>Gas equipment power density</w:t>
             </w:r>
           </w:p>
         </w:tc>
         <w:tc>
           <w:tcPr>
-            <w:tcW w:w="1471" w:type="dxa"/>
+            <w:tcW w:w="1715" w:type="dxa"/>
             <w:hideMark/>
           </w:tcPr>
           <w:p>
@@ -6839,13 +7832,13 @@
               <w:cnfStyle w:val="000000100000" w:firstRow="0" w:lastRow="0" w:firstColumn="0" w:lastColumn="0" w:oddVBand="0" w:evenVBand="0" w:oddHBand="1" w:evenHBand="0" w:firstRowFirstColumn="0" w:firstRowLastColumn="0" w:lastRowFirstColumn="0" w:lastRowLastColumn="0"/>
             </w:pPr>
             <w:r>
-              <w:t>m³/s·m²</w:t>
+              <w:t>W/m²</w:t>
             </w:r>
           </w:p>
         </w:tc>
         <w:tc>
           <w:tcPr>
-            <w:tcW w:w="2669" w:type="dxa"/>
+            <w:tcW w:w="2425" w:type="dxa"/>
             <w:hideMark/>
           </w:tcPr>
           <w:p>
@@ -6854,7 +7847,7 @@
               <w:cnfStyle w:val="000000100000" w:firstRow="0" w:lastRow="0" w:firstColumn="0" w:lastColumn="0" w:oddVBand="0" w:evenVBand="0" w:oddHBand="1" w:evenHBand="0" w:firstRowFirstColumn="0" w:firstRowLastColumn="0" w:lastRowFirstColumn="0" w:lastRowLastColumn="0"/>
             </w:pPr>
             <w:r>
-              <w:t>cfm/ft²</w:t>
+              <w:t>Btu/h-ft²</w:t>
             </w:r>
           </w:p>
         </w:tc>
@@ -6896,13 +7889,13 @@
                 <w:sz w:val="20"/>
                 <w:szCs w:val="22"/>
               </w:rPr>
-              <w:t>Gas equipment power density</w:t>
+              <w:t>Fan static pressure</w:t>
             </w:r>
           </w:p>
         </w:tc>
         <w:tc>
           <w:tcPr>
-            <w:tcW w:w="1471" w:type="dxa"/>
+            <w:tcW w:w="1715" w:type="dxa"/>
             <w:hideMark/>
           </w:tcPr>
           <w:p>
@@ -6911,13 +7904,13 @@
               <w:cnfStyle w:val="000000010000" w:firstRow="0" w:lastRow="0" w:firstColumn="0" w:lastColumn="0" w:oddVBand="0" w:evenVBand="0" w:oddHBand="0" w:evenHBand="1" w:firstRowFirstColumn="0" w:firstRowLastColumn="0" w:lastRowFirstColumn="0" w:lastRowLastColumn="0"/>
             </w:pPr>
             <w:r>
-              <w:t>W/m²</w:t>
+              <w:t>Pa</w:t>
             </w:r>
           </w:p>
         </w:tc>
         <w:tc>
           <w:tcPr>
-            <w:tcW w:w="2669" w:type="dxa"/>
+            <w:tcW w:w="2425" w:type="dxa"/>
             <w:hideMark/>
           </w:tcPr>
           <w:p>
@@ -6926,7 +7919,7 @@
               <w:cnfStyle w:val="000000010000" w:firstRow="0" w:lastRow="0" w:firstColumn="0" w:lastColumn="0" w:oddVBand="0" w:evenVBand="0" w:oddHBand="0" w:evenHBand="1" w:firstRowFirstColumn="0" w:firstRowLastColumn="0" w:lastRowFirstColumn="0" w:lastRowLastColumn="0"/>
             </w:pPr>
             <w:r>
-              <w:t>Btu/h-ft²</w:t>
+              <w:t>in. w.c.</w:t>
             </w:r>
           </w:p>
         </w:tc>
@@ -6968,13 +7961,13 @@
                 <w:sz w:val="20"/>
                 <w:szCs w:val="22"/>
               </w:rPr>
-              <w:t>Fan static pressure</w:t>
+              <w:t>Window U-value</w:t>
             </w:r>
           </w:p>
         </w:tc>
         <w:tc>
           <w:tcPr>
-            <w:tcW w:w="1471" w:type="dxa"/>
+            <w:tcW w:w="1715" w:type="dxa"/>
             <w:hideMark/>
           </w:tcPr>
           <w:p>
@@ -6983,13 +7976,13 @@
               <w:cnfStyle w:val="000000100000" w:firstRow="0" w:lastRow="0" w:firstColumn="0" w:lastColumn="0" w:oddVBand="0" w:evenVBand="0" w:oddHBand="1" w:evenHBand="0" w:firstRowFirstColumn="0" w:firstRowLastColumn="0" w:lastRowFirstColumn="0" w:lastRowLastColumn="0"/>
             </w:pPr>
             <w:r>
-              <w:t>Pa</w:t>
+              <w:t>W/m²·K</w:t>
             </w:r>
           </w:p>
         </w:tc>
         <w:tc>
           <w:tcPr>
-            <w:tcW w:w="2669" w:type="dxa"/>
+            <w:tcW w:w="2425" w:type="dxa"/>
             <w:hideMark/>
           </w:tcPr>
           <w:p>
@@ -6998,7 +7991,7 @@
               <w:cnfStyle w:val="000000100000" w:firstRow="0" w:lastRow="0" w:firstColumn="0" w:lastColumn="0" w:oddVBand="0" w:evenVBand="0" w:oddHBand="1" w:evenHBand="0" w:firstRowFirstColumn="0" w:firstRowLastColumn="0" w:lastRowFirstColumn="0" w:lastRowLastColumn="0"/>
             </w:pPr>
             <w:r>
-              <w:t>in. w.c.</w:t>
+              <w:t>Btu/h-ft²-°F</w:t>
             </w:r>
           </w:p>
         </w:tc>
@@ -7040,13 +8033,13 @@
                 <w:sz w:val="20"/>
                 <w:szCs w:val="22"/>
               </w:rPr>
-              <w:t>Window U-value</w:t>
+              <w:t>DHW peak flow</w:t>
             </w:r>
           </w:p>
         </w:tc>
         <w:tc>
           <w:tcPr>
-            <w:tcW w:w="1471" w:type="dxa"/>
+            <w:tcW w:w="1715" w:type="dxa"/>
             <w:hideMark/>
           </w:tcPr>
           <w:p>
@@ -7055,13 +8048,13 @@
               <w:cnfStyle w:val="000000010000" w:firstRow="0" w:lastRow="0" w:firstColumn="0" w:lastColumn="0" w:oddVBand="0" w:evenVBand="0" w:oddHBand="0" w:evenHBand="1" w:firstRowFirstColumn="0" w:firstRowLastColumn="0" w:lastRowFirstColumn="0" w:lastRowLastColumn="0"/>
             </w:pPr>
             <w:r>
-              <w:t>W/m²·K</w:t>
+              <w:t>m³/s</w:t>
             </w:r>
           </w:p>
         </w:tc>
         <w:tc>
           <w:tcPr>
-            <w:tcW w:w="2669" w:type="dxa"/>
+            <w:tcW w:w="2425" w:type="dxa"/>
             <w:hideMark/>
           </w:tcPr>
           <w:p>
@@ -7070,8 +8063,13 @@
               <w:cnfStyle w:val="000000010000" w:firstRow="0" w:lastRow="0" w:firstColumn="0" w:lastColumn="0" w:oddVBand="0" w:evenVBand="0" w:oddHBand="0" w:evenHBand="1" w:firstRowFirstColumn="0" w:firstRowLastColumn="0" w:lastRowFirstColumn="0" w:lastRowLastColumn="0"/>
             </w:pPr>
             <w:r>
-              <w:t>Btu/h-ft²-°F</w:t>
-            </w:r>
+              <w:t>gal/</w:t>
+            </w:r>
+            <w:proofErr w:type="spellStart"/>
+            <w:r>
+              <w:t>hr</w:t>
+            </w:r>
+            <w:proofErr w:type="spellEnd"/>
           </w:p>
         </w:tc>
         <w:tc>
@@ -7112,13 +8110,13 @@
                 <w:sz w:val="20"/>
                 <w:szCs w:val="22"/>
               </w:rPr>
-              <w:t>DHW peak flow</w:t>
+              <w:t>Thermostat setpoints</w:t>
             </w:r>
           </w:p>
         </w:tc>
         <w:tc>
           <w:tcPr>
-            <w:tcW w:w="1471" w:type="dxa"/>
+            <w:tcW w:w="1715" w:type="dxa"/>
             <w:hideMark/>
           </w:tcPr>
           <w:p>
@@ -7127,13 +8125,13 @@
               <w:cnfStyle w:val="000000100000" w:firstRow="0" w:lastRow="0" w:firstColumn="0" w:lastColumn="0" w:oddVBand="0" w:evenVBand="0" w:oddHBand="1" w:evenHBand="0" w:firstRowFirstColumn="0" w:firstRowLastColumn="0" w:lastRowFirstColumn="0" w:lastRowLastColumn="0"/>
             </w:pPr>
             <w:r>
-              <w:t>m³/s</w:t>
+              <w:t>°C</w:t>
             </w:r>
           </w:p>
         </w:tc>
         <w:tc>
           <w:tcPr>
-            <w:tcW w:w="2669" w:type="dxa"/>
+            <w:tcW w:w="2425" w:type="dxa"/>
             <w:hideMark/>
           </w:tcPr>
           <w:p>
@@ -7142,19 +8140,14 @@
               <w:cnfStyle w:val="000000100000" w:firstRow="0" w:lastRow="0" w:firstColumn="0" w:lastColumn="0" w:oddVBand="0" w:evenVBand="0" w:oddHBand="1" w:evenHBand="0" w:firstRowFirstColumn="0" w:firstRowLastColumn="0" w:lastRowFirstColumn="0" w:lastRowLastColumn="0"/>
             </w:pPr>
             <w:r>
-              <w:t>gal/</w:t>
-            </w:r>
-            <w:proofErr w:type="spellStart"/>
-            <w:r>
-              <w:t>hr</w:t>
-            </w:r>
-            <w:proofErr w:type="spellEnd"/>
+              <w:t>°F</w:t>
+            </w:r>
           </w:p>
         </w:tc>
         <w:tc>
           <w:tcPr>
             <w:tcW w:w="3690" w:type="dxa"/>
-            <w:vMerge/>
+            <w:vMerge w:val="restart"/>
             <w:hideMark/>
           </w:tcPr>
           <w:p>
@@ -7162,6 +8155,9 @@
               <w:pStyle w:val="TableBody"/>
               <w:cnfStyle w:val="000000100000" w:firstRow="0" w:lastRow="0" w:firstColumn="0" w:lastColumn="0" w:oddVBand="0" w:evenVBand="0" w:oddHBand="1" w:evenHBand="0" w:firstRowFirstColumn="0" w:firstRowLastColumn="0" w:lastRowFirstColumn="0" w:lastRowLastColumn="0"/>
             </w:pPr>
+            <w:r>
+              <w:t>3_Intermediate_Process.py</w:t>
+            </w:r>
           </w:p>
         </w:tc>
       </w:tr>
@@ -7189,13 +8185,14 @@
                 <w:sz w:val="20"/>
                 <w:szCs w:val="22"/>
               </w:rPr>
-              <w:t>Thermostat setpoints</w:t>
+              <w:lastRenderedPageBreak/>
+              <w:t>Temperature setpoint schedules</w:t>
             </w:r>
           </w:p>
         </w:tc>
         <w:tc>
           <w:tcPr>
-            <w:tcW w:w="1471" w:type="dxa"/>
+            <w:tcW w:w="1715" w:type="dxa"/>
             <w:hideMark/>
           </w:tcPr>
           <w:p>
@@ -7210,7 +8207,7 @@
         </w:tc>
         <w:tc>
           <w:tcPr>
-            <w:tcW w:w="2669" w:type="dxa"/>
+            <w:tcW w:w="2425" w:type="dxa"/>
             <w:hideMark/>
           </w:tcPr>
           <w:p>
@@ -7226,17 +8223,17 @@
         <w:tc>
           <w:tcPr>
             <w:tcW w:w="3690" w:type="dxa"/>
-            <w:vMerge w:val="restart"/>
+            <w:vMerge/>
             <w:hideMark/>
           </w:tcPr>
           <w:p>
             <w:pPr>
-              <w:pStyle w:val="TableBody"/>
               <w:cnfStyle w:val="000000010000" w:firstRow="0" w:lastRow="0" w:firstColumn="0" w:lastColumn="0" w:oddVBand="0" w:evenVBand="0" w:oddHBand="0" w:evenHBand="1" w:firstRowFirstColumn="0" w:firstRowLastColumn="0" w:lastRowFirstColumn="0" w:lastRowLastColumn="0"/>
+              <w:rPr>
+                <w:rFonts w:ascii="Arial Unicode MS" w:eastAsia="Times New Roman" w:hAnsi="Arial Unicode MS" w:cs="Times New Roman"/>
+                <w:color w:val="000000"/>
+              </w:rPr>
             </w:pPr>
-            <w:r>
-              <w:t>3_Intermediate_Process.py</w:t>
-            </w:r>
           </w:p>
         </w:tc>
       </w:tr>
@@ -7264,13 +8261,13 @@
                 <w:sz w:val="20"/>
                 <w:szCs w:val="22"/>
               </w:rPr>
-              <w:t>Temperature setpoint schedules</w:t>
+              <w:t>Lighting / plug intensity</w:t>
             </w:r>
           </w:p>
         </w:tc>
         <w:tc>
           <w:tcPr>
-            <w:tcW w:w="1471" w:type="dxa"/>
+            <w:tcW w:w="1715" w:type="dxa"/>
             <w:hideMark/>
           </w:tcPr>
           <w:p>
@@ -7279,13 +8276,13 @@
               <w:cnfStyle w:val="000000100000" w:firstRow="0" w:lastRow="0" w:firstColumn="0" w:lastColumn="0" w:oddVBand="0" w:evenVBand="0" w:oddHBand="1" w:evenHBand="0" w:firstRowFirstColumn="0" w:firstRowLastColumn="0" w:lastRowFirstColumn="0" w:lastRowLastColumn="0"/>
             </w:pPr>
             <w:r>
-              <w:t>°C</w:t>
+              <w:t>Btu/h-ft²</w:t>
             </w:r>
           </w:p>
         </w:tc>
         <w:tc>
           <w:tcPr>
-            <w:tcW w:w="2669" w:type="dxa"/>
+            <w:tcW w:w="2425" w:type="dxa"/>
             <w:hideMark/>
           </w:tcPr>
           <w:p>
@@ -7294,7 +8291,7 @@
               <w:cnfStyle w:val="000000100000" w:firstRow="0" w:lastRow="0" w:firstColumn="0" w:lastColumn="0" w:oddVBand="0" w:evenVBand="0" w:oddHBand="1" w:evenHBand="0" w:firstRowFirstColumn="0" w:firstRowLastColumn="0" w:lastRowFirstColumn="0" w:lastRowLastColumn="0"/>
             </w:pPr>
             <w:r>
-              <w:t>°F</w:t>
+              <w:t>W/ft²</w:t>
             </w:r>
           </w:p>
         </w:tc>
@@ -7315,81 +8312,6 @@
           </w:p>
         </w:tc>
       </w:tr>
-      <w:tr>
-        <w:trPr>
-          <w:cnfStyle w:val="000000010000" w:firstRow="0" w:lastRow="0" w:firstColumn="0" w:lastColumn="0" w:oddVBand="0" w:evenVBand="0" w:oddHBand="0" w:evenHBand="1" w:firstRowFirstColumn="0" w:firstRowLastColumn="0" w:lastRowFirstColumn="0" w:lastRowLastColumn="0"/>
-          <w:trHeight w:val="300"/>
-        </w:trPr>
-        <w:tc>
-          <w:tcPr>
-            <w:cnfStyle w:val="001000000000" w:firstRow="0" w:lastRow="0" w:firstColumn="1" w:lastColumn="0" w:oddVBand="0" w:evenVBand="0" w:oddHBand="0" w:evenHBand="0" w:firstRowFirstColumn="0" w:firstRowLastColumn="0" w:lastRowFirstColumn="0" w:lastRowLastColumn="0"/>
-            <w:tcW w:w="2150" w:type="dxa"/>
-            <w:hideMark/>
-          </w:tcPr>
-          <w:p>
-            <w:pPr>
-              <w:pStyle w:val="TableBody"/>
-              <w:rPr>
-                <w:sz w:val="20"/>
-                <w:szCs w:val="22"/>
-              </w:rPr>
-            </w:pPr>
-            <w:r>
-              <w:rPr>
-                <w:sz w:val="20"/>
-                <w:szCs w:val="22"/>
-              </w:rPr>
-              <w:t>Lighting / plug intensity</w:t>
-            </w:r>
-          </w:p>
-        </w:tc>
-        <w:tc>
-          <w:tcPr>
-            <w:tcW w:w="1471" w:type="dxa"/>
-            <w:hideMark/>
-          </w:tcPr>
-          <w:p>
-            <w:pPr>
-              <w:pStyle w:val="TableBody"/>
-              <w:cnfStyle w:val="000000010000" w:firstRow="0" w:lastRow="0" w:firstColumn="0" w:lastColumn="0" w:oddVBand="0" w:evenVBand="0" w:oddHBand="0" w:evenHBand="1" w:firstRowFirstColumn="0" w:firstRowLastColumn="0" w:lastRowFirstColumn="0" w:lastRowLastColumn="0"/>
-            </w:pPr>
-            <w:r>
-              <w:t>Btu/h-ft²</w:t>
-            </w:r>
-          </w:p>
-        </w:tc>
-        <w:tc>
-          <w:tcPr>
-            <w:tcW w:w="2669" w:type="dxa"/>
-            <w:hideMark/>
-          </w:tcPr>
-          <w:p>
-            <w:pPr>
-              <w:pStyle w:val="TableBody"/>
-              <w:cnfStyle w:val="000000010000" w:firstRow="0" w:lastRow="0" w:firstColumn="0" w:lastColumn="0" w:oddVBand="0" w:evenVBand="0" w:oddHBand="0" w:evenHBand="1" w:firstRowFirstColumn="0" w:firstRowLastColumn="0" w:lastRowFirstColumn="0" w:lastRowLastColumn="0"/>
-            </w:pPr>
-            <w:r>
-              <w:t>W/ft²</w:t>
-            </w:r>
-          </w:p>
-        </w:tc>
-        <w:tc>
-          <w:tcPr>
-            <w:tcW w:w="3690" w:type="dxa"/>
-            <w:vMerge/>
-            <w:hideMark/>
-          </w:tcPr>
-          <w:p>
-            <w:pPr>
-              <w:cnfStyle w:val="000000010000" w:firstRow="0" w:lastRow="0" w:firstColumn="0" w:lastColumn="0" w:oddVBand="0" w:evenVBand="0" w:oddHBand="0" w:evenHBand="1" w:firstRowFirstColumn="0" w:firstRowLastColumn="0" w:lastRowFirstColumn="0" w:lastRowLastColumn="0"/>
-              <w:rPr>
-                <w:rFonts w:ascii="Arial Unicode MS" w:eastAsia="Times New Roman" w:hAnsi="Arial Unicode MS" w:cs="Times New Roman"/>
-                <w:color w:val="000000"/>
-              </w:rPr>
-            </w:pPr>
-          </w:p>
-        </w:tc>
-      </w:tr>
     </w:tbl>
     <w:p>
       <w:pPr>
@@ -7399,6 +8321,9 @@
     <w:p>
       <w:pPr>
         <w:pStyle w:val="Body"/>
+        <w:rPr>
+          <w:color w:val="FF0000"/>
+        </w:rPr>
       </w:pPr>
     </w:p>
     <w:sectPr>
@@ -7516,6 +8441,99 @@
   </w:footnote>
   <w:footnote w:type="continuationNotice" w:id="1">
     <w:p/>
+  </w:footnote>
+  <w:footnote w:id="2">
+    <w:p>
+      <w:pPr>
+        <w:pStyle w:val="FootnoteText"/>
+      </w:pPr>
+      <w:r>
+        <w:rPr>
+          <w:rStyle w:val="FootnoteReference"/>
+        </w:rPr>
+        <w:footnoteRef/>
+      </w:r>
+      <w:r>
+        <w:t xml:space="preserve"> </w:t>
+      </w:r>
+      <w:proofErr w:type="spellStart"/>
+      <w:r>
+        <w:t>CalBEM</w:t>
+      </w:r>
+      <w:proofErr w:type="spellEnd"/>
+      <w:r>
+        <w:t xml:space="preserve"> is the California Building Energy Modeling stakeholder collective and annual statewide event hosted by SCE on behalf of the California Investor-Owned Utilities</w:t>
+      </w:r>
+      <w:r>
+        <w:t xml:space="preserve"> </w:t>
+      </w:r>
+      <w:r>
+        <w:t>(</w:t>
+      </w:r>
+      <w:r>
+        <w:t>https://calbem.ibpsa.us/</w:t>
+      </w:r>
+      <w:r>
+        <w:t>)</w:t>
+      </w:r>
+    </w:p>
+  </w:footnote>
+  <w:footnote w:id="3">
+    <w:p>
+      <w:pPr>
+        <w:pStyle w:val="FootnoteText"/>
+      </w:pPr>
+      <w:r>
+        <w:rPr>
+          <w:rStyle w:val="FootnoteReference"/>
+        </w:rPr>
+        <w:footnoteRef/>
+      </w:r>
+      <w:r>
+        <w:t xml:space="preserve"> </w:t>
+      </w:r>
+      <w:r>
+        <w:t>https://www.energycodes.gov/prototype-building-models</w:t>
+      </w:r>
+    </w:p>
+  </w:footnote>
+  <w:footnote w:id="4">
+    <w:p>
+      <w:pPr>
+        <w:pStyle w:val="FootnoteText"/>
+      </w:pPr>
+      <w:r>
+        <w:rPr>
+          <w:rStyle w:val="FootnoteReference"/>
+        </w:rPr>
+        <w:footnoteRef/>
+      </w:r>
+      <w:r>
+        <w:t xml:space="preserve"> </w:t>
+      </w:r>
+      <w:r>
+        <w:t>https://github.com/sound-data/DEER-Prototypes-EnergyPlus</w:t>
+      </w:r>
+    </w:p>
+  </w:footnote>
+  <w:footnote w:id="5">
+    <w:p>
+      <w:pPr>
+        <w:pStyle w:val="FootnoteText"/>
+      </w:pPr>
+      <w:r>
+        <w:rPr>
+          <w:rStyle w:val="FootnoteReference"/>
+        </w:rPr>
+        <w:footnoteRef/>
+      </w:r>
+      <w:r>
+        <w:t xml:space="preserve"> </w:t>
+      </w:r>
+      <w:r>
+        <w:t>https://bigladdersoftware.com/projects/modelkit/</w:t>
+      </w:r>
+    </w:p>
   </w:footnote>
 </w:footnotes>
 </file>
@@ -9828,6 +10846,119 @@
     </w:lvl>
   </w:abstractNum>
   <w:abstractNum w:abstractNumId="16" w15:restartNumberingAfterBreak="0">
+    <w:nsid w:val="52CF1901"/>
+    <w:multiLevelType w:val="hybridMultilevel"/>
+    <w:tmpl w:val="EA3ED2A8"/>
+    <w:lvl w:ilvl="0" w:tplc="04090001">
+      <w:start w:val="1"/>
+      <w:numFmt w:val="bullet"/>
+      <w:lvlText w:val=""/>
+      <w:lvlJc w:val="left"/>
+      <w:pPr>
+        <w:ind w:left="720" w:hanging="360"/>
+      </w:pPr>
+      <w:rPr>
+        <w:rFonts w:ascii="Symbol" w:hAnsi="Symbol" w:hint="default"/>
+      </w:rPr>
+    </w:lvl>
+    <w:lvl w:ilvl="1" w:tplc="04090003">
+      <w:start w:val="1"/>
+      <w:numFmt w:val="bullet"/>
+      <w:lvlText w:val="o"/>
+      <w:lvlJc w:val="left"/>
+      <w:pPr>
+        <w:ind w:left="1440" w:hanging="360"/>
+      </w:pPr>
+      <w:rPr>
+        <w:rFonts w:ascii="Courier New" w:hAnsi="Courier New" w:cs="Courier New" w:hint="default"/>
+      </w:rPr>
+    </w:lvl>
+    <w:lvl w:ilvl="2" w:tplc="04090005" w:tentative="1">
+      <w:start w:val="1"/>
+      <w:numFmt w:val="bullet"/>
+      <w:lvlText w:val=""/>
+      <w:lvlJc w:val="left"/>
+      <w:pPr>
+        <w:ind w:left="2160" w:hanging="360"/>
+      </w:pPr>
+      <w:rPr>
+        <w:rFonts w:ascii="Wingdings" w:hAnsi="Wingdings" w:hint="default"/>
+      </w:rPr>
+    </w:lvl>
+    <w:lvl w:ilvl="3" w:tplc="04090001" w:tentative="1">
+      <w:start w:val="1"/>
+      <w:numFmt w:val="bullet"/>
+      <w:lvlText w:val=""/>
+      <w:lvlJc w:val="left"/>
+      <w:pPr>
+        <w:ind w:left="2880" w:hanging="360"/>
+      </w:pPr>
+      <w:rPr>
+        <w:rFonts w:ascii="Symbol" w:hAnsi="Symbol" w:hint="default"/>
+      </w:rPr>
+    </w:lvl>
+    <w:lvl w:ilvl="4" w:tplc="04090003" w:tentative="1">
+      <w:start w:val="1"/>
+      <w:numFmt w:val="bullet"/>
+      <w:lvlText w:val="o"/>
+      <w:lvlJc w:val="left"/>
+      <w:pPr>
+        <w:ind w:left="3600" w:hanging="360"/>
+      </w:pPr>
+      <w:rPr>
+        <w:rFonts w:ascii="Courier New" w:hAnsi="Courier New" w:cs="Courier New" w:hint="default"/>
+      </w:rPr>
+    </w:lvl>
+    <w:lvl w:ilvl="5" w:tplc="04090005" w:tentative="1">
+      <w:start w:val="1"/>
+      <w:numFmt w:val="bullet"/>
+      <w:lvlText w:val=""/>
+      <w:lvlJc w:val="left"/>
+      <w:pPr>
+        <w:ind w:left="4320" w:hanging="360"/>
+      </w:pPr>
+      <w:rPr>
+        <w:rFonts w:ascii="Wingdings" w:hAnsi="Wingdings" w:hint="default"/>
+      </w:rPr>
+    </w:lvl>
+    <w:lvl w:ilvl="6" w:tplc="04090001" w:tentative="1">
+      <w:start w:val="1"/>
+      <w:numFmt w:val="bullet"/>
+      <w:lvlText w:val=""/>
+      <w:lvlJc w:val="left"/>
+      <w:pPr>
+        <w:ind w:left="5040" w:hanging="360"/>
+      </w:pPr>
+      <w:rPr>
+        <w:rFonts w:ascii="Symbol" w:hAnsi="Symbol" w:hint="default"/>
+      </w:rPr>
+    </w:lvl>
+    <w:lvl w:ilvl="7" w:tplc="04090003" w:tentative="1">
+      <w:start w:val="1"/>
+      <w:numFmt w:val="bullet"/>
+      <w:lvlText w:val="o"/>
+      <w:lvlJc w:val="left"/>
+      <w:pPr>
+        <w:ind w:left="5760" w:hanging="360"/>
+      </w:pPr>
+      <w:rPr>
+        <w:rFonts w:ascii="Courier New" w:hAnsi="Courier New" w:cs="Courier New" w:hint="default"/>
+      </w:rPr>
+    </w:lvl>
+    <w:lvl w:ilvl="8" w:tplc="04090005" w:tentative="1">
+      <w:start w:val="1"/>
+      <w:numFmt w:val="bullet"/>
+      <w:lvlText w:val=""/>
+      <w:lvlJc w:val="left"/>
+      <w:pPr>
+        <w:ind w:left="6480" w:hanging="360"/>
+      </w:pPr>
+      <w:rPr>
+        <w:rFonts w:ascii="Wingdings" w:hAnsi="Wingdings" w:hint="default"/>
+      </w:rPr>
+    </w:lvl>
+  </w:abstractNum>
+  <w:abstractNum w:abstractNumId="17" w15:restartNumberingAfterBreak="0">
     <w:nsid w:val="5627514A"/>
     <w:multiLevelType w:val="multilevel"/>
     <w:tmpl w:val="8932E27E"/>
@@ -9976,7 +11107,7 @@
       </w:rPr>
     </w:lvl>
   </w:abstractNum>
-  <w:abstractNum w:abstractNumId="17" w15:restartNumberingAfterBreak="0">
+  <w:abstractNum w:abstractNumId="18" w15:restartNumberingAfterBreak="0">
     <w:nsid w:val="61F305AD"/>
     <w:multiLevelType w:val="hybridMultilevel"/>
     <w:tmpl w:val="B7AE1866"/>
@@ -10065,7 +11196,7 @@
       </w:pPr>
     </w:lvl>
   </w:abstractNum>
-  <w:abstractNum w:abstractNumId="18" w15:restartNumberingAfterBreak="0">
+  <w:abstractNum w:abstractNumId="19" w15:restartNumberingAfterBreak="0">
     <w:nsid w:val="63656295"/>
     <w:multiLevelType w:val="multilevel"/>
     <w:tmpl w:val="C6983E06"/>
@@ -10204,7 +11335,7 @@
       </w:rPr>
     </w:lvl>
   </w:abstractNum>
-  <w:abstractNum w:abstractNumId="19" w15:restartNumberingAfterBreak="0">
+  <w:abstractNum w:abstractNumId="20" w15:restartNumberingAfterBreak="0">
     <w:nsid w:val="7AD51FA7"/>
     <w:multiLevelType w:val="multilevel"/>
     <w:tmpl w:val="5D3C214A"/>
@@ -10340,7 +11471,7 @@
     <w:abstractNumId w:val="4"/>
   </w:num>
   <w:num w:numId="4" w16cid:durableId="1897158277">
-    <w:abstractNumId w:val="18"/>
+    <w:abstractNumId w:val="19"/>
   </w:num>
   <w:num w:numId="5" w16cid:durableId="424686989">
     <w:abstractNumId w:val="4"/>
@@ -10391,7 +11522,7 @@
     <w:abstractNumId w:val="9"/>
   </w:num>
   <w:num w:numId="12" w16cid:durableId="351299012">
-    <w:abstractNumId w:val="19"/>
+    <w:abstractNumId w:val="20"/>
   </w:num>
   <w:num w:numId="13" w16cid:durableId="897864978">
     <w:abstractNumId w:val="11"/>
@@ -10566,7 +11697,7 @@
     </w:lvlOverride>
   </w:num>
   <w:num w:numId="20" w16cid:durableId="1244529545">
-    <w:abstractNumId w:val="19"/>
+    <w:abstractNumId w:val="20"/>
   </w:num>
   <w:num w:numId="21" w16cid:durableId="1167090196">
     <w:abstractNumId w:val="5"/>
@@ -10602,7 +11733,7 @@
     <w:abstractNumId w:val="4"/>
   </w:num>
   <w:num w:numId="23" w16cid:durableId="2136025282">
-    <w:abstractNumId w:val="18"/>
+    <w:abstractNumId w:val="19"/>
   </w:num>
   <w:num w:numId="24" w16cid:durableId="1468743396">
     <w:abstractNumId w:val="12"/>
@@ -10756,7 +11887,7 @@
     </w:lvlOverride>
   </w:num>
   <w:num w:numId="28" w16cid:durableId="1641423048">
-    <w:abstractNumId w:val="17"/>
+    <w:abstractNumId w:val="18"/>
   </w:num>
   <w:num w:numId="29" w16cid:durableId="1817721100">
     <w:abstractNumId w:val="13"/>
@@ -10768,13 +11899,16 @@
     <w:abstractNumId w:val="3"/>
   </w:num>
   <w:num w:numId="32" w16cid:durableId="1189872408">
-    <w:abstractNumId w:val="16"/>
+    <w:abstractNumId w:val="17"/>
   </w:num>
   <w:num w:numId="33" w16cid:durableId="1278757739">
     <w:abstractNumId w:val="6"/>
   </w:num>
   <w:num w:numId="34" w16cid:durableId="1048803786">
     <w:abstractNumId w:val="2"/>
+  </w:num>
+  <w:num w:numId="35" w16cid:durableId="1328898376">
+    <w:abstractNumId w:val="16"/>
   </w:num>
   <w:numIdMacAtCleanup w:val="13"/>
 </w:numbering>
@@ -12628,7 +13762,7 @@
         <w:jc w:val="center"/>
       </w:pPr>
       <w:rPr>
-        <w:rFonts w:ascii="Exo SemiBold" w:hAnsi="Exo SemiBold"/>
+        <w:rFonts w:ascii="Arial Narrow" w:hAnsi="Arial Narrow"/>
         <w:b w:val="0"/>
         <w:bCs/>
         <w:caps/>
@@ -12652,7 +13786,7 @@
     </w:tblStylePr>
     <w:tblStylePr w:type="lastRow">
       <w:rPr>
-        <w:rFonts w:ascii="Exo SemiBold" w:hAnsi="Exo SemiBold"/>
+        <w:rFonts w:ascii="Arial Narrow" w:hAnsi="Arial Narrow"/>
         <w:b/>
         <w:bCs/>
         <w:i w:val="0"/>
@@ -12673,7 +13807,7 @@
         <w:jc w:val="left"/>
       </w:pPr>
       <w:rPr>
-        <w:rFonts w:ascii="Exo SemiBold" w:hAnsi="Exo SemiBold"/>
+        <w:rFonts w:ascii="Arial Narrow" w:hAnsi="Arial Narrow"/>
         <w:b/>
         <w:bCs/>
         <w:color w:val="18252C" w:themeColor="text1" w:themeShade="BF"/>
@@ -12699,7 +13833,7 @@
         <w:jc w:val="center"/>
       </w:pPr>
       <w:rPr>
-        <w:rFonts w:ascii="Exo SemiBold" w:hAnsi="Exo SemiBold"/>
+        <w:rFonts w:ascii="Arial Narrow" w:hAnsi="Arial Narrow"/>
         <w:b/>
         <w:bCs/>
         <w:i w:val="0"/>
@@ -12721,7 +13855,7 @@
         <w:jc w:val="left"/>
       </w:pPr>
       <w:rPr>
-        <w:rFonts w:ascii="Exo SemiBold" w:hAnsi="Exo SemiBold"/>
+        <w:rFonts w:ascii="Arial Narrow" w:hAnsi="Arial Narrow"/>
         <w:color w:val="18252C" w:themeColor="text1" w:themeShade="BF"/>
         <w:sz w:val="20"/>
       </w:rPr>
@@ -12745,7 +13879,7 @@
         <w:jc w:val="left"/>
       </w:pPr>
       <w:rPr>
-        <w:rFonts w:ascii="Exo SemiBold" w:hAnsi="Exo SemiBold"/>
+        <w:rFonts w:ascii="Arial Narrow" w:hAnsi="Arial Narrow"/>
         <w:sz w:val="20"/>
       </w:rPr>
       <w:tblPr/>
@@ -13097,7 +14231,7 @@
         <w:jc w:val="center"/>
       </w:pPr>
       <w:rPr>
-        <w:rFonts w:ascii="Exo SemiBold" w:hAnsi="Exo SemiBold"/>
+        <w:rFonts w:ascii="Arial Narrow" w:hAnsi="Arial Narrow"/>
         <w:b w:val="0"/>
         <w:bCs/>
         <w:caps/>
@@ -13123,7 +14257,7 @@
         <w:jc w:val="center"/>
       </w:pPr>
       <w:rPr>
-        <w:rFonts w:ascii="Exo SemiBold" w:hAnsi="Exo SemiBold"/>
+        <w:rFonts w:ascii="Arial Narrow" w:hAnsi="Arial Narrow"/>
         <w:b/>
         <w:bCs/>
         <w:color w:val="18252C" w:themeColor="text1" w:themeShade="BF"/>
@@ -13147,7 +14281,7 @@
         <w:jc w:val="left"/>
       </w:pPr>
       <w:rPr>
-        <w:rFonts w:ascii="Exo SemiBold" w:hAnsi="Exo SemiBold"/>
+        <w:rFonts w:ascii="Arial Narrow" w:hAnsi="Arial Narrow"/>
         <w:i w:val="0"/>
         <w:iCs/>
         <w:color w:val="18252C" w:themeColor="text1" w:themeShade="BF"/>
@@ -13189,7 +14323,7 @@
         <w:jc w:val="center"/>
       </w:pPr>
       <w:rPr>
-        <w:rFonts w:ascii="Exo SemiBold" w:hAnsi="Exo SemiBold"/>
+        <w:rFonts w:ascii="Arial Narrow" w:hAnsi="Arial Narrow"/>
         <w:color w:val="18252C" w:themeColor="text1" w:themeShade="BF"/>
         <w:sz w:val="21"/>
       </w:rPr>
@@ -13203,7 +14337,7 @@
         <w:jc w:val="center"/>
       </w:pPr>
       <w:rPr>
-        <w:rFonts w:ascii="Exo SemiBold" w:hAnsi="Exo SemiBold"/>
+        <w:rFonts w:ascii="Arial Narrow" w:hAnsi="Arial Narrow"/>
         <w:color w:val="18252C" w:themeColor="text1" w:themeShade="BF"/>
         <w:sz w:val="21"/>
       </w:rPr>
@@ -13217,7 +14351,7 @@
         <w:jc w:val="center"/>
       </w:pPr>
       <w:rPr>
-        <w:rFonts w:ascii="Exo SemiBold" w:hAnsi="Exo SemiBold"/>
+        <w:rFonts w:ascii="Arial Narrow" w:hAnsi="Arial Narrow"/>
         <w:color w:val="18252C" w:themeColor="text1" w:themeShade="BF"/>
         <w:sz w:val="21"/>
       </w:rPr>
@@ -13237,7 +14371,7 @@
         <w:jc w:val="center"/>
       </w:pPr>
       <w:rPr>
-        <w:rFonts w:ascii="Exo SemiBold" w:hAnsi="Exo SemiBold"/>
+        <w:rFonts w:ascii="Arial Narrow" w:hAnsi="Arial Narrow"/>
         <w:color w:val="18252C" w:themeColor="text1" w:themeShade="BF"/>
         <w:sz w:val="21"/>
       </w:rPr>
@@ -15383,6 +16517,34 @@
       <w:iCs/>
     </w:rPr>
   </w:style>
+  <w:style w:type="paragraph" w:styleId="FootnoteText">
+    <w:name w:val="footnote text"/>
+    <w:basedOn w:val="Normal"/>
+    <w:link w:val="FootnoteTextChar"/>
+    <w:uiPriority w:val="39"/>
+    <w:semiHidden/>
+    <w:unhideWhenUsed/>
+    <w:rsid w:val="008D5605"/>
+  </w:style>
+  <w:style w:type="character" w:customStyle="1" w:styleId="FootnoteTextChar">
+    <w:name w:val="Footnote Text Char"/>
+    <w:basedOn w:val="DefaultParagraphFont"/>
+    <w:link w:val="FootnoteText"/>
+    <w:uiPriority w:val="39"/>
+    <w:semiHidden/>
+    <w:rsid w:val="008D5605"/>
+  </w:style>
+  <w:style w:type="character" w:styleId="FootnoteReference">
+    <w:name w:val="footnote reference"/>
+    <w:basedOn w:val="DefaultParagraphFont"/>
+    <w:uiPriority w:val="39"/>
+    <w:semiHidden/>
+    <w:unhideWhenUsed/>
+    <w:rsid w:val="008D5605"/>
+    <w:rPr>
+      <w:vertAlign w:val="superscript"/>
+    </w:rPr>
+  </w:style>
 </w:styles>
 </file>
 
@@ -15667,107 +16829,103 @@
 </a:theme>
 </file>
 
-<file path=word/webextensions/taskpanes.xml><?xml version="1.0" encoding="utf-8"?>
-<wetp:taskpanes xmlns:wetp="http://schemas.microsoft.com/office/webextensions/taskpanes/2010/11">
-  <wetp:taskpane dockstate="right" visibility="0" width="525" row="6">
-    <wetp:webextensionref xmlns:r="http://schemas.openxmlformats.org/officeDocument/2006/relationships" r:id="rId1"/>
-  </wetp:taskpane>
-</wetp:taskpanes>
-</file>
-
-<file path=word/webextensions/webextension1.xml><?xml version="1.0" encoding="utf-8"?>
-<we:webextension xmlns:we="http://schemas.microsoft.com/office/webextensions/webextension/2010/11" id="{45888104-7C8F-4F1E-A30A-C95D6001AEE6}">
-  <we:reference id="wa104380255" version="1.6.0.0" store="en-US" storeType="OMEX"/>
-  <we:alternateReferences>
-    <we:reference id="wa104380255" version="1.6.0.0" store="en-US" storeType="OMEX"/>
-  </we:alternateReferences>
-  <we:properties/>
-  <we:bindings/>
-  <we:snapshot xmlns:r="http://schemas.openxmlformats.org/officeDocument/2006/relationships"/>
-</we:webextension>
-</file>
-
 <file path=customXml/item1.xml><?xml version="1.0" encoding="utf-8"?>
-<p:properties xmlns:p="http://schemas.microsoft.com/office/2006/metadata/properties" xmlns:xsi="http://www.w3.org/2001/XMLSchema-instance" xmlns:pc="http://schemas.microsoft.com/office/infopath/2007/PartnerControls">
-  <documentManagement>
-    <_dlc_DocId xmlns="7764588b-be80-4b22-977b-586652cb38b8">YEU7YCZ7SHNT-67281309-907680</_dlc_DocId>
-    <_dlc_DocIdUrl xmlns="7764588b-be80-4b22-977b-586652cb38b8">
-      <Url>https://trccompanies.sharepoint.com/sites/LOB/Power/AE/deliver/RC/_layouts/15/DocIdRedir.aspx?ID=YEU7YCZ7SHNT-67281309-907680</Url>
-      <Description>YEU7YCZ7SHNT-67281309-907680</Description>
-    </_dlc_DocIdUrl>
-    <Source xmlns="e82a6618-5246-433f-9a3a-82cc13a7c76c" xsi:nil="true"/>
-    <lcf76f155ced4ddcb4097134ff3c332f xmlns="e82a6618-5246-433f-9a3a-82cc13a7c76c">
-      <Terms xmlns="http://schemas.microsoft.com/office/infopath/2007/PartnerControls"/>
-    </lcf76f155ced4ddcb4097134ff3c332f>
-    <TaxCatchAll xmlns="7764588b-be80-4b22-977b-586652cb38b8" xsi:nil="true"/>
-    <Review_x0020_Cycle xmlns="e82a6618-5246-433f-9a3a-82cc13a7c76c" xsi:nil="true"/>
-    <Owner xmlns="e82a6618-5246-433f-9a3a-82cc13a7c76c">
-      <UserInfo>
-        <DisplayName/>
-        <AccountId xsi:nil="true"/>
-        <AccountType/>
-      </UserInfo>
-    </Owner>
-    <Update_x0020_Status xmlns="e82a6618-5246-433f-9a3a-82cc13a7c76c" xsi:nil="true"/>
-    <Subcategory xmlns="e82a6618-5246-433f-9a3a-82cc13a7c76c" xsi:nil="true"/>
-    <Subject_x0020_Matter xmlns="e82a6618-5246-433f-9a3a-82cc13a7c76c" xsi:nil="true"/>
-    <Last_x0020_Updated xmlns="e82a6618-5246-433f-9a3a-82cc13a7c76c" xsi:nil="true"/>
-    <Category xmlns="e82a6618-5246-433f-9a3a-82cc13a7c76c" xsi:nil="true"/>
-    <Format_x0020__x002f__x0020_File_x0020_Type xmlns="e82a6618-5246-433f-9a3a-82cc13a7c76c" xsi:nil="true"/>
-    <Resource_x0020_Type xmlns="e82a6618-5246-433f-9a3a-82cc13a7c76c" xsi:nil="true"/>
-  </documentManagement>
-</p:properties>
+<b:Sources xmlns:b="http://schemas.openxmlformats.org/officeDocument/2006/bibliography" xmlns="http://schemas.openxmlformats.org/officeDocument/2006/bibliography" SelectedStyle="\APA.XSL" StyleName="APA"/>
 </file>
 
 <file path=customXml/item2.xml><?xml version="1.0" encoding="utf-8"?>
-<b:Sources xmlns:b="http://schemas.openxmlformats.org/officeDocument/2006/bibliography" xmlns="http://schemas.openxmlformats.org/officeDocument/2006/bibliography" SelectedStyle="\APA.XSL" StyleName="APA"/>
-</file>
-
-<file path=customXml/item3.xml><?xml version="1.0" encoding="utf-8"?>
 <SettingProperties xmlns="http://www.qorusdocs.com/office/settingProperties" version="1">
   <DocumentSettings/>
 </SettingProperties>
 </file>
 
+<file path=customXml/item3.xml><?xml version="1.0" encoding="utf-8"?>
+<p:properties xmlns:p="http://schemas.microsoft.com/office/2006/metadata/properties" xmlns:xsi="http://www.w3.org/2001/XMLSchema-instance" xmlns:pc="http://schemas.microsoft.com/office/infopath/2007/PartnerControls">
+  <documentManagement>
+    <lcf76f155ced4ddcb4097134ff3c332f xmlns="bac1e0b3-eaaf-4d82-995f-4fe6b69d5951" xsi:nil="true"/>
+    <TaxCatchAll xmlns="d29f01e0-b76f-49f6-8733-4393bd0ea6f3" xsi:nil="true"/>
+  </documentManagement>
+</p:properties>
+</file>
+
 <file path=customXml/item4.xml><?xml version="1.0" encoding="utf-8"?>
-<ct:contentTypeSchema xmlns:ct="http://schemas.microsoft.com/office/2006/metadata/contentType" xmlns:ma="http://schemas.microsoft.com/office/2006/metadata/properties/metaAttributes" ct:_="" ma:_="" ma:contentTypeName="Document" ma:contentTypeID="0x010100D7EE82DE5136BC458D5EED36FF935144" ma:contentTypeVersion="36" ma:contentTypeDescription="Create a new document." ma:contentTypeScope="" ma:versionID="2da05e7605b6d2ec0f3c74742f02e4a2">
-  <xsd:schema xmlns:xsd="http://www.w3.org/2001/XMLSchema" xmlns:xs="http://www.w3.org/2001/XMLSchema" xmlns:p="http://schemas.microsoft.com/office/2006/metadata/properties" xmlns:ns2="7764588b-be80-4b22-977b-586652cb38b8" xmlns:ns3="0e30f368-2351-48f1-985f-2771b1e0e99e" xmlns:ns4="e82a6618-5246-433f-9a3a-82cc13a7c76c" targetNamespace="http://schemas.microsoft.com/office/2006/metadata/properties" ma:root="true" ma:fieldsID="d94591216f57e30645731e6fddd82a70" ns2:_="" ns3:_="" ns4:_="">
-    <xsd:import namespace="7764588b-be80-4b22-977b-586652cb38b8"/>
-    <xsd:import namespace="0e30f368-2351-48f1-985f-2771b1e0e99e"/>
-    <xsd:import namespace="e82a6618-5246-433f-9a3a-82cc13a7c76c"/>
+<SmartProperties xmlns="http://www.qorusdocs.com/office/smartProperties" version="1">
+  <Contents/>
+  <Fields/>
+  <FieldValues/>
+  <DocumentSettings xmlns="">[{"name":"AutoExpandAddin","value":"2"},{"name":"TemplateAutoExpandAddin","value":"2"},{"name":"TemplateAutoInstallAddin","value":"false"}]</DocumentSettings>
+  <Design xmlns="">
+    <Fields>[{"id":"ad976519-90d8-ed11-8e8b-000d3a73eeaa","name":"&lt;Client Name&gt;","displayName":"Client Name","description":"Enter company name","reference":null,"type":0,"format":null,"required":false,"createdOn":"2023-04-11T17:41:35.723","createdBy":"Cantrell, Alison","modifiedOn":"2023-04-30T09:51:13.677","modifiedBy":"Cantrell, Alison","value":null,"rememberValues":true,"rememberValuesScope":2,"defaultValue":"","imageFitOption":0,"placeholderImageUrl":null,"contentSourceId":null,"isValueBound":false,"boundObjectName":null,"respectSectionBreak":false,"usage":2,"synced":true},{"name":"&lt;Opportunity Name&gt;","value":"","displayName":"Opportunity Name","usage":2,"type":0,"description":"","rememberValues":true,"rememberValuesScope":2,"format":null,"firstIndex":13,"id":"efb4971c-3ce7-ed11-8e8b-000d3a739548","synced":true,"modifiedBy":"Cantrell, Alison","modifiedOn":"2023-04-30T09:48:09.217"},{"name":"&lt;Client Contact Name&gt;","value":"","displayName":"Client Contact Name","usage":2,"type":0,"description":"","rememberValues":true,"rememberValuesScope":2,"format":null,"firstIndex":58,"id":"b6ba8825-3ce7-ed11-8e8b-000d3a739548","synced":true,"modifiedBy":"Cantrell, Alison","modifiedOn":"2023-04-30T09:48:24.22"},{"name":"&lt;Client Contact Title&gt;","value":"","displayName":"Client Contact Title","usage":2,"type":0,"description":"","rememberValues":true,"rememberValuesScope":2,"format":null,"firstIndex":79,"id":"8fec712c-3ce7-ed11-8e8b-000d3a739548","synced":true,"modifiedBy":"Cantrell, Alison","modifiedOn":"2023-04-30T09:48:35.817"},{"name":"&lt;TRC Contact Name&gt;","value":"","displayName":"TRC Contact Name","usage":2,"type":0,"description":"Person who will sign cover letter","rememberValues":false,"rememberValuesScope":0,"format":null,"firstIndex":101,"id":"f2c485d2-3ce7-ed11-8e8b-000d3a739548","synced":true,"modifiedBy":"Cantrell, Alison","modifiedOn":"2023-04-30T09:53:14.443"},{"name":"&lt;TRC Contact Title&gt;","value":"","displayName":"TRC Contact Title","usage":2,"type":0,"description":"Title of person who will sign cover letter","rememberValues":false,"rememberValuesScope":0,"format":null,"firstIndex":119,"id":"588e86dc-3ce7-ed11-8e8b-000d3a739548","synced":true,"modifiedBy":"Cantrell, Alison","modifiedOn":"2023-04-30T09:53:31.227"},{"name":"&lt;Bid Due Date&gt;","value":"","displayName":"Bid Due Date","usage":2,"type":3,"description":"Enter date bid is due","rememberValues":false,"rememberValuesScope":0,"format":"{\"outputFormat\":\"MMMM dd, yyyy\"}","firstIndex":138,"id":"805de6a5-3ce7-ed11-8e8b-000d3a739548","synced":true,"defaultValue":null,"modifiedBy":"Cantrell, Alison","modifiedOn":"2023-04-30T09:51:59.577"},{"name":"&lt;Solicitation Type&gt;","value":"","displayName":"Solicitation Type","usage":2,"type":0,"description":"RFx type (RFI, RFQ, SOQ, RFP, RFA, etc.)","rememberValues":false,"rememberValuesScope":0,"format":null,"firstIndex":152,"id":"4a5f2eef-3ce7-ed11-8e8b-000d3a739548","synced":true,"modifiedBy":"Cantrell, Alison","modifiedOn":"2023-04-30T09:54:02.527"},{"name":"&lt;Solicitation Number&gt;","value":"","displayName":"Solicitation Number","usage":2,"type":0,"description":"Enter the client's designated RFx number","rememberValues":false,"rememberValuesScope":0,"format":null,"firstIndex":174,"id":"388e80ba-3ce7-ed11-8e8b-000d3a739548","synced":true,"modifiedBy":"Cantrell, Alison","modifiedOn":"2023-04-30T09:52:34.143"},{"id":"ad976519-90d8-ed11-8e8b-000d3a73eeaa","name":"&lt;Client Name&gt;","displayName":"Client Name","description":"Enter company name","reference":null,"type":0,"format":null,"required":false,"createdOn":"2023-04-11T17:41:35.723","createdBy":"Cantrell, Alison","modifiedOn":"2023-04-30T09:51:13.677","modifiedBy":"Cantrell, Alison","value":null,"rememberValues":true,"rememberValuesScope":2,"defaultValue":"","imageFitOption":0,"placeholderImageUrl":null,"contentSourceId":null,"isValueBound":false,"boundObjectName":null,"respectSectionBreak":false,"usage":2,"synced":true},{"name":"&lt;Client Contact Name&gt;","value":"","displayName":"Client Contact Name","usage":2,"type":0,"description":"","rememberValues":true,"rememberValuesScope":2,"format":null,"firstIndex":58,"id":"b6ba8825-3ce7-ed11-8e8b-000d3a739548","synced":true,"modifiedBy":"Cantrell, Alison","modifiedOn":"2023-04-30T09:48:24.22"},{"name":"&lt;Client Contact Title&gt;","value":"","displayName":"Client Contact Title","usage":2,"type":0,"description":"","rememberValues":true,"rememberValuesScope":2,"format":null,"firstIndex":79,"id":"8fec712c-3ce7-ed11-8e8b-000d3a739548","synced":true,"modifiedBy":"Cantrell, Alison","modifiedOn":"2023-04-30T09:48:35.817"},{"name":"&lt;Client Contact Address – Line 1&gt;","value":"","displayName":"Client Contact Address – Line 1","usage":0,"type":0,"description":"","rememberValues":false,"rememberValuesScope":0,"format":null,"firstIndex":265,"id":null,"synced":true},{"name":"&lt;Client Contact Address – Line 2&gt;","value":"","displayName":"Client Contact Address – Line 2","usage":0,"type":0,"description":"","rememberValues":false,"rememberValuesScope":0,"format":null,"firstIndex":298,"id":null,"synced":true},{"name":"&lt;Bid Due Date&gt;","value":"","displayName":"Bid Due Date","usage":2,"type":3,"description":"Enter date bid is due","rememberValues":false,"rememberValuesScope":0,"format":"{\"outputFormat\":\"MMMM dd, yyyy\"}","firstIndex":138,"id":"805de6a5-3ce7-ed11-8e8b-000d3a739548","synced":true,"defaultValue":null,"modifiedBy":"Cantrell, Alison","modifiedOn":"2023-04-30T09:51:59.577"},{"name":"&lt;Opportunity Name&gt;","value":"","displayName":"Opportunity Name","usage":2,"type":0,"description":"","rememberValues":true,"rememberValuesScope":2,"format":null,"firstIndex":13,"id":"efb4971c-3ce7-ed11-8e8b-000d3a739548","synced":true,"modifiedBy":"Cantrell, Alison","modifiedOn":"2023-04-30T09:48:09.217"},{"name":"&lt;Opportunity Name&gt;","value":"","displayName":"Opportunity Name","usage":2,"type":0,"description":"","rememberValues":true,"rememberValuesScope":2,"format":null,"firstIndex":13,"id":"efb4971c-3ce7-ed11-8e8b-000d3a739548","synced":true,"modifiedBy":"Cantrell, Alison","modifiedOn":"2023-04-30T09:48:09.217"},{"name":"&lt;Solicitation Type&gt;","value":"","displayName":"Solicitation Type","usage":2,"type":0,"description":"RFx type (RFI, RFQ, SOQ, RFP, RFA, etc.)","rememberValues":false,"rememberValuesScope":0,"format":null,"firstIndex":152,"id":"4a5f2eef-3ce7-ed11-8e8b-000d3a739548","synced":true,"modifiedBy":"Cantrell, Alison","modifiedOn":"2023-04-30T09:54:02.527"},{"name":"&lt;Solicitation Number&gt;","value":"","displayName":"Solicitation Number","usage":2,"type":0,"description":"Enter the client's designated RFx number","rememberValues":false,"rememberValuesScope":0,"format":null,"firstIndex":174,"id":"388e80ba-3ce7-ed11-8e8b-000d3a739548","synced":true,"modifiedBy":"Cantrell, Alison","modifiedOn":"2023-04-30T09:52:34.143"},{"id":"ad976519-90d8-ed11-8e8b-000d3a73eeaa","name":"&lt;Client Name&gt;","displayName":"Client Name","description":"Enter company name","reference":null,"type":0,"format":null,"required":false,"createdOn":"2023-04-11T17:41:35.723","createdBy":"Cantrell, Alison","modifiedOn":"2023-04-30T09:51:13.677","modifiedBy":"Cantrell, Alison","value":null,"rememberValues":true,"rememberValuesScope":2,"defaultValue":"","imageFitOption":0,"placeholderImageUrl":null,"contentSourceId":null,"isValueBound":false,"boundObjectName":null,"respectSectionBreak":false,"usage":2,"synced":true},{"name":"&lt;Opportunity Name&gt;","value":"","displayName":"Opportunity Name","usage":2,"type":0,"description":"","rememberValues":true,"rememberValuesScope":2,"format":null,"firstIndex":13,"id":"efb4971c-3ce7-ed11-8e8b-000d3a739548","synced":true,"modifiedBy":"Cantrell, Alison","modifiedOn":"2023-04-30T09:48:09.217"},{"id":"ad976519-90d8-ed11-8e8b-000d3a73eeaa","name":"&lt;Client Name&gt;","displayName":"Client Name","description":"Enter company name","reference":null,"type":0,"format":null,"required":false,"createdOn":"2023-04-11T17:41:35.723","createdBy":"Cantrell, Alison","modifiedOn":"2023-04-30T09:51:13.677","modifiedBy":"Cantrell, Alison","value":null,"rememberValues":true,"rememberValuesScope":2,"defaultValue":"","imageFitOption":0,"placeholderImageUrl":null,"contentSourceId":null,"isValueBound":false,"boundObjectName":null,"respectSectionBreak":false,"usage":2,"synced":true},{"id":"ad976519-90d8-ed11-8e8b-000d3a73eeaa","name":"&lt;Client Name&gt;","displayName":"Client Name","description":"Enter company name","reference":null,"type":0,"format":null,"required":false,"createdOn":"2023-04-11T17:41:35.723","createdBy":"Cantrell, Alison","modifiedOn":"2023-04-30T09:51:13.677","modifiedBy":"Cantrell, Alison","value":null,"rememberValues":true,"rememberValuesScope":2,"defaultValue":"","imageFitOption":0,"placeholderImageUrl":null,"contentSourceId":null,"isValueBound":false,"boundObjectName":null,"respectSectionBreak":false,"usage":2,"synced":true},{"id":"ad976519-90d8-ed11-8e8b-000d3a73eeaa","name":"&lt;Client Name&gt;","displayName":"Client Name","description":"Enter company name","reference":null,"type":0,"format":null,"required":false,"createdOn":"2023-04-11T17:41:35.723","createdBy":"Cantrell, Alison","modifiedOn":"2023-04-30T09:51:13.677","modifiedBy":"Cantrell, Alison","value":null,"rememberValues":true,"rememberValuesScope":2,"defaultValue":"","imageFitOption":0,"placeholderImageUrl":null,"contentSourceId":null,"isValueBound":false,"boundObjectName":null,"respectSectionBreak":false,"usage":2,"synced":true},{"id":"ad976519-90d8-ed11-8e8b-000d3a73eeaa","name":"&lt;Client Name&gt;","displayName":"Client Name","description":"Enter company name","reference":null,"type":0,"format":null,"required":false,"createdOn":"2023-04-11T17:41:35.723","createdBy":"Cantrell, Alison","modifiedOn":"2023-04-30T09:51:13.677","modifiedBy":"Cantrell, Alison","value":null,"rememberValues":true,"rememberValuesScope":2,"defaultValue":"","imageFitOption":0,"placeholderImageUrl":null,"contentSourceId":null,"isValueBound":false,"boundObjectName":null,"respectSectionBreak":false,"usage":2,"synced":true},{"name":"&lt;TRC Contact Name&gt;","value":"","displayName":"TRC Contact Name","usage":2,"type":0,"description":"Person who will sign cover letter","rememberValues":false,"rememberValuesScope":0,"format":null,"firstIndex":101,"id":"f2c485d2-3ce7-ed11-8e8b-000d3a739548","synced":true,"modifiedBy":"Cantrell, Alison","modifiedOn":"2023-04-30T09:53:14.443"},{"name":"&lt;Client Contact Title&gt;","value":"","displayName":"Client Contact Title","usage":2,"type":0,"description":"","rememberValues":true,"rememberValuesScope":2,"format":null,"firstIndex":79,"id":"8fec712c-3ce7-ed11-8e8b-000d3a739548","synced":true,"modifiedBy":"Cantrell, Alison","modifiedOn":"2023-04-30T09:48:35.817"},{"name":"&lt;TRC Contact Phone&gt;","value":"","displayName":"TRC Contact Phone","usage":2,"type":0,"description":"","rememberValues":false,"rememberValuesScope":0,"format":null,"firstIndex":1635,"id":"2c9c0b82-3ee7-ed11-8e8b-000d3a739548","synced":true,"modifiedBy":"Cantrell, Alison","modifiedOn":"2023-04-30T10:05:18.437"},{"name":"&lt;Appendix 1 Title&gt;","value":"","displayName":"Appendix 1 Title","usage":2,"type":0,"description":"Name of Appendix 1","rememberValues":false,"rememberValuesScope":0,"format":null,"firstIndex":4757,"id":"e90fbfe4-3ee7-ed11-8e8b-000d3a739548","synced":true,"modifiedBy":"Cantrell, Alison","modifiedOn":"2023-04-30T10:08:04.013"},{"name":"&lt;Appendix 2 Title&gt;","value":"","displayName":"Appendix 2 Title","usage":0,"type":0,"description":"","rememberValues":false,"rememberValuesScope":0,"format":null,"firstIndex":4785,"id":null,"synced":true},{"name":"&lt;Appendix 3 Title&gt;","value":"","displayName":"Appendix 3 Title","usage":0,"type":0,"description":"","rememberValues":false,"rememberValuesScope":0,"format":null,"firstIndex":4813,"id":null,"synced":true},{"name":"&lt;Appendix 4 Title&gt;","value":"","displayName":"Appendix 4 Title","usage":0,"type":0,"description":"","rememberValues":false,"rememberValuesScope":0,"format":null,"firstIndex":4841,"id":null,"synced":true},{"name":"&lt;Appendix 5 Title&gt;","value":"","displayName":"Appendix 5 Title","usage":0,"type":0,"description":"","rememberValues":false,"rememberValuesScope":0,"format":null,"firstIndex":4869,"id":null,"synced":true},{"name":"&lt;Current Year&gt;","value":"","displayName":"Current Year","usage":2,"type":0,"description":"Year the proposal is submitted in","rememberValues":true,"rememberValuesScope":2,"format":null,"firstIndex":5019,"id":"aa569ac7-3ee7-ed11-8e8b-000d3a739548","synced":true,"modifiedBy":"Cantrell, Alison","modifiedOn":"2023-04-30T10:07:15.13"},{"id":"ad976519-90d8-ed11-8e8b-000d3a73eeaa","name":"&lt;Client Name&gt;","displayName":"Client Name","description":"Enter company name","reference":null,"type":0,"format":null,"required":false,"createdOn":"2023-04-11T17:41:35.723","createdBy":"Cantrell, Alison","modifiedOn":"2023-04-30T09:51:13.677","modifiedBy":"Cantrell, Alison","value":null,"rememberValues":true,"rememberValuesScope":2,"defaultValue":"","imageFitOption":0,"placeholderImageUrl":null,"contentSourceId":null,"isValueBound":false,"boundObjectName":null,"respectSectionBreak":false,"usage":2,"synced":true},{"name":"&lt;Opportunity Name&gt;","value":"","displayName":"Opportunity Name","usage":2,"type":0,"description":"","rememberValues":true,"rememberValuesScope":2,"format":null,"firstIndex":13,"id":"efb4971c-3ce7-ed11-8e8b-000d3a739548","synced":true,"modifiedBy":"Cantrell, Alison","modifiedOn":"2023-04-30T09:48:09.217"},{"name":"&lt;Current Year&gt;","value":"","displayName":"Current Year","usage":2,"type":0,"description":"Year the proposal is submitted in","rememberValues":true,"rememberValuesScope":2,"format":null,"firstIndex":5019,"id":"aa569ac7-3ee7-ed11-8e8b-000d3a739548","synced":true,"modifiedBy":"Cantrell, Alison","modifiedOn":"2023-04-30T10:07:15.13"},{"name":"&lt;Current Year&gt;","value":"","displayName":"Current Year","usage":2,"type":0,"description":"Year the proposal is submitted in","rememberValues":true,"rememberValuesScope":2,"format":null,"firstIndex":5019,"id":"aa569ac7-3ee7-ed11-8e8b-000d3a739548","synced":true,"modifiedBy":"Cantrell, Alison","modifiedOn":"2023-04-30T10:07:15.13"}]</Fields>
+    <RuleInstances/>
+    <Rules/>
+  </Design>
+</SmartProperties>
+</file>
+
+<file path=customXml/item5.xml><?xml version="1.0" encoding="utf-8"?>
+<?mso-contentType ?>
+<FormTemplates xmlns="http://schemas.microsoft.com/sharepoint/v3/contenttype/forms">
+  <Display>DocumentLibraryForm</Display>
+  <Edit>DocumentLibraryForm</Edit>
+  <New>DocumentLibraryForm</New>
+</FormTemplates>
+</file>
+
+<file path=customXml/item6.xml><?xml version="1.0" encoding="utf-8"?>
+<Controls xmlns="TRC_CustomDocumentProperties">
+  <Client>
+    <Name_Full/>
+    <Name_Short1/>
+    <Name_Short2/>
+    <ContactName/>
+    <ContactTitle/>
+    <Address_Line1/>
+    <Address_Line2/>
+    <Email/>
+    <Phone/>
+  </Client>
+  <Opportunity>
+    <Name_Full/>
+    <Name_Short1/>
+    <RFX_Ref/>
+    <DueDate>2023-03-03</DueDate>
+    <DueTime/>
+  </Opportunity>
+  <TRC>
+    <ContactName/>
+    <ContactTitle/>
+    <ContactPhone/>
+    <OfficeAddress_Line1/>
+    <OfficeAddress_Line2/>
+    <OfficePhone/>
+  </TRC>
+</Controls>
+</file>
+
+<file path=customXml/item7.xml><?xml version="1.0" encoding="utf-8"?>
+<ct:contentTypeSchema xmlns:ct="http://schemas.microsoft.com/office/2006/metadata/contentType" xmlns:ma="http://schemas.microsoft.com/office/2006/metadata/properties/metaAttributes" ct:_="" ma:_="" ma:contentTypeName="Document" ma:contentTypeID="0x0101009BB12D8FE14F3A4489650781BFEE770E" ma:contentTypeVersion="15" ma:contentTypeDescription="Create a new document." ma:contentTypeScope="" ma:versionID="7d1746bd32a5760c2d33871acdca3c41">
+  <xsd:schema xmlns:xsd="http://www.w3.org/2001/XMLSchema" xmlns:xs="http://www.w3.org/2001/XMLSchema" xmlns:p="http://schemas.microsoft.com/office/2006/metadata/properties" xmlns:ns2="d29f01e0-b76f-49f6-8733-4393bd0ea6f3" xmlns:ns3="bac1e0b3-eaaf-4d82-995f-4fe6b69d5951" targetNamespace="http://schemas.microsoft.com/office/2006/metadata/properties" ma:root="true" ma:fieldsID="ce568bc54717524401e8739e311991ce" ns2:_="" ns3:_="">
+    <xsd:import namespace="d29f01e0-b76f-49f6-8733-4393bd0ea6f3"/>
+    <xsd:import namespace="bac1e0b3-eaaf-4d82-995f-4fe6b69d5951"/>
     <xsd:element name="properties">
       <xsd:complexType>
         <xsd:sequence>
           <xsd:element name="documentManagement">
             <xsd:complexType>
               <xsd:all>
-                <xsd:element ref="ns2:_dlc_DocId" minOccurs="0"/>
-                <xsd:element ref="ns2:_dlc_DocIdUrl" minOccurs="0"/>
-                <xsd:element ref="ns2:_dlc_DocIdPersistId" minOccurs="0"/>
-                <xsd:element ref="ns3:SharedWithUsers" minOccurs="0"/>
-                <xsd:element ref="ns3:SharedWithDetails" minOccurs="0"/>
-                <xsd:element ref="ns4:MediaServiceMetadata" minOccurs="0"/>
-                <xsd:element ref="ns4:MediaServiceFastMetadata" minOccurs="0"/>
-                <xsd:element ref="ns4:MediaServiceDateTaken" minOccurs="0"/>
-                <xsd:element ref="ns4:MediaLengthInSeconds" minOccurs="0"/>
-                <xsd:element ref="ns4:lcf76f155ced4ddcb4097134ff3c332f" minOccurs="0"/>
+                <xsd:element ref="ns2:SharedWithUsers" minOccurs="0"/>
+                <xsd:element ref="ns2:SharedWithDetails" minOccurs="0"/>
+                <xsd:element ref="ns3:MediaServiceMetadata" minOccurs="0"/>
+                <xsd:element ref="ns3:MediaServiceFastMetadata" minOccurs="0"/>
+                <xsd:element ref="ns3:MediaServiceObjectDetectorVersions" minOccurs="0"/>
+                <xsd:element ref="ns3:MediaServiceSearchProperties" minOccurs="0"/>
+                <xsd:element ref="ns3:lcf76f155ced4ddcb4097134ff3c332f" minOccurs="0"/>
                 <xsd:element ref="ns2:TaxCatchAll" minOccurs="0"/>
-                <xsd:element ref="ns4:MediaServiceGenerationTime" minOccurs="0"/>
-                <xsd:element ref="ns4:MediaServiceEventHashCode" minOccurs="0"/>
-                <xsd:element ref="ns4:MediaServiceOCR" minOccurs="0"/>
-                <xsd:element ref="ns4:Source" minOccurs="0"/>
-                <xsd:element ref="ns4:MediaServiceObjectDetectorVersions" minOccurs="0"/>
-                <xsd:element ref="ns4:MediaServiceLocation" minOccurs="0"/>
-                <xsd:element ref="ns4:MediaServiceSearchProperties" minOccurs="0"/>
-                <xsd:element ref="ns4:Category" minOccurs="0"/>
-                <xsd:element ref="ns4:Subcategory" minOccurs="0"/>
-                <xsd:element ref="ns4:Subject_x0020_Matter" minOccurs="0"/>
-                <xsd:element ref="ns4:Owner" minOccurs="0"/>
-                <xsd:element ref="ns4:Format_x0020__x002f__x0020_File_x0020_Type" minOccurs="0"/>
-                <xsd:element ref="ns4:Last_x0020_Updated" minOccurs="0"/>
-                <xsd:element ref="ns4:Update_x0020_Status" minOccurs="0"/>
-                <xsd:element ref="ns4:Review_x0020_Cycle" minOccurs="0"/>
-                <xsd:element ref="ns4:Resource_x0020_Type" minOccurs="0"/>
+                <xsd:element ref="ns3:MediaServiceDateTaken" minOccurs="0"/>
+                <xsd:element ref="ns3:MediaServiceGenerationTime" minOccurs="0"/>
+                <xsd:element ref="ns3:MediaServiceEventHashCode" minOccurs="0"/>
+                <xsd:element ref="ns3:MediaServiceLocation" minOccurs="0"/>
+                <xsd:element ref="ns3:MediaLengthInSeconds" minOccurs="0"/>
               </xsd:all>
             </xsd:complexType>
           </xsd:element>
@@ -15775,47 +16933,10 @@
       </xsd:complexType>
     </xsd:element>
   </xsd:schema>
-  <xsd:schema xmlns:xsd="http://www.w3.org/2001/XMLSchema" xmlns:xs="http://www.w3.org/2001/XMLSchema" xmlns:dms="http://schemas.microsoft.com/office/2006/documentManagement/types" xmlns:pc="http://schemas.microsoft.com/office/infopath/2007/PartnerControls" targetNamespace="7764588b-be80-4b22-977b-586652cb38b8" elementFormDefault="qualified">
+  <xsd:schema xmlns:xsd="http://www.w3.org/2001/XMLSchema" xmlns:xs="http://www.w3.org/2001/XMLSchema" xmlns:dms="http://schemas.microsoft.com/office/2006/documentManagement/types" xmlns:pc="http://schemas.microsoft.com/office/infopath/2007/PartnerControls" targetNamespace="d29f01e0-b76f-49f6-8733-4393bd0ea6f3" elementFormDefault="qualified">
     <xsd:import namespace="http://schemas.microsoft.com/office/2006/documentManagement/types"/>
     <xsd:import namespace="http://schemas.microsoft.com/office/infopath/2007/PartnerControls"/>
-    <xsd:element name="_dlc_DocId" ma:index="4" nillable="true" ma:displayName="Document ID Value" ma:description="The value of the document ID assigned to this item." ma:indexed="true" ma:internalName="_dlc_DocId" ma:readOnly="true">
-      <xsd:simpleType>
-        <xsd:restriction base="dms:Text"/>
-      </xsd:simpleType>
-    </xsd:element>
-    <xsd:element name="_dlc_DocIdUrl" ma:index="5" nillable="true" ma:displayName="Document ID" ma:description="Permanent link to this document." ma:hidden="true" ma:internalName="_dlc_DocIdUrl" ma:readOnly="true">
-      <xsd:complexType>
-        <xsd:complexContent>
-          <xsd:extension base="dms:URL">
-            <xsd:sequence>
-              <xsd:element name="Url" type="dms:ValidUrl" minOccurs="0" nillable="true"/>
-              <xsd:element name="Description" type="xsd:string" nillable="true"/>
-            </xsd:sequence>
-          </xsd:extension>
-        </xsd:complexContent>
-      </xsd:complexType>
-    </xsd:element>
-    <xsd:element name="_dlc_DocIdPersistId" ma:index="6" nillable="true" ma:displayName="Persist ID" ma:description="Keep ID on add." ma:hidden="true" ma:internalName="_dlc_DocIdPersistId" ma:readOnly="true">
-      <xsd:simpleType>
-        <xsd:restriction base="dms:Boolean"/>
-      </xsd:simpleType>
-    </xsd:element>
-    <xsd:element name="TaxCatchAll" ma:index="15" nillable="true" ma:displayName="Taxonomy Catch All Column" ma:hidden="true" ma:list="{8bdd5dab-23a6-4338-857c-3d3f2dd57917}" ma:internalName="TaxCatchAll" ma:showField="CatchAllData" ma:web="7764588b-be80-4b22-977b-586652cb38b8">
-      <xsd:complexType>
-        <xsd:complexContent>
-          <xsd:extension base="dms:MultiChoiceLookup">
-            <xsd:sequence>
-              <xsd:element name="Value" type="dms:Lookup" maxOccurs="unbounded" minOccurs="0" nillable="true"/>
-            </xsd:sequence>
-          </xsd:extension>
-        </xsd:complexContent>
-      </xsd:complexType>
-    </xsd:element>
-  </xsd:schema>
-  <xsd:schema xmlns:xsd="http://www.w3.org/2001/XMLSchema" xmlns:xs="http://www.w3.org/2001/XMLSchema" xmlns:dms="http://schemas.microsoft.com/office/2006/documentManagement/types" xmlns:pc="http://schemas.microsoft.com/office/infopath/2007/PartnerControls" targetNamespace="0e30f368-2351-48f1-985f-2771b1e0e99e" elementFormDefault="qualified">
-    <xsd:import namespace="http://schemas.microsoft.com/office/2006/documentManagement/types"/>
-    <xsd:import namespace="http://schemas.microsoft.com/office/infopath/2007/PartnerControls"/>
-    <xsd:element name="SharedWithUsers" ma:index="7" nillable="true" ma:displayName="Shared With" ma:internalName="SharedWithUsers" ma:readOnly="true">
+    <xsd:element name="SharedWithUsers" ma:index="8" nillable="true" ma:displayName="Shared With" ma:internalName="SharedWithUsers" ma:readOnly="true">
       <xsd:complexType>
         <xsd:complexContent>
           <xsd:extension base="dms:UserMulti">
@@ -15834,303 +16955,77 @@
         </xsd:complexContent>
       </xsd:complexType>
     </xsd:element>
-    <xsd:element name="SharedWithDetails" ma:index="8" nillable="true" ma:displayName="Shared With Details" ma:internalName="SharedWithDetails" ma:readOnly="true">
+    <xsd:element name="SharedWithDetails" ma:index="9" nillable="true" ma:displayName="Shared With Details" ma:internalName="SharedWithDetails" ma:readOnly="true">
       <xsd:simpleType>
         <xsd:restriction base="dms:Note">
           <xsd:maxLength value="255"/>
         </xsd:restriction>
       </xsd:simpleType>
     </xsd:element>
-  </xsd:schema>
-  <xsd:schema xmlns:xsd="http://www.w3.org/2001/XMLSchema" xmlns:xs="http://www.w3.org/2001/XMLSchema" xmlns:dms="http://schemas.microsoft.com/office/2006/documentManagement/types" xmlns:pc="http://schemas.microsoft.com/office/infopath/2007/PartnerControls" targetNamespace="e82a6618-5246-433f-9a3a-82cc13a7c76c" elementFormDefault="qualified">
-    <xsd:import namespace="http://schemas.microsoft.com/office/2006/documentManagement/types"/>
-    <xsd:import namespace="http://schemas.microsoft.com/office/infopath/2007/PartnerControls"/>
-    <xsd:element name="MediaServiceMetadata" ma:index="9" nillable="true" ma:displayName="MediaServiceMetadata" ma:hidden="true" ma:internalName="MediaServiceMetadata" ma:readOnly="true">
-      <xsd:simpleType>
-        <xsd:restriction base="dms:Note"/>
-      </xsd:simpleType>
-    </xsd:element>
-    <xsd:element name="MediaServiceFastMetadata" ma:index="10" nillable="true" ma:displayName="MediaServiceFastMetadata" ma:hidden="true" ma:internalName="MediaServiceFastMetadata" ma:readOnly="true">
-      <xsd:simpleType>
-        <xsd:restriction base="dms:Note"/>
-      </xsd:simpleType>
-    </xsd:element>
-    <xsd:element name="MediaServiceDateTaken" ma:index="11" nillable="true" ma:displayName="MediaServiceDateTaken" ma:hidden="true" ma:indexed="true" ma:internalName="MediaServiceDateTaken" ma:readOnly="true">
-      <xsd:simpleType>
-        <xsd:restriction base="dms:Text"/>
-      </xsd:simpleType>
-    </xsd:element>
-    <xsd:element name="MediaLengthInSeconds" ma:index="12" nillable="true" ma:displayName="MediaLengthInSeconds" ma:hidden="true" ma:internalName="MediaLengthInSeconds" ma:readOnly="true">
-      <xsd:simpleType>
-        <xsd:restriction base="dms:Unknown"/>
-      </xsd:simpleType>
-    </xsd:element>
-    <xsd:element name="lcf76f155ced4ddcb4097134ff3c332f" ma:index="14" nillable="true" ma:taxonomy="true" ma:internalName="lcf76f155ced4ddcb4097134ff3c332f" ma:taxonomyFieldName="MediaServiceImageTags" ma:displayName="Image Tags" ma:readOnly="false" ma:fieldId="{5cf76f15-5ced-4ddc-b409-7134ff3c332f}" ma:taxonomyMulti="true" ma:sspId="86030b31-b262-4dfa-bb64-35cfdf7b07c2" ma:termSetId="09814cd3-568e-fe90-9814-8d621ff8fb84" ma:anchorId="fba54fb3-c3e1-fe81-a776-ca4b69148c4d" ma:open="true" ma:isKeyword="false">
-      <xsd:complexType>
-        <xsd:sequence>
-          <xsd:element ref="pc:Terms" minOccurs="0" maxOccurs="1"/>
-        </xsd:sequence>
-      </xsd:complexType>
-    </xsd:element>
-    <xsd:element name="MediaServiceGenerationTime" ma:index="16" nillable="true" ma:displayName="MediaServiceGenerationTime" ma:hidden="true" ma:internalName="MediaServiceGenerationTime" ma:readOnly="true">
-      <xsd:simpleType>
-        <xsd:restriction base="dms:Text"/>
-      </xsd:simpleType>
-    </xsd:element>
-    <xsd:element name="MediaServiceEventHashCode" ma:index="17" nillable="true" ma:displayName="MediaServiceEventHashCode" ma:hidden="true" ma:internalName="MediaServiceEventHashCode" ma:readOnly="true">
-      <xsd:simpleType>
-        <xsd:restriction base="dms:Text"/>
-      </xsd:simpleType>
-    </xsd:element>
-    <xsd:element name="MediaServiceOCR" ma:index="18" nillable="true" ma:displayName="Extracted Text" ma:internalName="MediaServiceOCR" ma:readOnly="true">
-      <xsd:simpleType>
-        <xsd:restriction base="dms:Note">
-          <xsd:maxLength value="255"/>
-        </xsd:restriction>
-      </xsd:simpleType>
-    </xsd:element>
-    <xsd:element name="Source" ma:index="19" nillable="true" ma:displayName="Source" ma:description="Where file came from (RTC, EMI or R&amp;C)" ma:format="Dropdown" ma:internalName="Source">
-      <xsd:simpleType>
-        <xsd:restriction base="dms:Choice">
-          <xsd:enumeration value="RTC"/>
-          <xsd:enumeration value="EMI"/>
-          <xsd:enumeration value="R&amp;C"/>
-        </xsd:restriction>
-      </xsd:simpleType>
-    </xsd:element>
-    <xsd:element name="MediaServiceObjectDetectorVersions" ma:index="20" nillable="true" ma:displayName="MediaServiceObjectDetectorVersions" ma:hidden="true" ma:indexed="true" ma:internalName="MediaServiceObjectDetectorVersions" ma:readOnly="true">
-      <xsd:simpleType>
-        <xsd:restriction base="dms:Text"/>
-      </xsd:simpleType>
-    </xsd:element>
-    <xsd:element name="MediaServiceLocation" ma:index="25" nillable="true" ma:displayName="Location" ma:description="" ma:indexed="true" ma:internalName="MediaServiceLocation" ma:readOnly="true">
-      <xsd:simpleType>
-        <xsd:restriction base="dms:Text"/>
-      </xsd:simpleType>
-    </xsd:element>
-    <xsd:element name="MediaServiceSearchProperties" ma:index="26" nillable="true" ma:displayName="MediaServiceSearchProperties" ma:hidden="true" ma:internalName="MediaServiceSearchProperties" ma:readOnly="true">
-      <xsd:simpleType>
-        <xsd:restriction base="dms:Note"/>
-      </xsd:simpleType>
-    </xsd:element>
-    <xsd:element name="Category" ma:index="27" nillable="true" ma:displayName="Category" ma:internalName="Category">
+    <xsd:element name="TaxCatchAll" ma:index="15" nillable="true" ma:displayName="Taxonomy Catch All Column" ma:hidden="true" ma:list="{c2a833d9-27b6-4e59-9a18-4522ded7834b}" ma:internalName="TaxCatchAll" ma:showField="CatchAllData" ma:web="d29f01e0-b76f-49f6-8733-4393bd0ea6f3">
       <xsd:complexType>
         <xsd:complexContent>
-          <xsd:extension base="dms:MultiChoice">
+          <xsd:extension base="dms:MultiChoiceLookup">
             <xsd:sequence>
-              <xsd:element name="Value" maxOccurs="unbounded" minOccurs="0" nillable="true">
-                <xsd:simpleType>
-                  <xsd:restriction base="dms:Choice">
-                    <xsd:enumeration value="Project Management"/>
-                    <xsd:enumeration value="Communications"/>
-                    <xsd:enumeration value="Collab Lunch"/>
-                    <xsd:enumeration value="Research Design"/>
-                    <xsd:enumeration value="Data Collection"/>
-                    <xsd:enumeration value="Analysis"/>
-                    <xsd:enumeration value="Reporting"/>
-                  </xsd:restriction>
-                </xsd:simpleType>
-              </xsd:element>
+              <xsd:element name="Value" type="dms:Lookup" maxOccurs="unbounded" minOccurs="0" nillable="true"/>
             </xsd:sequence>
           </xsd:extension>
         </xsd:complexContent>
       </xsd:complexType>
     </xsd:element>
-    <xsd:element name="Subcategory" ma:index="28" nillable="true" ma:displayName="Subcategory" ma:internalName="Subcategory">
-      <xsd:complexType>
-        <xsd:complexContent>
-          <xsd:extension base="dms:MultiChoice">
-            <xsd:sequence>
-              <xsd:element name="Value" maxOccurs="unbounded" minOccurs="0" nillable="true">
-                <xsd:simpleType>
-                  <xsd:restriction base="dms:Choice">
-                    <xsd:enumeration value="Kickoff"/>
-                    <xsd:enumeration value="Workplan"/>
-                    <xsd:enumeration value="Budgeting"/>
-                    <xsd:enumeration value="Closeout"/>
-                    <xsd:enumeration value="Dashboard"/>
-                    <xsd:enumeration value="Brand Design"/>
-                    <xsd:enumeration value="Email"/>
-                    <xsd:enumeration value="Schedule"/>
-                    <xsd:enumeration value="Sampling"/>
-                    <xsd:enumeration value="Evaluating / Research Planning"/>
-                    <xsd:enumeration value="Logic Modeling"/>
-                    <xsd:enumeration value="M&amp;V"/>
-                    <xsd:enumeration value="Literature Review"/>
-                    <xsd:enumeration value="Interviews"/>
-                    <xsd:enumeration value="Surveys"/>
-                    <xsd:enumeration value="Usability Testing"/>
-                    <xsd:enumeration value="Lab/ Field"/>
-                    <xsd:enumeration value="Cost"/>
-                    <xsd:enumeration value="Market"/>
-                    <xsd:enumeration value="Workshop"/>
-                    <xsd:enumeration value="Analysis Plan"/>
-                    <xsd:enumeration value="Literature Review"/>
-                    <xsd:enumeration value="Interviews"/>
-                    <xsd:enumeration value="Surveys"/>
-                    <xsd:enumeration value="Usability Testing"/>
-                    <xsd:enumeration value="Lab / Field"/>
-                    <xsd:enumeration value="Cost"/>
-                    <xsd:enumeration value="Market"/>
-                    <xsd:enumeration value="Data Visualization"/>
-                    <xsd:enumeration value="Writing &amp; Editing"/>
-                    <xsd:enumeration value="Analysis"/>
-                    <xsd:enumeration value="Presentation"/>
-                    <xsd:enumeration value="Execution"/>
-                    <xsd:enumeration value="Expenses / Invoices"/>
-                    <xsd:enumeration value="Vendors"/>
-                    <xsd:enumeration value="Intros"/>
-                    <xsd:enumeration value="Journey Mapping"/>
-                    <xsd:enumeration value="SmartSheet"/>
-                    <xsd:enumeration value="Scoping"/>
-                    <xsd:enumeration value="Meetings"/>
-                    <xsd:enumeration value="Roles"/>
-                  </xsd:restriction>
-                </xsd:simpleType>
-              </xsd:element>
-            </xsd:sequence>
-          </xsd:extension>
-        </xsd:complexContent>
-      </xsd:complexType>
-    </xsd:element>
-    <xsd:element name="Subject_x0020_Matter" ma:index="29" nillable="true" ma:displayName="Subject Matter" ma:internalName="Subject_x0020_Matter">
-      <xsd:complexType>
-        <xsd:complexContent>
-          <xsd:extension base="dms:MultiChoice">
-            <xsd:sequence>
-              <xsd:element name="Value" maxOccurs="unbounded" minOccurs="0" nillable="true">
-                <xsd:simpleType>
-                  <xsd:restriction base="dms:Choice">
-                    <xsd:enumeration value="Behavioral"/>
-                    <xsd:enumeration value="Codes &amp; Standards"/>
-                    <xsd:enumeration value="Consulting"/>
-                    <xsd:enumeration value="CRM / IT"/>
-                    <xsd:enumeration value="Custom"/>
-                    <xsd:enumeration value="Data &amp; Analytics"/>
-                    <xsd:enumeration value="Decarbonization"/>
-                    <xsd:enumeration value="Efficient Products"/>
-                    <xsd:enumeration value="Electrification - Other"/>
-                    <xsd:enumeration value="Electrification - Transportation"/>
-                    <xsd:enumeration value="Energy Audits / Benchmarking"/>
-                    <xsd:enumeration value="Energy Equity"/>
-                    <xsd:enumeration value="Energy Master Planning"/>
-                    <xsd:enumeration value="Energy Storage / Battery Storage"/>
-                    <xsd:enumeration value="Existing Homes"/>
-                    <xsd:enumeration value="Feasibility Studies"/>
-                    <xsd:enumeration value="Impact Evaluation"/>
-                    <xsd:enumeration value="Industrial Process Improvement"/>
-                    <xsd:enumeration value="Market Research &amp; Characterization"/>
-                    <xsd:enumeration value="Midstream"/>
-                    <xsd:enumeration value="New Construction"/>
-                    <xsd:enumeration value="Other - Engineering"/>
-                    <xsd:enumeration value="Other - Programs"/>
-                    <xsd:enumeration value="Prescriptive"/>
-                    <xsd:enumeration value="Process Evaluation"/>
-                    <xsd:enumeration value="Program / Pilot Design"/>
-                    <xsd:enumeration value="Retrocommissioning (RCx)"/>
-                    <xsd:enumeration value="Strategic Energy Management (SEM)"/>
-                    <xsd:enumeration value="Strategic Planning"/>
-                    <xsd:enumeration value="Technical Assistance Services"/>
-                    <xsd:enumeration value="Trade Ally Management"/>
-                    <xsd:enumeration value="Workforce Development &amp; Training"/>
-                    <xsd:enumeration value="Electrification"/>
-                    <xsd:enumeration value="Transportation Electrification"/>
-                    <xsd:enumeration value="Process Improvement"/>
-                    <xsd:enumeration value="M&amp;V"/>
-                    <xsd:enumeration value="Policy"/>
-                    <xsd:enumeration value="Impact Evaluations"/>
-                  </xsd:restriction>
-                </xsd:simpleType>
-              </xsd:element>
-            </xsd:sequence>
-          </xsd:extension>
-        </xsd:complexContent>
-      </xsd:complexType>
-    </xsd:element>
-    <xsd:element name="Owner" ma:index="30" nillable="true" ma:displayName="Owner" ma:list="UserInfo" ma:SharePointGroup="0" ma:internalName="Owner" ma:showField="ImnName">
-      <xsd:complexType>
-        <xsd:complexContent>
-          <xsd:extension base="dms:User">
-            <xsd:sequence>
-              <xsd:element name="UserInfo" minOccurs="0" maxOccurs="unbounded">
-                <xsd:complexType>
-                  <xsd:sequence>
-                    <xsd:element name="DisplayName" type="xsd:string" minOccurs="0"/>
-                    <xsd:element name="AccountId" type="dms:UserId" minOccurs="0" nillable="true"/>
-                    <xsd:element name="AccountType" type="xsd:string" minOccurs="0"/>
-                  </xsd:sequence>
-                </xsd:complexType>
-              </xsd:element>
-            </xsd:sequence>
-          </xsd:extension>
-        </xsd:complexContent>
-      </xsd:complexType>
-    </xsd:element>
-    <xsd:element name="Format_x0020__x002f__x0020_File_x0020_Type" ma:index="31" nillable="true" ma:displayName="Format / File Type" ma:internalName="Format_x0020__x002f__x0020_File_x0020_Type">
-      <xsd:complexType>
-        <xsd:complexContent>
-          <xsd:extension base="dms:MultiChoice">
-            <xsd:sequence>
-              <xsd:element name="Value" maxOccurs="unbounded" minOccurs="0" nillable="true">
-                <xsd:simpleType>
-                  <xsd:restriction base="dms:Choice">
-                    <xsd:enumeration value="Document"/>
-                    <xsd:enumeration value="Slide Deck"/>
-                    <xsd:enumeration value="Spreadsheet"/>
-                    <xsd:enumeration value="Interactive Tool"/>
-                    <xsd:enumeration value="PDF"/>
-                  </xsd:restriction>
-                </xsd:simpleType>
-              </xsd:element>
-            </xsd:sequence>
-          </xsd:extension>
-        </xsd:complexContent>
-      </xsd:complexType>
-    </xsd:element>
-    <xsd:element name="Last_x0020_Updated" ma:index="32" nillable="true" ma:displayName="Last Updated" ma:format="DateOnly" ma:internalName="Last_x0020_Updated">
+  </xsd:schema>
+  <xsd:schema xmlns:xsd="http://www.w3.org/2001/XMLSchema" xmlns:xs="http://www.w3.org/2001/XMLSchema" xmlns:dms="http://schemas.microsoft.com/office/2006/documentManagement/types" xmlns:pc="http://schemas.microsoft.com/office/infopath/2007/PartnerControls" targetNamespace="bac1e0b3-eaaf-4d82-995f-4fe6b69d5951" elementFormDefault="qualified">
+    <xsd:import namespace="http://schemas.microsoft.com/office/2006/documentManagement/types"/>
+    <xsd:import namespace="http://schemas.microsoft.com/office/infopath/2007/PartnerControls"/>
+    <xsd:element name="MediaServiceMetadata" ma:index="10" nillable="true" ma:displayName="MediaServiceMetadata" ma:hidden="true" ma:internalName="MediaServiceMetadata" ma:readOnly="true">
       <xsd:simpleType>
-        <xsd:restriction base="dms:DateTime"/>
+        <xsd:restriction base="dms:Note"/>
       </xsd:simpleType>
     </xsd:element>
-    <xsd:element name="Update_x0020_Status" ma:index="33" nillable="true" ma:displayName="Update Status" ma:format="Dropdown" ma:internalName="Update_x0020_Status">
+    <xsd:element name="MediaServiceFastMetadata" ma:index="11" nillable="true" ma:displayName="MediaServiceFastMetadata" ma:hidden="true" ma:internalName="MediaServiceFastMetadata" ma:readOnly="true">
       <xsd:simpleType>
-        <xsd:restriction base="dms:Choice">
-          <xsd:enumeration value="Up to date"/>
-          <xsd:enumeration value="Needs updating; DO NOT USE"/>
-          <xsd:enumeration value="Needs updating; Can still use"/>
-        </xsd:restriction>
+        <xsd:restriction base="dms:Note"/>
       </xsd:simpleType>
     </xsd:element>
-    <xsd:element name="Review_x0020_Cycle" ma:index="34" nillable="true" ma:displayName="Review Cycle" ma:format="DateOnly" ma:internalName="Review_x0020_Cycle">
+    <xsd:element name="MediaServiceObjectDetectorVersions" ma:index="12" nillable="true" ma:displayName="MediaServiceObjectDetectorVersions" ma:hidden="true" ma:indexed="true" ma:internalName="MediaServiceObjectDetectorVersions" ma:readOnly="true">
       <xsd:simpleType>
-        <xsd:restriction base="dms:DateTime"/>
+        <xsd:restriction base="dms:Text"/>
       </xsd:simpleType>
     </xsd:element>
-    <xsd:element name="Resource_x0020_Type" ma:index="35" nillable="true" ma:displayName="Resource Type" ma:internalName="Resource_x0020_Type">
-      <xsd:complexType>
-        <xsd:complexContent>
-          <xsd:extension base="dms:MultiChoice">
-            <xsd:sequence>
-              <xsd:element name="Value" maxOccurs="unbounded" minOccurs="0" nillable="true">
-                <xsd:simpleType>
-                  <xsd:restriction base="dms:Choice">
-                    <xsd:enumeration value="Best Practices / Tips / Guidelines"/>
-                    <xsd:enumeration value="Contact List"/>
-                    <xsd:enumeration value="Example"/>
-                    <xsd:enumeration value="Log / Tracker"/>
-                    <xsd:enumeration value="Process"/>
-                    <xsd:enumeration value="Publication / Reference"/>
-                    <xsd:enumeration value="Template"/>
-                    <xsd:enumeration value="Tool"/>
-                    <xsd:enumeration value="Training"/>
-                    <xsd:enumeration value="Images"/>
-                  </xsd:restriction>
-                </xsd:simpleType>
-              </xsd:element>
-            </xsd:sequence>
-          </xsd:extension>
-        </xsd:complexContent>
-      </xsd:complexType>
+    <xsd:element name="MediaServiceSearchProperties" ma:index="13" nillable="true" ma:displayName="MediaServiceSearchProperties" ma:hidden="true" ma:internalName="MediaServiceSearchProperties" ma:readOnly="true">
+      <xsd:simpleType>
+        <xsd:restriction base="dms:Note"/>
+      </xsd:simpleType>
+    </xsd:element>
+    <xsd:element name="lcf76f155ced4ddcb4097134ff3c332f" ma:index="14" nillable="true" ma:displayName="Image Tags_0" ma:hidden="true" ma:internalName="lcf76f155ced4ddcb4097134ff3c332f">
+      <xsd:simpleType>
+        <xsd:restriction base="dms:Note"/>
+      </xsd:simpleType>
+    </xsd:element>
+    <xsd:element name="MediaServiceDateTaken" ma:index="16" nillable="true" ma:displayName="MediaServiceDateTaken" ma:hidden="true" ma:indexed="true" ma:internalName="MediaServiceDateTaken" ma:readOnly="true">
+      <xsd:simpleType>
+        <xsd:restriction base="dms:Text"/>
+      </xsd:simpleType>
+    </xsd:element>
+    <xsd:element name="MediaServiceGenerationTime" ma:index="17" nillable="true" ma:displayName="MediaServiceGenerationTime" ma:hidden="true" ma:internalName="MediaServiceGenerationTime" ma:readOnly="true">
+      <xsd:simpleType>
+        <xsd:restriction base="dms:Text"/>
+      </xsd:simpleType>
+    </xsd:element>
+    <xsd:element name="MediaServiceEventHashCode" ma:index="18" nillable="true" ma:displayName="MediaServiceEventHashCode" ma:hidden="true" ma:internalName="MediaServiceEventHashCode" ma:readOnly="true">
+      <xsd:simpleType>
+        <xsd:restriction base="dms:Text"/>
+      </xsd:simpleType>
+    </xsd:element>
+    <xsd:element name="MediaServiceLocation" ma:index="19" nillable="true" ma:displayName="Location" ma:indexed="true" ma:internalName="MediaServiceLocation" ma:readOnly="true">
+      <xsd:simpleType>
+        <xsd:restriction base="dms:Text"/>
+      </xsd:simpleType>
+    </xsd:element>
+    <xsd:element name="MediaLengthInSeconds" ma:index="20" nillable="true" ma:displayName="MediaLengthInSeconds" ma:hidden="true" ma:internalName="MediaLengthInSeconds" ma:readOnly="true">
+      <xsd:simpleType>
+        <xsd:restriction base="dms:Unknown"/>
+      </xsd:simpleType>
     </xsd:element>
   </xsd:schema>
   <xsd:schema xmlns="http://schemas.openxmlformats.org/package/2006/metadata/core-properties" xmlns:xsd="http://www.w3.org/2001/XMLSchema" xmlns:xsi="http://www.w3.org/2001/XMLSchema-instance" xmlns:dc="http://purl.org/dc/elements/1.1/" xmlns:dcterms="http://purl.org/dc/terms/" xmlns:odoc="http://schemas.microsoft.com/internal/obd" targetNamespace="http://schemas.openxmlformats.org/package/2006/metadata/core-properties" elementFormDefault="qualified" attributeFormDefault="unqualified" blockDefault="#all">
@@ -16142,8 +17037,8 @@
         <xsd:element ref="dc:creator" minOccurs="0" maxOccurs="1"/>
         <xsd:element ref="dcterms:created" minOccurs="0" maxOccurs="1"/>
         <xsd:element ref="dc:identifier" minOccurs="0" maxOccurs="1"/>
-        <xsd:element name="contentType" minOccurs="0" maxOccurs="1" type="xsd:string" ma:index="21" ma:displayName="Content Type"/>
-        <xsd:element ref="dc:title" minOccurs="0" maxOccurs="1" ma:index="3" ma:displayName="Title"/>
+        <xsd:element name="contentType" minOccurs="0" maxOccurs="1" type="xsd:string" ma:index="0" ma:displayName="Content Type"/>
+        <xsd:element ref="dc:title" minOccurs="0" maxOccurs="1" ma:index="4" ma:displayName="Title"/>
         <xsd:element ref="dc:subject" minOccurs="0" maxOccurs="1"/>
         <xsd:element ref="dc:description" minOccurs="0" maxOccurs="1"/>
         <xsd:element name="keywords" minOccurs="0" maxOccurs="1" type="xsd:string"/>
@@ -16232,122 +17127,7 @@
 </ct:contentTypeSchema>
 </file>
 
-<file path=customXml/item5.xml><?xml version="1.0" encoding="utf-8"?>
-<Controls xmlns="TRC_CustomDocumentProperties">
-  <Client>
-    <Name_Full/>
-    <Name_Short1/>
-    <Name_Short2/>
-    <ContactName/>
-    <ContactTitle/>
-    <Address_Line1/>
-    <Address_Line2/>
-    <Email/>
-    <Phone/>
-  </Client>
-  <Opportunity>
-    <Name_Full/>
-    <Name_Short1/>
-    <RFX_Ref/>
-    <DueDate>2023-03-03</DueDate>
-    <DueTime/>
-  </Opportunity>
-  <TRC>
-    <ContactName/>
-    <ContactTitle/>
-    <ContactPhone/>
-    <OfficeAddress_Line1/>
-    <OfficeAddress_Line2/>
-    <OfficePhone/>
-  </TRC>
-</Controls>
-</file>
-
-<file path=customXml/item6.xml><?xml version="1.0" encoding="utf-8"?>
-<SmartProperties xmlns="http://www.qorusdocs.com/office/smartProperties" version="1">
-  <Contents/>
-  <Fields/>
-  <FieldValues/>
-  <DocumentSettings xmlns="">[{"name":"AutoExpandAddin","value":"2"},{"name":"TemplateAutoExpandAddin","value":"2"},{"name":"TemplateAutoInstallAddin","value":"false"}]</DocumentSettings>
-  <Design xmlns="">
-    <Fields>[{"id":"ad976519-90d8-ed11-8e8b-000d3a73eeaa","name":"&lt;Client Name&gt;","displayName":"Client Name","description":"Enter company name","reference":null,"type":0,"format":null,"required":false,"createdOn":"2023-04-11T17:41:35.723","createdBy":"Cantrell, Alison","modifiedOn":"2023-04-30T09:51:13.677","modifiedBy":"Cantrell, Alison","value":null,"rememberValues":true,"rememberValuesScope":2,"defaultValue":"","imageFitOption":0,"placeholderImageUrl":null,"contentSourceId":null,"isValueBound":false,"boundObjectName":null,"respectSectionBreak":false,"usage":2,"synced":true},{"name":"&lt;Opportunity Name&gt;","value":"","displayName":"Opportunity Name","usage":2,"type":0,"description":"","rememberValues":true,"rememberValuesScope":2,"format":null,"firstIndex":13,"id":"efb4971c-3ce7-ed11-8e8b-000d3a739548","synced":true,"modifiedBy":"Cantrell, Alison","modifiedOn":"2023-04-30T09:48:09.217"},{"name":"&lt;Client Contact Name&gt;","value":"","displayName":"Client Contact Name","usage":2,"type":0,"description":"","rememberValues":true,"rememberValuesScope":2,"format":null,"firstIndex":58,"id":"b6ba8825-3ce7-ed11-8e8b-000d3a739548","synced":true,"modifiedBy":"Cantrell, Alison","modifiedOn":"2023-04-30T09:48:24.22"},{"name":"&lt;Client Contact Title&gt;","value":"","displayName":"Client Contact Title","usage":2,"type":0,"description":"","rememberValues":true,"rememberValuesScope":2,"format":null,"firstIndex":79,"id":"8fec712c-3ce7-ed11-8e8b-000d3a739548","synced":true,"modifiedBy":"Cantrell, Alison","modifiedOn":"2023-04-30T09:48:35.817"},{"name":"&lt;TRC Contact Name&gt;","value":"","displayName":"TRC Contact Name","usage":2,"type":0,"description":"Person who will sign cover letter","rememberValues":false,"rememberValuesScope":0,"format":null,"firstIndex":101,"id":"f2c485d2-3ce7-ed11-8e8b-000d3a739548","synced":true,"modifiedBy":"Cantrell, Alison","modifiedOn":"2023-04-30T09:53:14.443"},{"name":"&lt;TRC Contact Title&gt;","value":"","displayName":"TRC Contact Title","usage":2,"type":0,"description":"Title of person who will sign cover letter","rememberValues":false,"rememberValuesScope":0,"format":null,"firstIndex":119,"id":"588e86dc-3ce7-ed11-8e8b-000d3a739548","synced":true,"modifiedBy":"Cantrell, Alison","modifiedOn":"2023-04-30T09:53:31.227"},{"name":"&lt;Bid Due Date&gt;","value":"","displayName":"Bid Due Date","usage":2,"type":3,"description":"Enter date bid is due","rememberValues":false,"rememberValuesScope":0,"format":"{\"outputFormat\":\"MMMM dd, yyyy\"}","firstIndex":138,"id":"805de6a5-3ce7-ed11-8e8b-000d3a739548","synced":true,"defaultValue":null,"modifiedBy":"Cantrell, Alison","modifiedOn":"2023-04-30T09:51:59.577"},{"name":"&lt;Solicitation Type&gt;","value":"","displayName":"Solicitation Type","usage":2,"type":0,"description":"RFx type (RFI, RFQ, SOQ, RFP, RFA, etc.)","rememberValues":false,"rememberValuesScope":0,"format":null,"firstIndex":152,"id":"4a5f2eef-3ce7-ed11-8e8b-000d3a739548","synced":true,"modifiedBy":"Cantrell, Alison","modifiedOn":"2023-04-30T09:54:02.527"},{"name":"&lt;Solicitation Number&gt;","value":"","displayName":"Solicitation Number","usage":2,"type":0,"description":"Enter the client's designated RFx number","rememberValues":false,"rememberValuesScope":0,"format":null,"firstIndex":174,"id":"388e80ba-3ce7-ed11-8e8b-000d3a739548","synced":true,"modifiedBy":"Cantrell, Alison","modifiedOn":"2023-04-30T09:52:34.143"},{"id":"ad976519-90d8-ed11-8e8b-000d3a73eeaa","name":"&lt;Client Name&gt;","displayName":"Client Name","description":"Enter company name","reference":null,"type":0,"format":null,"required":false,"createdOn":"2023-04-11T17:41:35.723","createdBy":"Cantrell, Alison","modifiedOn":"2023-04-30T09:51:13.677","modifiedBy":"Cantrell, Alison","value":null,"rememberValues":true,"rememberValuesScope":2,"defaultValue":"","imageFitOption":0,"placeholderImageUrl":null,"contentSourceId":null,"isValueBound":false,"boundObjectName":null,"respectSectionBreak":false,"usage":2,"synced":true},{"name":"&lt;Client Contact Name&gt;","value":"","displayName":"Client Contact Name","usage":2,"type":0,"description":"","rememberValues":true,"rememberValuesScope":2,"format":null,"firstIndex":58,"id":"b6ba8825-3ce7-ed11-8e8b-000d3a739548","synced":true,"modifiedBy":"Cantrell, Alison","modifiedOn":"2023-04-30T09:48:24.22"},{"name":"&lt;Client Contact Title&gt;","value":"","displayName":"Client Contact Title","usage":2,"type":0,"description":"","rememberValues":true,"rememberValuesScope":2,"format":null,"firstIndex":79,"id":"8fec712c-3ce7-ed11-8e8b-000d3a739548","synced":true,"modifiedBy":"Cantrell, Alison","modifiedOn":"2023-04-30T09:48:35.817"},{"name":"&lt;Client Contact Address – Line 1&gt;","value":"","displayName":"Client Contact Address – Line 1","usage":0,"type":0,"description":"","rememberValues":false,"rememberValuesScope":0,"format":null,"firstIndex":265,"id":null,"synced":true},{"name":"&lt;Client Contact Address – Line 2&gt;","value":"","displayName":"Client Contact Address – Line 2","usage":0,"type":0,"description":"","rememberValues":false,"rememberValuesScope":0,"format":null,"firstIndex":298,"id":null,"synced":true},{"name":"&lt;Bid Due Date&gt;","value":"","displayName":"Bid Due Date","usage":2,"type":3,"description":"Enter date bid is due","rememberValues":false,"rememberValuesScope":0,"format":"{\"outputFormat\":\"MMMM dd, yyyy\"}","firstIndex":138,"id":"805de6a5-3ce7-ed11-8e8b-000d3a739548","synced":true,"defaultValue":null,"modifiedBy":"Cantrell, Alison","modifiedOn":"2023-04-30T09:51:59.577"},{"name":"&lt;Opportunity Name&gt;","value":"","displayName":"Opportunity Name","usage":2,"type":0,"description":"","rememberValues":true,"rememberValuesScope":2,"format":null,"firstIndex":13,"id":"efb4971c-3ce7-ed11-8e8b-000d3a739548","synced":true,"modifiedBy":"Cantrell, Alison","modifiedOn":"2023-04-30T09:48:09.217"},{"name":"&lt;Opportunity Name&gt;","value":"","displayName":"Opportunity Name","usage":2,"type":0,"description":"","rememberValues":true,"rememberValuesScope":2,"format":null,"firstIndex":13,"id":"efb4971c-3ce7-ed11-8e8b-000d3a739548","synced":true,"modifiedBy":"Cantrell, Alison","modifiedOn":"2023-04-30T09:48:09.217"},{"name":"&lt;Solicitation Type&gt;","value":"","displayName":"Solicitation Type","usage":2,"type":0,"description":"RFx type (RFI, RFQ, SOQ, RFP, RFA, etc.)","rememberValues":false,"rememberValuesScope":0,"format":null,"firstIndex":152,"id":"4a5f2eef-3ce7-ed11-8e8b-000d3a739548","synced":true,"modifiedBy":"Cantrell, Alison","modifiedOn":"2023-04-30T09:54:02.527"},{"name":"&lt;Solicitation Number&gt;","value":"","displayName":"Solicitation Number","usage":2,"type":0,"description":"Enter the client's designated RFx number","rememberValues":false,"rememberValuesScope":0,"format":null,"firstIndex":174,"id":"388e80ba-3ce7-ed11-8e8b-000d3a739548","synced":true,"modifiedBy":"Cantrell, Alison","modifiedOn":"2023-04-30T09:52:34.143"},{"id":"ad976519-90d8-ed11-8e8b-000d3a73eeaa","name":"&lt;Client Name&gt;","displayName":"Client Name","description":"Enter company name","reference":null,"type":0,"format":null,"required":false,"createdOn":"2023-04-11T17:41:35.723","createdBy":"Cantrell, Alison","modifiedOn":"2023-04-30T09:51:13.677","modifiedBy":"Cantrell, Alison","value":null,"rememberValues":true,"rememberValuesScope":2,"defaultValue":"","imageFitOption":0,"placeholderImageUrl":null,"contentSourceId":null,"isValueBound":false,"boundObjectName":null,"respectSectionBreak":false,"usage":2,"synced":true},{"name":"&lt;Opportunity Name&gt;","value":"","displayName":"Opportunity Name","usage":2,"type":0,"description":"","rememberValues":true,"rememberValuesScope":2,"format":null,"firstIndex":13,"id":"efb4971c-3ce7-ed11-8e8b-000d3a739548","synced":true,"modifiedBy":"Cantrell, Alison","modifiedOn":"2023-04-30T09:48:09.217"},{"id":"ad976519-90d8-ed11-8e8b-000d3a73eeaa","name":"&lt;Client Name&gt;","displayName":"Client Name","description":"Enter company name","reference":null,"type":0,"format":null,"required":false,"createdOn":"2023-04-11T17:41:35.723","createdBy":"Cantrell, Alison","modifiedOn":"2023-04-30T09:51:13.677","modifiedBy":"Cantrell, Alison","value":null,"rememberValues":true,"rememberValuesScope":2,"defaultValue":"","imageFitOption":0,"placeholderImageUrl":null,"contentSourceId":null,"isValueBound":false,"boundObjectName":null,"respectSectionBreak":false,"usage":2,"synced":true},{"id":"ad976519-90d8-ed11-8e8b-000d3a73eeaa","name":"&lt;Client Name&gt;","displayName":"Client Name","description":"Enter company name","reference":null,"type":0,"format":null,"required":false,"createdOn":"2023-04-11T17:41:35.723","createdBy":"Cantrell, Alison","modifiedOn":"2023-04-30T09:51:13.677","modifiedBy":"Cantrell, Alison","value":null,"rememberValues":true,"rememberValuesScope":2,"defaultValue":"","imageFitOption":0,"placeholderImageUrl":null,"contentSourceId":null,"isValueBound":false,"boundObjectName":null,"respectSectionBreak":false,"usage":2,"synced":true},{"id":"ad976519-90d8-ed11-8e8b-000d3a73eeaa","name":"&lt;Client Name&gt;","displayName":"Client Name","description":"Enter company name","reference":null,"type":0,"format":null,"required":false,"createdOn":"2023-04-11T17:41:35.723","createdBy":"Cantrell, Alison","modifiedOn":"2023-04-30T09:51:13.677","modifiedBy":"Cantrell, Alison","value":null,"rememberValues":true,"rememberValuesScope":2,"defaultValue":"","imageFitOption":0,"placeholderImageUrl":null,"contentSourceId":null,"isValueBound":false,"boundObjectName":null,"respectSectionBreak":false,"usage":2,"synced":true},{"id":"ad976519-90d8-ed11-8e8b-000d3a73eeaa","name":"&lt;Client Name&gt;","displayName":"Client Name","description":"Enter company name","reference":null,"type":0,"format":null,"required":false,"createdOn":"2023-04-11T17:41:35.723","createdBy":"Cantrell, Alison","modifiedOn":"2023-04-30T09:51:13.677","modifiedBy":"Cantrell, Alison","value":null,"rememberValues":true,"rememberValuesScope":2,"defaultValue":"","imageFitOption":0,"placeholderImageUrl":null,"contentSourceId":null,"isValueBound":false,"boundObjectName":null,"respectSectionBreak":false,"usage":2,"synced":true},{"name":"&lt;TRC Contact Name&gt;","value":"","displayName":"TRC Contact Name","usage":2,"type":0,"description":"Person who will sign cover letter","rememberValues":false,"rememberValuesScope":0,"format":null,"firstIndex":101,"id":"f2c485d2-3ce7-ed11-8e8b-000d3a739548","synced":true,"modifiedBy":"Cantrell, Alison","modifiedOn":"2023-04-30T09:53:14.443"},{"name":"&lt;Client Contact Title&gt;","value":"","displayName":"Client Contact Title","usage":2,"type":0,"description":"","rememberValues":true,"rememberValuesScope":2,"format":null,"firstIndex":79,"id":"8fec712c-3ce7-ed11-8e8b-000d3a739548","synced":true,"modifiedBy":"Cantrell, Alison","modifiedOn":"2023-04-30T09:48:35.817"},{"name":"&lt;TRC Contact Phone&gt;","value":"","displayName":"TRC Contact Phone","usage":2,"type":0,"description":"","rememberValues":false,"rememberValuesScope":0,"format":null,"firstIndex":1635,"id":"2c9c0b82-3ee7-ed11-8e8b-000d3a739548","synced":true,"modifiedBy":"Cantrell, Alison","modifiedOn":"2023-04-30T10:05:18.437"},{"name":"&lt;Appendix 1 Title&gt;","value":"","displayName":"Appendix 1 Title","usage":2,"type":0,"description":"Name of Appendix 1","rememberValues":false,"rememberValuesScope":0,"format":null,"firstIndex":4757,"id":"e90fbfe4-3ee7-ed11-8e8b-000d3a739548","synced":true,"modifiedBy":"Cantrell, Alison","modifiedOn":"2023-04-30T10:08:04.013"},{"name":"&lt;Appendix 2 Title&gt;","value":"","displayName":"Appendix 2 Title","usage":0,"type":0,"description":"","rememberValues":false,"rememberValuesScope":0,"format":null,"firstIndex":4785,"id":null,"synced":true},{"name":"&lt;Appendix 3 Title&gt;","value":"","displayName":"Appendix 3 Title","usage":0,"type":0,"description":"","rememberValues":false,"rememberValuesScope":0,"format":null,"firstIndex":4813,"id":null,"synced":true},{"name":"&lt;Appendix 4 Title&gt;","value":"","displayName":"Appendix 4 Title","usage":0,"type":0,"description":"","rememberValues":false,"rememberValuesScope":0,"format":null,"firstIndex":4841,"id":null,"synced":true},{"name":"&lt;Appendix 5 Title&gt;","value":"","displayName":"Appendix 5 Title","usage":0,"type":0,"description":"","rememberValues":false,"rememberValuesScope":0,"format":null,"firstIndex":4869,"id":null,"synced":true},{"name":"&lt;Current Year&gt;","value":"","displayName":"Current Year","usage":2,"type":0,"description":"Year the proposal is submitted in","rememberValues":true,"rememberValuesScope":2,"format":null,"firstIndex":5019,"id":"aa569ac7-3ee7-ed11-8e8b-000d3a739548","synced":true,"modifiedBy":"Cantrell, Alison","modifiedOn":"2023-04-30T10:07:15.13"},{"id":"ad976519-90d8-ed11-8e8b-000d3a73eeaa","name":"&lt;Client Name&gt;","displayName":"Client Name","description":"Enter company name","reference":null,"type":0,"format":null,"required":false,"createdOn":"2023-04-11T17:41:35.723","createdBy":"Cantrell, Alison","modifiedOn":"2023-04-30T09:51:13.677","modifiedBy":"Cantrell, Alison","value":null,"rememberValues":true,"rememberValuesScope":2,"defaultValue":"","imageFitOption":0,"placeholderImageUrl":null,"contentSourceId":null,"isValueBound":false,"boundObjectName":null,"respectSectionBreak":false,"usage":2,"synced":true},{"name":"&lt;Opportunity Name&gt;","value":"","displayName":"Opportunity Name","usage":2,"type":0,"description":"","rememberValues":true,"rememberValuesScope":2,"format":null,"firstIndex":13,"id":"efb4971c-3ce7-ed11-8e8b-000d3a739548","synced":true,"modifiedBy":"Cantrell, Alison","modifiedOn":"2023-04-30T09:48:09.217"},{"name":"&lt;Current Year&gt;","value":"","displayName":"Current Year","usage":2,"type":0,"description":"Year the proposal is submitted in","rememberValues":true,"rememberValuesScope":2,"format":null,"firstIndex":5019,"id":"aa569ac7-3ee7-ed11-8e8b-000d3a739548","synced":true,"modifiedBy":"Cantrell, Alison","modifiedOn":"2023-04-30T10:07:15.13"},{"name":"&lt;Current Year&gt;","value":"","displayName":"Current Year","usage":2,"type":0,"description":"Year the proposal is submitted in","rememberValues":true,"rememberValuesScope":2,"format":null,"firstIndex":5019,"id":"aa569ac7-3ee7-ed11-8e8b-000d3a739548","synced":true,"modifiedBy":"Cantrell, Alison","modifiedOn":"2023-04-30T10:07:15.13"}]</Fields>
-    <RuleInstances/>
-    <Rules/>
-  </Design>
-</SmartProperties>
-</file>
-
-<file path=customXml/item7.xml><?xml version="1.0" encoding="utf-8"?>
-<?mso-contentType ?>
-<FormTemplates xmlns="http://schemas.microsoft.com/sharepoint/v3/contenttype/forms">
-  <Display>DocumentLibraryForm</Display>
-  <Edit>DocumentLibraryForm</Edit>
-  <New>DocumentLibraryForm</New>
-</FormTemplates>
-</file>
-
-<file path=customXml/item8.xml><?xml version="1.0" encoding="utf-8"?>
-<?mso-contentType ?>
-<spe:Receivers xmlns:spe="http://schemas.microsoft.com/sharepoint/events">
-  <Receiver>
-    <Name>Document ID Generator</Name>
-    <Synchronization>Synchronous</Synchronization>
-    <Type>10001</Type>
-    <SequenceNumber>1000</SequenceNumber>
-    <Url/>
-    <Assembly>Microsoft.Office.DocumentManagement, Version=16.0.0.0, Culture=neutral, PublicKeyToken=71e9bce111e9429c</Assembly>
-    <Class>Microsoft.Office.DocumentManagement.Internal.DocIdHandler</Class>
-    <Data/>
-    <Filter/>
-  </Receiver>
-  <Receiver>
-    <Name>Document ID Generator</Name>
-    <Synchronization>Synchronous</Synchronization>
-    <Type>10002</Type>
-    <SequenceNumber>1001</SequenceNumber>
-    <Url/>
-    <Assembly>Microsoft.Office.DocumentManagement, Version=16.0.0.0, Culture=neutral, PublicKeyToken=71e9bce111e9429c</Assembly>
-    <Class>Microsoft.Office.DocumentManagement.Internal.DocIdHandler</Class>
-    <Data/>
-    <Filter/>
-  </Receiver>
-  <Receiver>
-    <Name>Document ID Generator</Name>
-    <Synchronization>Synchronous</Synchronization>
-    <Type>10004</Type>
-    <SequenceNumber>1002</SequenceNumber>
-    <Url/>
-    <Assembly>Microsoft.Office.DocumentManagement, Version=16.0.0.0, Culture=neutral, PublicKeyToken=71e9bce111e9429c</Assembly>
-    <Class>Microsoft.Office.DocumentManagement.Internal.DocIdHandler</Class>
-    <Data/>
-    <Filter/>
-  </Receiver>
-  <Receiver>
-    <Name>Document ID Generator</Name>
-    <Synchronization>Synchronous</Synchronization>
-    <Type>10006</Type>
-    <SequenceNumber>1003</SequenceNumber>
-    <Url/>
-    <Assembly>Microsoft.Office.DocumentManagement, Version=16.0.0.0, Culture=neutral, PublicKeyToken=71e9bce111e9429c</Assembly>
-    <Class>Microsoft.Office.DocumentManagement.Internal.DocIdHandler</Class>
-    <Data/>
-    <Filter/>
-  </Receiver>
-</spe:Receivers>
-</file>
-
 <file path=customXml/itemProps1.xml><?xml version="1.0" encoding="utf-8"?>
-<ds:datastoreItem xmlns:ds="http://schemas.openxmlformats.org/officeDocument/2006/customXml" ds:itemID="{779CEB37-0F8D-4668-8EC3-8EEF9309B7CB}">
-  <ds:schemaRefs>
-    <ds:schemaRef ds:uri="http://schemas.microsoft.com/office/2006/metadata/properties"/>
-    <ds:schemaRef ds:uri="http://schemas.microsoft.com/office/infopath/2007/PartnerControls"/>
-    <ds:schemaRef ds:uri="7764588b-be80-4b22-977b-586652cb38b8"/>
-    <ds:schemaRef ds:uri="e82a6618-5246-433f-9a3a-82cc13a7c76c"/>
-  </ds:schemaRefs>
-</ds:datastoreItem>
-</file>
-
-<file path=customXml/itemProps2.xml><?xml version="1.0" encoding="utf-8"?>
 <ds:datastoreItem xmlns:ds="http://schemas.openxmlformats.org/officeDocument/2006/customXml" ds:itemID="{DD5F6604-606E-485E-BD1F-3C8D125DA1D8}">
   <ds:schemaRefs>
     <ds:schemaRef ds:uri="http://schemas.openxmlformats.org/officeDocument/2006/bibliography"/>
@@ -16355,7 +17135,7 @@
 </ds:datastoreItem>
 </file>
 
-<file path=customXml/itemProps3.xml><?xml version="1.0" encoding="utf-8"?>
+<file path=customXml/itemProps2.xml><?xml version="1.0" encoding="utf-8"?>
 <ds:datastoreItem xmlns:ds="http://schemas.openxmlformats.org/officeDocument/2006/customXml" ds:itemID="{900CB81B-0B64-4399-A76B-3F8B9B25239C}">
   <ds:schemaRefs>
     <ds:schemaRef ds:uri="http://www.qorusdocs.com/office/settingProperties"/>
@@ -16363,16 +17143,51 @@
 </ds:datastoreItem>
 </file>
 
+<file path=customXml/itemProps3.xml><?xml version="1.0" encoding="utf-8"?>
+<ds:datastoreItem xmlns:ds="http://schemas.openxmlformats.org/officeDocument/2006/customXml" ds:itemID="{779CEB37-0F8D-4668-8EC3-8EEF9309B7CB}">
+  <ds:schemaRefs>
+    <ds:schemaRef ds:uri="http://schemas.microsoft.com/office/2006/metadata/properties"/>
+    <ds:schemaRef ds:uri="http://schemas.microsoft.com/office/infopath/2007/PartnerControls"/>
+    <ds:schemaRef ds:uri="bac1e0b3-eaaf-4d82-995f-4fe6b69d5951"/>
+    <ds:schemaRef ds:uri="d29f01e0-b76f-49f6-8733-4393bd0ea6f3"/>
+  </ds:schemaRefs>
+</ds:datastoreItem>
+</file>
+
 <file path=customXml/itemProps4.xml><?xml version="1.0" encoding="utf-8"?>
-<ds:datastoreItem xmlns:ds="http://schemas.openxmlformats.org/officeDocument/2006/customXml" ds:itemID="{82635EB0-6033-4CD8-AF95-FCEB51AECC49}">
+<ds:datastoreItem xmlns:ds="http://schemas.openxmlformats.org/officeDocument/2006/customXml" ds:itemID="{0626AB57-7CF3-4BC4-96D9-6BB1A06D8EC9}">
+  <ds:schemaRefs>
+    <ds:schemaRef ds:uri="http://www.qorusdocs.com/office/smartProperties"/>
+    <ds:schemaRef ds:uri=""/>
+  </ds:schemaRefs>
+</ds:datastoreItem>
+</file>
+
+<file path=customXml/itemProps5.xml><?xml version="1.0" encoding="utf-8"?>
+<ds:datastoreItem xmlns:ds="http://schemas.openxmlformats.org/officeDocument/2006/customXml" ds:itemID="{58980363-4534-4450-95EC-B037E29BB33A}">
+  <ds:schemaRefs>
+    <ds:schemaRef ds:uri="http://schemas.microsoft.com/sharepoint/v3/contenttype/forms"/>
+  </ds:schemaRefs>
+</ds:datastoreItem>
+</file>
+
+<file path=customXml/itemProps6.xml><?xml version="1.0" encoding="utf-8"?>
+<ds:datastoreItem xmlns:ds="http://schemas.openxmlformats.org/officeDocument/2006/customXml" ds:itemID="{08AA5BBF-C58B-4365-BDB9-C4C6896348D7}">
+  <ds:schemaRefs>
+    <ds:schemaRef ds:uri="TRC_CustomDocumentProperties"/>
+  </ds:schemaRefs>
+</ds:datastoreItem>
+</file>
+
+<file path=customXml/itemProps7.xml><?xml version="1.0" encoding="utf-8"?>
+<ds:datastoreItem xmlns:ds="http://schemas.openxmlformats.org/officeDocument/2006/customXml" ds:itemID="{5668F7FB-D73B-4CA7-8E7A-20B83BF5BAB6}">
   <ds:schemaRefs>
     <ds:schemaRef ds:uri="http://schemas.microsoft.com/office/2006/metadata/contentType"/>
     <ds:schemaRef ds:uri="http://schemas.microsoft.com/office/2006/metadata/properties/metaAttributes"/>
     <ds:schemaRef ds:uri="http://www.w3.org/2001/XMLSchema"/>
     <ds:schemaRef ds:uri="http://schemas.microsoft.com/office/2006/metadata/properties"/>
-    <ds:schemaRef ds:uri="7764588b-be80-4b22-977b-586652cb38b8"/>
-    <ds:schemaRef ds:uri="0e30f368-2351-48f1-985f-2771b1e0e99e"/>
-    <ds:schemaRef ds:uri="e82a6618-5246-433f-9a3a-82cc13a7c76c"/>
+    <ds:schemaRef ds:uri="d29f01e0-b76f-49f6-8733-4393bd0ea6f3"/>
+    <ds:schemaRef ds:uri="bac1e0b3-eaaf-4d82-995f-4fe6b69d5951"/>
     <ds:schemaRef ds:uri="http://schemas.microsoft.com/office/2006/documentManagement/types"/>
     <ds:schemaRef ds:uri="http://schemas.microsoft.com/office/infopath/2007/PartnerControls"/>
     <ds:schemaRef ds:uri="http://schemas.openxmlformats.org/package/2006/metadata/core-properties"/>
@@ -16383,39 +17198,6 @@
 </ds:datastoreItem>
 </file>
 
-<file path=customXml/itemProps5.xml><?xml version="1.0" encoding="utf-8"?>
-<ds:datastoreItem xmlns:ds="http://schemas.openxmlformats.org/officeDocument/2006/customXml" ds:itemID="{08AA5BBF-C58B-4365-BDB9-C4C6896348D7}">
-  <ds:schemaRefs>
-    <ds:schemaRef ds:uri="TRC_CustomDocumentProperties"/>
-  </ds:schemaRefs>
-</ds:datastoreItem>
-</file>
-
-<file path=customXml/itemProps6.xml><?xml version="1.0" encoding="utf-8"?>
-<ds:datastoreItem xmlns:ds="http://schemas.openxmlformats.org/officeDocument/2006/customXml" ds:itemID="{0626AB57-7CF3-4BC4-96D9-6BB1A06D8EC9}">
-  <ds:schemaRefs>
-    <ds:schemaRef ds:uri="http://www.qorusdocs.com/office/smartProperties"/>
-    <ds:schemaRef ds:uri=""/>
-  </ds:schemaRefs>
-</ds:datastoreItem>
-</file>
-
-<file path=customXml/itemProps7.xml><?xml version="1.0" encoding="utf-8"?>
-<ds:datastoreItem xmlns:ds="http://schemas.openxmlformats.org/officeDocument/2006/customXml" ds:itemID="{58980363-4534-4450-95EC-B037E29BB33A}">
-  <ds:schemaRefs>
-    <ds:schemaRef ds:uri="http://schemas.microsoft.com/sharepoint/v3/contenttype/forms"/>
-  </ds:schemaRefs>
-</ds:datastoreItem>
-</file>
-
-<file path=customXml/itemProps8.xml><?xml version="1.0" encoding="utf-8"?>
-<ds:datastoreItem xmlns:ds="http://schemas.openxmlformats.org/officeDocument/2006/customXml" ds:itemID="{FE375AA9-6E10-4681-8411-1ED027CFF688}">
-  <ds:schemaRefs>
-    <ds:schemaRef ds:uri="http://schemas.microsoft.com/sharepoint/events"/>
-  </ds:schemaRefs>
-</ds:datastoreItem>
-</file>
-
 <file path=docMetadata/LabelInfo.xml><?xml version="1.0" encoding="utf-8"?>
 <clbl:labelList xmlns:clbl="http://schemas.microsoft.com/office/2020/mipLabelMetadata">
   <clbl:label id="{543eaf7b-7e0d-4076-a34d-1fc8cc20e5bb}" enabled="0" method="" siteId="{543eaf7b-7e0d-4076-a34d-1fc8cc20e5bb}" removed="1"/>

</xml_diff>